<commit_message>
Add persona-based flow (developer build spec) to index.html and Word product specification
</commit_message>
<xml_diff>
--- a/assets/intelligrator-mft-product-specification.docx
+++ b/assets/intelligrator-mft-product-specification.docx
@@ -1015,7 +1015,3895 @@
         <w:rPr>
           <w:color w:val="1F4E79"/>
         </w:rPr>
-        <w:t xml:space="preserve">4. Feature Catalogue (MoSCoW)</w:t>
+        <w:t xml:space="preserve">4. Persona-Based Flow — Build Spec for the Development Team</w:t>
+      </w:r>
+    </w:p>
+    <w:p>
+      <w:pPr>
+        <w:spacing w:after="100"/>
+      </w:pPr>
+      <w:r>
+        <w:t xml:space="preserve">This section hands the development team a screen-by-screen, action-by-action build spec: for each persona, every screen, the UI elements on it, the user action taken, the exact integration call it triggers, and the resulting state transition. Build the four persona flows as separate route groups sharing one design system.</w:t>
+      </w:r>
+    </w:p>
+    <w:p>
+      <w:pPr>
+        <w:pStyle w:val="Heading2"/>
+        <w:spacing w:after="100" w:before="220"/>
+      </w:pPr>
+      <w:r>
+        <w:rPr>
+          <w:color w:val="0F6674"/>
+        </w:rPr>
+        <w:t xml:space="preserve">Persona 1 — Requester</w:t>
+      </w:r>
+    </w:p>
+    <w:p>
+      <w:pPr>
+        <w:spacing w:after="100"/>
+      </w:pPr>
+      <w:r>
+        <w:rPr>
+          <w:i/>
+          <w:iCs/>
+        </w:rPr>
+        <w:t xml:space="preserve">Flow: SSO Login → My Requests dashboard → Wizard Steps 1–6 → Tracker → Run dashboard.</w:t>
+      </w:r>
+    </w:p>
+    <w:tbl>
+      <w:tblPr>
+        <w:tblW w:type="dxa" w:w="9460"/>
+        <w:tblBorders>
+          <w:top w:val="single" w:color="auto" w:sz="4"/>
+          <w:left w:val="single" w:color="auto" w:sz="4"/>
+          <w:bottom w:val="single" w:color="auto" w:sz="4"/>
+          <w:right w:val="single" w:color="auto" w:sz="4"/>
+          <w:insideH w:val="single" w:color="auto" w:sz="4"/>
+          <w:insideV w:val="single" w:color="auto" w:sz="4"/>
+        </w:tblBorders>
+      </w:tblPr>
+      <w:tblGrid>
+        <w:gridCol w:w="400"/>
+        <w:gridCol w:w="2000"/>
+        <w:gridCol w:w="2560"/>
+        <w:gridCol w:w="1600"/>
+        <w:gridCol w:w="1500"/>
+        <w:gridCol w:w="1400"/>
+      </w:tblGrid>
+      <w:tr>
+        <w:trPr>
+          <w:tblHeader/>
+        </w:trPr>
+        <w:tc>
+          <w:tcPr>
+            <w:tcW w:type="dxa" w:w="400"/>
+            <w:shd w:fill="DCE6F1" w:val="clear"/>
+            <w:tcMar>
+              <w:top w:type="dxa" w:w="60"/>
+              <w:left w:type="dxa" w:w="100"/>
+              <w:bottom w:type="dxa" w:w="60"/>
+              <w:right w:type="dxa" w:w="100"/>
+            </w:tcMar>
+          </w:tcPr>
+          <w:p>
+            <w:r>
+              <w:rPr>
+                <w:b/>
+                <w:bCs/>
+                <w:color w:val="1F4E79"/>
+                <w:sz w:val="19"/>
+                <w:szCs w:val="19"/>
+              </w:rPr>
+              <w:t xml:space="preserve">#</w:t>
+            </w:r>
+          </w:p>
+        </w:tc>
+        <w:tc>
+          <w:tcPr>
+            <w:tcW w:type="dxa" w:w="2000"/>
+            <w:shd w:fill="DCE6F1" w:val="clear"/>
+            <w:tcMar>
+              <w:top w:type="dxa" w:w="60"/>
+              <w:left w:type="dxa" w:w="100"/>
+              <w:bottom w:type="dxa" w:w="60"/>
+              <w:right w:type="dxa" w:w="100"/>
+            </w:tcMar>
+          </w:tcPr>
+          <w:p>
+            <w:r>
+              <w:rPr>
+                <w:b/>
+                <w:bCs/>
+                <w:color w:val="1F4E79"/>
+                <w:sz w:val="19"/>
+                <w:szCs w:val="19"/>
+              </w:rPr>
+              <w:t xml:space="preserve">Screen</w:t>
+            </w:r>
+          </w:p>
+        </w:tc>
+        <w:tc>
+          <w:tcPr>
+            <w:tcW w:type="dxa" w:w="2560"/>
+            <w:shd w:fill="DCE6F1" w:val="clear"/>
+            <w:tcMar>
+              <w:top w:type="dxa" w:w="60"/>
+              <w:left w:type="dxa" w:w="100"/>
+              <w:bottom w:type="dxa" w:w="60"/>
+              <w:right w:type="dxa" w:w="100"/>
+            </w:tcMar>
+          </w:tcPr>
+          <w:p>
+            <w:r>
+              <w:rPr>
+                <w:b/>
+                <w:bCs/>
+                <w:color w:val="1F4E79"/>
+                <w:sz w:val="19"/>
+                <w:szCs w:val="19"/>
+              </w:rPr>
+              <w:t xml:space="preserve">Key UI elements</w:t>
+            </w:r>
+          </w:p>
+        </w:tc>
+        <w:tc>
+          <w:tcPr>
+            <w:tcW w:type="dxa" w:w="1600"/>
+            <w:shd w:fill="DCE6F1" w:val="clear"/>
+            <w:tcMar>
+              <w:top w:type="dxa" w:w="60"/>
+              <w:left w:type="dxa" w:w="100"/>
+              <w:bottom w:type="dxa" w:w="60"/>
+              <w:right w:type="dxa" w:w="100"/>
+            </w:tcMar>
+          </w:tcPr>
+          <w:p>
+            <w:r>
+              <w:rPr>
+                <w:b/>
+                <w:bCs/>
+                <w:color w:val="1F4E79"/>
+                <w:sz w:val="19"/>
+                <w:szCs w:val="19"/>
+              </w:rPr>
+              <w:t xml:space="preserve">User action</w:t>
+            </w:r>
+          </w:p>
+        </w:tc>
+        <w:tc>
+          <w:tcPr>
+            <w:tcW w:type="dxa" w:w="1500"/>
+            <w:shd w:fill="DCE6F1" w:val="clear"/>
+            <w:tcMar>
+              <w:top w:type="dxa" w:w="60"/>
+              <w:left w:type="dxa" w:w="100"/>
+              <w:bottom w:type="dxa" w:w="60"/>
+              <w:right w:type="dxa" w:w="100"/>
+            </w:tcMar>
+          </w:tcPr>
+          <w:p>
+            <w:r>
+              <w:rPr>
+                <w:b/>
+                <w:bCs/>
+                <w:color w:val="1F4E79"/>
+                <w:sz w:val="19"/>
+                <w:szCs w:val="19"/>
+              </w:rPr>
+              <w:t xml:space="preserve">Integration call</w:t>
+            </w:r>
+          </w:p>
+        </w:tc>
+        <w:tc>
+          <w:tcPr>
+            <w:tcW w:type="dxa" w:w="1400"/>
+            <w:shd w:fill="DCE6F1" w:val="clear"/>
+            <w:tcMar>
+              <w:top w:type="dxa" w:w="60"/>
+              <w:left w:type="dxa" w:w="100"/>
+              <w:bottom w:type="dxa" w:w="60"/>
+              <w:right w:type="dxa" w:w="100"/>
+            </w:tcMar>
+          </w:tcPr>
+          <w:p>
+            <w:r>
+              <w:rPr>
+                <w:b/>
+                <w:bCs/>
+                <w:color w:val="1F4E79"/>
+                <w:sz w:val="19"/>
+                <w:szCs w:val="19"/>
+              </w:rPr>
+              <w:t xml:space="preserve">Result / next state</w:t>
+            </w:r>
+          </w:p>
+        </w:tc>
+      </w:tr>
+      <w:tr>
+        <w:tc>
+          <w:tcPr>
+            <w:tcW w:type="dxa" w:w="400"/>
+            <w:tcMar>
+              <w:top w:type="dxa" w:w="60"/>
+              <w:left w:type="dxa" w:w="100"/>
+              <w:bottom w:type="dxa" w:w="60"/>
+              <w:right w:type="dxa" w:w="100"/>
+            </w:tcMar>
+          </w:tcPr>
+          <w:p>
+            <w:r>
+              <w:rPr>
+                <w:b w:val="false"/>
+                <w:bCs w:val="false"/>
+                <w:color w:val="000000"/>
+                <w:sz w:val="19"/>
+                <w:szCs w:val="19"/>
+              </w:rPr>
+              <w:t xml:space="preserve">1</w:t>
+            </w:r>
+          </w:p>
+        </w:tc>
+        <w:tc>
+          <w:tcPr>
+            <w:tcW w:type="dxa" w:w="2000"/>
+            <w:tcMar>
+              <w:top w:type="dxa" w:w="60"/>
+              <w:left w:type="dxa" w:w="100"/>
+              <w:bottom w:type="dxa" w:w="60"/>
+              <w:right w:type="dxa" w:w="100"/>
+            </w:tcMar>
+          </w:tcPr>
+          <w:p>
+            <w:r>
+              <w:rPr>
+                <w:b w:val="false"/>
+                <w:bCs w:val="false"/>
+                <w:color w:val="000000"/>
+                <w:sz w:val="19"/>
+                <w:szCs w:val="19"/>
+              </w:rPr>
+              <w:t xml:space="preserve">SSO Login</w:t>
+            </w:r>
+          </w:p>
+        </w:tc>
+        <w:tc>
+          <w:tcPr>
+            <w:tcW w:type="dxa" w:w="2560"/>
+            <w:tcMar>
+              <w:top w:type="dxa" w:w="60"/>
+              <w:left w:type="dxa" w:w="100"/>
+              <w:bottom w:type="dxa" w:w="60"/>
+              <w:right w:type="dxa" w:w="100"/>
+            </w:tcMar>
+          </w:tcPr>
+          <w:p>
+            <w:r>
+              <w:rPr>
+                <w:b w:val="false"/>
+                <w:bCs w:val="false"/>
+                <w:color w:val="000000"/>
+                <w:sz w:val="19"/>
+                <w:szCs w:val="19"/>
+              </w:rPr>
+              <w:t xml:space="preserve">Corporate SSO button</w:t>
+            </w:r>
+          </w:p>
+        </w:tc>
+        <w:tc>
+          <w:tcPr>
+            <w:tcW w:type="dxa" w:w="1600"/>
+            <w:tcMar>
+              <w:top w:type="dxa" w:w="60"/>
+              <w:left w:type="dxa" w:w="100"/>
+              <w:bottom w:type="dxa" w:w="60"/>
+              <w:right w:type="dxa" w:w="100"/>
+            </w:tcMar>
+          </w:tcPr>
+          <w:p>
+            <w:r>
+              <w:rPr>
+                <w:b w:val="false"/>
+                <w:bCs w:val="false"/>
+                <w:color w:val="000000"/>
+                <w:sz w:val="19"/>
+                <w:szCs w:val="19"/>
+              </w:rPr>
+              <w:t xml:space="preserve">Authenticate</w:t>
+            </w:r>
+          </w:p>
+        </w:tc>
+        <w:tc>
+          <w:tcPr>
+            <w:tcW w:type="dxa" w:w="1500"/>
+            <w:tcMar>
+              <w:top w:type="dxa" w:w="60"/>
+              <w:left w:type="dxa" w:w="100"/>
+              <w:bottom w:type="dxa" w:w="60"/>
+              <w:right w:type="dxa" w:w="100"/>
+            </w:tcMar>
+          </w:tcPr>
+          <w:p>
+            <w:r>
+              <w:rPr>
+                <w:b w:val="false"/>
+                <w:bCs w:val="false"/>
+                <w:color w:val="000000"/>
+                <w:sz w:val="19"/>
+                <w:szCs w:val="19"/>
+              </w:rPr>
+              <w:t xml:space="preserve">OIDC/SAML</w:t>
+            </w:r>
+          </w:p>
+        </w:tc>
+        <w:tc>
+          <w:tcPr>
+            <w:tcW w:type="dxa" w:w="1400"/>
+            <w:tcMar>
+              <w:top w:type="dxa" w:w="60"/>
+              <w:left w:type="dxa" w:w="100"/>
+              <w:bottom w:type="dxa" w:w="60"/>
+              <w:right w:type="dxa" w:w="100"/>
+            </w:tcMar>
+          </w:tcPr>
+          <w:p>
+            <w:r>
+              <w:rPr>
+                <w:b w:val="false"/>
+                <w:bCs w:val="false"/>
+                <w:color w:val="000000"/>
+                <w:sz w:val="19"/>
+                <w:szCs w:val="19"/>
+              </w:rPr>
+              <w:t xml:space="preserve">Session established → dashboard</w:t>
+            </w:r>
+          </w:p>
+        </w:tc>
+      </w:tr>
+      <w:tr>
+        <w:tc>
+          <w:tcPr>
+            <w:tcW w:type="dxa" w:w="400"/>
+            <w:tcMar>
+              <w:top w:type="dxa" w:w="60"/>
+              <w:left w:type="dxa" w:w="100"/>
+              <w:bottom w:type="dxa" w:w="60"/>
+              <w:right w:type="dxa" w:w="100"/>
+            </w:tcMar>
+          </w:tcPr>
+          <w:p>
+            <w:r>
+              <w:rPr>
+                <w:b w:val="false"/>
+                <w:bCs w:val="false"/>
+                <w:color w:val="000000"/>
+                <w:sz w:val="19"/>
+                <w:szCs w:val="19"/>
+              </w:rPr>
+              <w:t xml:space="preserve">2</w:t>
+            </w:r>
+          </w:p>
+        </w:tc>
+        <w:tc>
+          <w:tcPr>
+            <w:tcW w:type="dxa" w:w="2000"/>
+            <w:tcMar>
+              <w:top w:type="dxa" w:w="60"/>
+              <w:left w:type="dxa" w:w="100"/>
+              <w:bottom w:type="dxa" w:w="60"/>
+              <w:right w:type="dxa" w:w="100"/>
+            </w:tcMar>
+          </w:tcPr>
+          <w:p>
+            <w:r>
+              <w:rPr>
+                <w:b w:val="false"/>
+                <w:bCs w:val="false"/>
+                <w:color w:val="000000"/>
+                <w:sz w:val="19"/>
+                <w:szCs w:val="19"/>
+              </w:rPr>
+              <w:t xml:space="preserve">My Requests dashboard</w:t>
+            </w:r>
+          </w:p>
+        </w:tc>
+        <w:tc>
+          <w:tcPr>
+            <w:tcW w:type="dxa" w:w="2560"/>
+            <w:tcMar>
+              <w:top w:type="dxa" w:w="60"/>
+              <w:left w:type="dxa" w:w="100"/>
+              <w:bottom w:type="dxa" w:w="60"/>
+              <w:right w:type="dxa" w:w="100"/>
+            </w:tcMar>
+          </w:tcPr>
+          <w:p>
+            <w:r>
+              <w:rPr>
+                <w:b w:val="false"/>
+                <w:bCs w:val="false"/>
+                <w:color w:val="000000"/>
+                <w:sz w:val="19"/>
+                <w:szCs w:val="19"/>
+              </w:rPr>
+              <w:t xml:space="preserve">Status-badged table; filters; New Request button</w:t>
+            </w:r>
+          </w:p>
+        </w:tc>
+        <w:tc>
+          <w:tcPr>
+            <w:tcW w:type="dxa" w:w="1600"/>
+            <w:tcMar>
+              <w:top w:type="dxa" w:w="60"/>
+              <w:left w:type="dxa" w:w="100"/>
+              <w:bottom w:type="dxa" w:w="60"/>
+              <w:right w:type="dxa" w:w="100"/>
+            </w:tcMar>
+          </w:tcPr>
+          <w:p>
+            <w:r>
+              <w:rPr>
+                <w:b w:val="false"/>
+                <w:bCs w:val="false"/>
+                <w:color w:val="000000"/>
+                <w:sz w:val="19"/>
+                <w:szCs w:val="19"/>
+              </w:rPr>
+              <w:t xml:space="preserve">Click New Request or open draft</w:t>
+            </w:r>
+          </w:p>
+        </w:tc>
+        <w:tc>
+          <w:tcPr>
+            <w:tcW w:type="dxa" w:w="1500"/>
+            <w:tcMar>
+              <w:top w:type="dxa" w:w="60"/>
+              <w:left w:type="dxa" w:w="100"/>
+              <w:bottom w:type="dxa" w:w="60"/>
+              <w:right w:type="dxa" w:w="100"/>
+            </w:tcMar>
+          </w:tcPr>
+          <w:p>
+            <w:r>
+              <w:rPr>
+                <w:b w:val="false"/>
+                <w:bCs w:val="false"/>
+                <w:color w:val="000000"/>
+                <w:sz w:val="19"/>
+                <w:szCs w:val="19"/>
+              </w:rPr>
+              <w:t xml:space="preserve">GET /requests?mine=true</w:t>
+            </w:r>
+          </w:p>
+        </w:tc>
+        <w:tc>
+          <w:tcPr>
+            <w:tcW w:type="dxa" w:w="1400"/>
+            <w:tcMar>
+              <w:top w:type="dxa" w:w="60"/>
+              <w:left w:type="dxa" w:w="100"/>
+              <w:bottom w:type="dxa" w:w="60"/>
+              <w:right w:type="dxa" w:w="100"/>
+            </w:tcMar>
+          </w:tcPr>
+          <w:p>
+            <w:r>
+              <w:rPr>
+                <w:b w:val="false"/>
+                <w:bCs w:val="false"/>
+                <w:color w:val="000000"/>
+                <w:sz w:val="19"/>
+                <w:szCs w:val="19"/>
+              </w:rPr>
+              <w:t xml:space="preserve">Opens Wizard step 1, or last saved step for a draft</w:t>
+            </w:r>
+          </w:p>
+        </w:tc>
+      </w:tr>
+      <w:tr>
+        <w:tc>
+          <w:tcPr>
+            <w:tcW w:type="dxa" w:w="400"/>
+            <w:tcMar>
+              <w:top w:type="dxa" w:w="60"/>
+              <w:left w:type="dxa" w:w="100"/>
+              <w:bottom w:type="dxa" w:w="60"/>
+              <w:right w:type="dxa" w:w="100"/>
+            </w:tcMar>
+          </w:tcPr>
+          <w:p>
+            <w:r>
+              <w:rPr>
+                <w:b w:val="false"/>
+                <w:bCs w:val="false"/>
+                <w:color w:val="000000"/>
+                <w:sz w:val="19"/>
+                <w:szCs w:val="19"/>
+              </w:rPr>
+              <w:t xml:space="preserve">3</w:t>
+            </w:r>
+          </w:p>
+        </w:tc>
+        <w:tc>
+          <w:tcPr>
+            <w:tcW w:type="dxa" w:w="2000"/>
+            <w:tcMar>
+              <w:top w:type="dxa" w:w="60"/>
+              <w:left w:type="dxa" w:w="100"/>
+              <w:bottom w:type="dxa" w:w="60"/>
+              <w:right w:type="dxa" w:w="100"/>
+            </w:tcMar>
+          </w:tcPr>
+          <w:p>
+            <w:r>
+              <w:rPr>
+                <w:b w:val="false"/>
+                <w:bCs w:val="false"/>
+                <w:color w:val="000000"/>
+                <w:sz w:val="19"/>
+                <w:szCs w:val="19"/>
+              </w:rPr>
+              <w:t xml:space="preserve">Wizard 1 — Requirement details</w:t>
+            </w:r>
+          </w:p>
+        </w:tc>
+        <w:tc>
+          <w:tcPr>
+            <w:tcW w:type="dxa" w:w="2560"/>
+            <w:tcMar>
+              <w:top w:type="dxa" w:w="60"/>
+              <w:left w:type="dxa" w:w="100"/>
+              <w:bottom w:type="dxa" w:w="60"/>
+              <w:right w:type="dxa" w:w="100"/>
+            </w:tcMar>
+          </w:tcPr>
+          <w:p>
+            <w:r>
+              <w:rPr>
+                <w:b w:val="false"/>
+                <w:bCs w:val="false"/>
+                <w:color w:val="000000"/>
+                <w:sz w:val="19"/>
+                <w:szCs w:val="19"/>
+              </w:rPr>
+              <w:t xml:space="preserve">Purpose, Business Domain (governed dropdown), Business Value, Point of Contact (directory typeahead)</w:t>
+            </w:r>
+          </w:p>
+        </w:tc>
+        <w:tc>
+          <w:tcPr>
+            <w:tcW w:type="dxa" w:w="1600"/>
+            <w:tcMar>
+              <w:top w:type="dxa" w:w="60"/>
+              <w:left w:type="dxa" w:w="100"/>
+              <w:bottom w:type="dxa" w:w="60"/>
+              <w:right w:type="dxa" w:w="100"/>
+            </w:tcMar>
+          </w:tcPr>
+          <w:p>
+            <w:r>
+              <w:rPr>
+                <w:b w:val="false"/>
+                <w:bCs w:val="false"/>
+                <w:color w:val="000000"/>
+                <w:sz w:val="19"/>
+                <w:szCs w:val="19"/>
+              </w:rPr>
+              <w:t xml:space="preserve">Next</w:t>
+            </w:r>
+          </w:p>
+        </w:tc>
+        <w:tc>
+          <w:tcPr>
+            <w:tcW w:type="dxa" w:w="1500"/>
+            <w:tcMar>
+              <w:top w:type="dxa" w:w="60"/>
+              <w:left w:type="dxa" w:w="100"/>
+              <w:bottom w:type="dxa" w:w="60"/>
+              <w:right w:type="dxa" w:w="100"/>
+            </w:tcMar>
+          </w:tcPr>
+          <w:p>
+            <w:r>
+              <w:rPr>
+                <w:b w:val="false"/>
+                <w:bCs w:val="false"/>
+                <w:color w:val="000000"/>
+                <w:sz w:val="19"/>
+                <w:szCs w:val="19"/>
+              </w:rPr>
+              <w:t xml:space="preserve">POST /requests, PUT /requests/{id}</w:t>
+            </w:r>
+          </w:p>
+        </w:tc>
+        <w:tc>
+          <w:tcPr>
+            <w:tcW w:type="dxa" w:w="1400"/>
+            <w:tcMar>
+              <w:top w:type="dxa" w:w="60"/>
+              <w:left w:type="dxa" w:w="100"/>
+              <w:bottom w:type="dxa" w:w="60"/>
+              <w:right w:type="dxa" w:w="100"/>
+            </w:tcMar>
+          </w:tcPr>
+          <w:p>
+            <w:r>
+              <w:rPr>
+                <w:b w:val="false"/>
+                <w:bCs w:val="false"/>
+                <w:color w:val="000000"/>
+                <w:sz w:val="19"/>
+                <w:szCs w:val="19"/>
+              </w:rPr>
+              <w:t xml:space="preserve">State DRAFT; advance to step 2</w:t>
+            </w:r>
+          </w:p>
+        </w:tc>
+      </w:tr>
+      <w:tr>
+        <w:tc>
+          <w:tcPr>
+            <w:tcW w:type="dxa" w:w="400"/>
+            <w:tcMar>
+              <w:top w:type="dxa" w:w="60"/>
+              <w:left w:type="dxa" w:w="100"/>
+              <w:bottom w:type="dxa" w:w="60"/>
+              <w:right w:type="dxa" w:w="100"/>
+            </w:tcMar>
+          </w:tcPr>
+          <w:p>
+            <w:r>
+              <w:rPr>
+                <w:b w:val="false"/>
+                <w:bCs w:val="false"/>
+                <w:color w:val="000000"/>
+                <w:sz w:val="19"/>
+                <w:szCs w:val="19"/>
+              </w:rPr>
+              <w:t xml:space="preserve">4</w:t>
+            </w:r>
+          </w:p>
+        </w:tc>
+        <w:tc>
+          <w:tcPr>
+            <w:tcW w:type="dxa" w:w="2000"/>
+            <w:tcMar>
+              <w:top w:type="dxa" w:w="60"/>
+              <w:left w:type="dxa" w:w="100"/>
+              <w:bottom w:type="dxa" w:w="60"/>
+              <w:right w:type="dxa" w:w="100"/>
+            </w:tcMar>
+          </w:tcPr>
+          <w:p>
+            <w:r>
+              <w:rPr>
+                <w:b w:val="false"/>
+                <w:bCs w:val="false"/>
+                <w:color w:val="000000"/>
+                <w:sz w:val="19"/>
+                <w:szCs w:val="19"/>
+              </w:rPr>
+              <w:t xml:space="preserve">Wizard 2 — Source details</w:t>
+            </w:r>
+          </w:p>
+        </w:tc>
+        <w:tc>
+          <w:tcPr>
+            <w:tcW w:type="dxa" w:w="2560"/>
+            <w:tcMar>
+              <w:top w:type="dxa" w:w="60"/>
+              <w:left w:type="dxa" w:w="100"/>
+              <w:bottom w:type="dxa" w:w="60"/>
+              <w:right w:type="dxa" w:w="100"/>
+            </w:tcMar>
+          </w:tcPr>
+          <w:p>
+            <w:r>
+              <w:rPr>
+                <w:b w:val="false"/>
+                <w:bCs w:val="false"/>
+                <w:color w:val="000000"/>
+                <w:sz w:val="19"/>
+                <w:szCs w:val="19"/>
+              </w:rPr>
+              <w:t xml:space="preserve">Protocol radio, host/port, credential entry or vault reference, folder browser</w:t>
+            </w:r>
+          </w:p>
+        </w:tc>
+        <w:tc>
+          <w:tcPr>
+            <w:tcW w:type="dxa" w:w="1600"/>
+            <w:tcMar>
+              <w:top w:type="dxa" w:w="60"/>
+              <w:left w:type="dxa" w:w="100"/>
+              <w:bottom w:type="dxa" w:w="60"/>
+              <w:right w:type="dxa" w:w="100"/>
+            </w:tcMar>
+          </w:tcPr>
+          <w:p>
+            <w:r>
+              <w:rPr>
+                <w:b w:val="false"/>
+                <w:bCs w:val="false"/>
+                <w:color w:val="000000"/>
+                <w:sz w:val="19"/>
+                <w:szCs w:val="19"/>
+              </w:rPr>
+              <w:t xml:space="preserve">Test Source Connection</w:t>
+            </w:r>
+          </w:p>
+        </w:tc>
+        <w:tc>
+          <w:tcPr>
+            <w:tcW w:type="dxa" w:w="1500"/>
+            <w:tcMar>
+              <w:top w:type="dxa" w:w="60"/>
+              <w:left w:type="dxa" w:w="100"/>
+              <w:bottom w:type="dxa" w:w="60"/>
+              <w:right w:type="dxa" w:w="100"/>
+            </w:tcMar>
+          </w:tcPr>
+          <w:p>
+            <w:r>
+              <w:rPr>
+                <w:b w:val="false"/>
+                <w:bCs w:val="false"/>
+                <w:color w:val="000000"/>
+                <w:sz w:val="19"/>
+                <w:szCs w:val="19"/>
+              </w:rPr>
+              <w:t xml:space="preserve">POST /requests/{id}/test-source</w:t>
+            </w:r>
+          </w:p>
+        </w:tc>
+        <w:tc>
+          <w:tcPr>
+            <w:tcW w:type="dxa" w:w="1400"/>
+            <w:tcMar>
+              <w:top w:type="dxa" w:w="60"/>
+              <w:left w:type="dxa" w:w="100"/>
+              <w:bottom w:type="dxa" w:w="60"/>
+              <w:right w:type="dxa" w:w="100"/>
+            </w:tcMar>
+          </w:tcPr>
+          <w:p>
+            <w:r>
+              <w:rPr>
+                <w:b w:val="false"/>
+                <w:bCs w:val="false"/>
+                <w:color w:val="000000"/>
+                <w:sz w:val="19"/>
+                <w:szCs w:val="19"/>
+              </w:rPr>
+              <w:t xml:space="preserve">Pass/fail badge + timestamp stored; fail requires override to proceed</w:t>
+            </w:r>
+          </w:p>
+        </w:tc>
+      </w:tr>
+      <w:tr>
+        <w:tc>
+          <w:tcPr>
+            <w:tcW w:type="dxa" w:w="400"/>
+            <w:tcMar>
+              <w:top w:type="dxa" w:w="60"/>
+              <w:left w:type="dxa" w:w="100"/>
+              <w:bottom w:type="dxa" w:w="60"/>
+              <w:right w:type="dxa" w:w="100"/>
+            </w:tcMar>
+          </w:tcPr>
+          <w:p>
+            <w:r>
+              <w:rPr>
+                <w:b w:val="false"/>
+                <w:bCs w:val="false"/>
+                <w:color w:val="000000"/>
+                <w:sz w:val="19"/>
+                <w:szCs w:val="19"/>
+              </w:rPr>
+              <w:t xml:space="preserve">5</w:t>
+            </w:r>
+          </w:p>
+        </w:tc>
+        <w:tc>
+          <w:tcPr>
+            <w:tcW w:type="dxa" w:w="2000"/>
+            <w:tcMar>
+              <w:top w:type="dxa" w:w="60"/>
+              <w:left w:type="dxa" w:w="100"/>
+              <w:bottom w:type="dxa" w:w="60"/>
+              <w:right w:type="dxa" w:w="100"/>
+            </w:tcMar>
+          </w:tcPr>
+          <w:p>
+            <w:r>
+              <w:rPr>
+                <w:b w:val="false"/>
+                <w:bCs w:val="false"/>
+                <w:color w:val="000000"/>
+                <w:sz w:val="19"/>
+                <w:szCs w:val="19"/>
+              </w:rPr>
+              <w:t xml:space="preserve">Wizard 3 — Destination details</w:t>
+            </w:r>
+          </w:p>
+        </w:tc>
+        <w:tc>
+          <w:tcPr>
+            <w:tcW w:type="dxa" w:w="2560"/>
+            <w:tcMar>
+              <w:top w:type="dxa" w:w="60"/>
+              <w:left w:type="dxa" w:w="100"/>
+              <w:bottom w:type="dxa" w:w="60"/>
+              <w:right w:type="dxa" w:w="100"/>
+            </w:tcMar>
+          </w:tcPr>
+          <w:p>
+            <w:r>
+              <w:rPr>
+                <w:b w:val="false"/>
+                <w:bCs w:val="false"/>
+                <w:color w:val="000000"/>
+                <w:sz w:val="19"/>
+                <w:szCs w:val="19"/>
+              </w:rPr>
+              <w:t xml:space="preserve">Same as step 4 for target + write probe</w:t>
+            </w:r>
+          </w:p>
+        </w:tc>
+        <w:tc>
+          <w:tcPr>
+            <w:tcW w:type="dxa" w:w="1600"/>
+            <w:tcMar>
+              <w:top w:type="dxa" w:w="60"/>
+              <w:left w:type="dxa" w:w="100"/>
+              <w:bottom w:type="dxa" w:w="60"/>
+              <w:right w:type="dxa" w:w="100"/>
+            </w:tcMar>
+          </w:tcPr>
+          <w:p>
+            <w:r>
+              <w:rPr>
+                <w:b w:val="false"/>
+                <w:bCs w:val="false"/>
+                <w:color w:val="000000"/>
+                <w:sz w:val="19"/>
+                <w:szCs w:val="19"/>
+              </w:rPr>
+              <w:t xml:space="preserve">Test Destination Connection</w:t>
+            </w:r>
+          </w:p>
+        </w:tc>
+        <w:tc>
+          <w:tcPr>
+            <w:tcW w:type="dxa" w:w="1500"/>
+            <w:tcMar>
+              <w:top w:type="dxa" w:w="60"/>
+              <w:left w:type="dxa" w:w="100"/>
+              <w:bottom w:type="dxa" w:w="60"/>
+              <w:right w:type="dxa" w:w="100"/>
+            </w:tcMar>
+          </w:tcPr>
+          <w:p>
+            <w:r>
+              <w:rPr>
+                <w:b w:val="false"/>
+                <w:bCs w:val="false"/>
+                <w:color w:val="000000"/>
+                <w:sz w:val="19"/>
+                <w:szCs w:val="19"/>
+              </w:rPr>
+              <w:t xml:space="preserve">POST /requests/{id}/test-destination</w:t>
+            </w:r>
+          </w:p>
+        </w:tc>
+        <w:tc>
+          <w:tcPr>
+            <w:tcW w:type="dxa" w:w="1400"/>
+            <w:tcMar>
+              <w:top w:type="dxa" w:w="60"/>
+              <w:left w:type="dxa" w:w="100"/>
+              <w:bottom w:type="dxa" w:w="60"/>
+              <w:right w:type="dxa" w:w="100"/>
+            </w:tcMar>
+          </w:tcPr>
+          <w:p>
+            <w:r>
+              <w:rPr>
+                <w:b w:val="false"/>
+                <w:bCs w:val="false"/>
+                <w:color w:val="000000"/>
+                <w:sz w:val="19"/>
+                <w:szCs w:val="19"/>
+              </w:rPr>
+              <w:t xml:space="preserve">As above</w:t>
+            </w:r>
+          </w:p>
+        </w:tc>
+      </w:tr>
+      <w:tr>
+        <w:tc>
+          <w:tcPr>
+            <w:tcW w:type="dxa" w:w="400"/>
+            <w:tcMar>
+              <w:top w:type="dxa" w:w="60"/>
+              <w:left w:type="dxa" w:w="100"/>
+              <w:bottom w:type="dxa" w:w="60"/>
+              <w:right w:type="dxa" w:w="100"/>
+            </w:tcMar>
+          </w:tcPr>
+          <w:p>
+            <w:r>
+              <w:rPr>
+                <w:b w:val="false"/>
+                <w:bCs w:val="false"/>
+                <w:color w:val="000000"/>
+                <w:sz w:val="19"/>
+                <w:szCs w:val="19"/>
+              </w:rPr>
+              <w:t xml:space="preserve">6</w:t>
+            </w:r>
+          </w:p>
+        </w:tc>
+        <w:tc>
+          <w:tcPr>
+            <w:tcW w:type="dxa" w:w="2000"/>
+            <w:tcMar>
+              <w:top w:type="dxa" w:w="60"/>
+              <w:left w:type="dxa" w:w="100"/>
+              <w:bottom w:type="dxa" w:w="60"/>
+              <w:right w:type="dxa" w:w="100"/>
+            </w:tcMar>
+          </w:tcPr>
+          <w:p>
+            <w:r>
+              <w:rPr>
+                <w:b w:val="false"/>
+                <w:bCs w:val="false"/>
+                <w:color w:val="000000"/>
+                <w:sz w:val="19"/>
+                <w:szCs w:val="19"/>
+              </w:rPr>
+              <w:t xml:space="preserve">Wizard 4 — Uniqueness &amp; naming</w:t>
+            </w:r>
+          </w:p>
+        </w:tc>
+        <w:tc>
+          <w:tcPr>
+            <w:tcW w:type="dxa" w:w="2560"/>
+            <w:tcMar>
+              <w:top w:type="dxa" w:w="60"/>
+              <w:left w:type="dxa" w:w="100"/>
+              <w:bottom w:type="dxa" w:w="60"/>
+              <w:right w:type="dxa" w:w="100"/>
+            </w:tcMar>
+          </w:tcPr>
+          <w:p>
+            <w:r>
+              <w:rPr>
+                <w:b w:val="false"/>
+                <w:bCs w:val="false"/>
+                <w:color w:val="000000"/>
+                <w:sz w:val="19"/>
+                <w:szCs w:val="19"/>
+              </w:rPr>
+              <w:t xml:space="preserve">Read-only suggested name; duplicate banner</w:t>
+            </w:r>
+          </w:p>
+        </w:tc>
+        <w:tc>
+          <w:tcPr>
+            <w:tcW w:type="dxa" w:w="1600"/>
+            <w:tcMar>
+              <w:top w:type="dxa" w:w="60"/>
+              <w:left w:type="dxa" w:w="100"/>
+              <w:bottom w:type="dxa" w:w="60"/>
+              <w:right w:type="dxa" w:w="100"/>
+            </w:tcMar>
+          </w:tcPr>
+          <w:p>
+            <w:r>
+              <w:rPr>
+                <w:b w:val="false"/>
+                <w:bCs w:val="false"/>
+                <w:color w:val="000000"/>
+                <w:sz w:val="19"/>
+                <w:szCs w:val="19"/>
+              </w:rPr>
+              <w:t xml:space="preserve">Auto-runs on entry</w:t>
+            </w:r>
+          </w:p>
+        </w:tc>
+        <w:tc>
+          <w:tcPr>
+            <w:tcW w:type="dxa" w:w="1500"/>
+            <w:tcMar>
+              <w:top w:type="dxa" w:w="60"/>
+              <w:left w:type="dxa" w:w="100"/>
+              <w:bottom w:type="dxa" w:w="60"/>
+              <w:right w:type="dxa" w:w="100"/>
+            </w:tcMar>
+          </w:tcPr>
+          <w:p>
+            <w:r>
+              <w:rPr>
+                <w:b w:val="false"/>
+                <w:bCs w:val="false"/>
+                <w:color w:val="000000"/>
+                <w:sz w:val="19"/>
+                <w:szCs w:val="19"/>
+              </w:rPr>
+              <w:t xml:space="preserve">GET /requests/{id}/duplicate-check</w:t>
+            </w:r>
+          </w:p>
+        </w:tc>
+        <w:tc>
+          <w:tcPr>
+            <w:tcW w:type="dxa" w:w="1400"/>
+            <w:tcMar>
+              <w:top w:type="dxa" w:w="60"/>
+              <w:left w:type="dxa" w:w="100"/>
+              <w:bottom w:type="dxa" w:w="60"/>
+              <w:right w:type="dxa" w:w="100"/>
+            </w:tcMar>
+          </w:tcPr>
+          <w:p>
+            <w:r>
+              <w:rPr>
+                <w:b w:val="false"/>
+                <w:bCs w:val="false"/>
+                <w:color w:val="000000"/>
+                <w:sz w:val="19"/>
+                <w:szCs w:val="19"/>
+              </w:rPr>
+              <w:t xml:space="preserve">Exact match blocks Next; similar match warns</w:t>
+            </w:r>
+          </w:p>
+        </w:tc>
+      </w:tr>
+      <w:tr>
+        <w:tc>
+          <w:tcPr>
+            <w:tcW w:type="dxa" w:w="400"/>
+            <w:tcMar>
+              <w:top w:type="dxa" w:w="60"/>
+              <w:left w:type="dxa" w:w="100"/>
+              <w:bottom w:type="dxa" w:w="60"/>
+              <w:right w:type="dxa" w:w="100"/>
+            </w:tcMar>
+          </w:tcPr>
+          <w:p>
+            <w:r>
+              <w:rPr>
+                <w:b w:val="false"/>
+                <w:bCs w:val="false"/>
+                <w:color w:val="000000"/>
+                <w:sz w:val="19"/>
+                <w:szCs w:val="19"/>
+              </w:rPr>
+              <w:t xml:space="preserve">7</w:t>
+            </w:r>
+          </w:p>
+        </w:tc>
+        <w:tc>
+          <w:tcPr>
+            <w:tcW w:type="dxa" w:w="2000"/>
+            <w:tcMar>
+              <w:top w:type="dxa" w:w="60"/>
+              <w:left w:type="dxa" w:w="100"/>
+              <w:bottom w:type="dxa" w:w="60"/>
+              <w:right w:type="dxa" w:w="100"/>
+            </w:tcMar>
+          </w:tcPr>
+          <w:p>
+            <w:r>
+              <w:rPr>
+                <w:b w:val="false"/>
+                <w:bCs w:val="false"/>
+                <w:color w:val="000000"/>
+                <w:sz w:val="19"/>
+                <w:szCs w:val="19"/>
+              </w:rPr>
+              <w:t xml:space="preserve">Wizard 5 — File &amp; trigger</w:t>
+            </w:r>
+          </w:p>
+        </w:tc>
+        <w:tc>
+          <w:tcPr>
+            <w:tcW w:type="dxa" w:w="2560"/>
+            <w:tcMar>
+              <w:top w:type="dxa" w:w="60"/>
+              <w:left w:type="dxa" w:w="100"/>
+              <w:bottom w:type="dxa" w:w="60"/>
+              <w:right w:type="dxa" w:w="100"/>
+            </w:tcMar>
+          </w:tcPr>
+          <w:p>
+            <w:r>
+              <w:rPr>
+                <w:b w:val="false"/>
+                <w:bCs w:val="false"/>
+                <w:color w:val="000000"/>
+                <w:sz w:val="19"/>
+                <w:szCs w:val="19"/>
+              </w:rPr>
+              <w:t xml:space="preserve">Filename pattern, format, volume, post-action, cron builder + plain English, timezone, blackout window, notification opt-in</w:t>
+            </w:r>
+          </w:p>
+        </w:tc>
+        <w:tc>
+          <w:tcPr>
+            <w:tcW w:type="dxa" w:w="1600"/>
+            <w:tcMar>
+              <w:top w:type="dxa" w:w="60"/>
+              <w:left w:type="dxa" w:w="100"/>
+              <w:bottom w:type="dxa" w:w="60"/>
+              <w:right w:type="dxa" w:w="100"/>
+            </w:tcMar>
+          </w:tcPr>
+          <w:p>
+            <w:r>
+              <w:rPr>
+                <w:b w:val="false"/>
+                <w:bCs w:val="false"/>
+                <w:color w:val="000000"/>
+                <w:sz w:val="19"/>
+                <w:szCs w:val="19"/>
+              </w:rPr>
+              <w:t xml:space="preserve">Next</w:t>
+            </w:r>
+          </w:p>
+        </w:tc>
+        <w:tc>
+          <w:tcPr>
+            <w:tcW w:type="dxa" w:w="1500"/>
+            <w:tcMar>
+              <w:top w:type="dxa" w:w="60"/>
+              <w:left w:type="dxa" w:w="100"/>
+              <w:bottom w:type="dxa" w:w="60"/>
+              <w:right w:type="dxa" w:w="100"/>
+            </w:tcMar>
+          </w:tcPr>
+          <w:p>
+            <w:r>
+              <w:rPr>
+                <w:b w:val="false"/>
+                <w:bCs w:val="false"/>
+                <w:color w:val="000000"/>
+                <w:sz w:val="19"/>
+                <w:szCs w:val="19"/>
+              </w:rPr>
+              <w:t xml:space="preserve">Client-side validation; PUT /requests/{id}</w:t>
+            </w:r>
+          </w:p>
+        </w:tc>
+        <w:tc>
+          <w:tcPr>
+            <w:tcW w:type="dxa" w:w="1400"/>
+            <w:tcMar>
+              <w:top w:type="dxa" w:w="60"/>
+              <w:left w:type="dxa" w:w="100"/>
+              <w:bottom w:type="dxa" w:w="60"/>
+              <w:right w:type="dxa" w:w="100"/>
+            </w:tcMar>
+          </w:tcPr>
+          <w:p>
+            <w:r>
+              <w:rPr>
+                <w:b w:val="false"/>
+                <w:bCs w:val="false"/>
+                <w:color w:val="000000"/>
+                <w:sz w:val="19"/>
+                <w:szCs w:val="19"/>
+              </w:rPr>
+              <w:t xml:space="preserve">Advance to summary</w:t>
+            </w:r>
+          </w:p>
+        </w:tc>
+      </w:tr>
+      <w:tr>
+        <w:tc>
+          <w:tcPr>
+            <w:tcW w:type="dxa" w:w="400"/>
+            <w:tcMar>
+              <w:top w:type="dxa" w:w="60"/>
+              <w:left w:type="dxa" w:w="100"/>
+              <w:bottom w:type="dxa" w:w="60"/>
+              <w:right w:type="dxa" w:w="100"/>
+            </w:tcMar>
+          </w:tcPr>
+          <w:p>
+            <w:r>
+              <w:rPr>
+                <w:b w:val="false"/>
+                <w:bCs w:val="false"/>
+                <w:color w:val="000000"/>
+                <w:sz w:val="19"/>
+                <w:szCs w:val="19"/>
+              </w:rPr>
+              <w:t xml:space="preserve">8</w:t>
+            </w:r>
+          </w:p>
+        </w:tc>
+        <w:tc>
+          <w:tcPr>
+            <w:tcW w:type="dxa" w:w="2000"/>
+            <w:tcMar>
+              <w:top w:type="dxa" w:w="60"/>
+              <w:left w:type="dxa" w:w="100"/>
+              <w:bottom w:type="dxa" w:w="60"/>
+              <w:right w:type="dxa" w:w="100"/>
+            </w:tcMar>
+          </w:tcPr>
+          <w:p>
+            <w:r>
+              <w:rPr>
+                <w:b w:val="false"/>
+                <w:bCs w:val="false"/>
+                <w:color w:val="000000"/>
+                <w:sz w:val="19"/>
+                <w:szCs w:val="19"/>
+              </w:rPr>
+              <w:t xml:space="preserve">Wizard 6 — Summary &amp; submit</w:t>
+            </w:r>
+          </w:p>
+        </w:tc>
+        <w:tc>
+          <w:tcPr>
+            <w:tcW w:type="dxa" w:w="2560"/>
+            <w:tcMar>
+              <w:top w:type="dxa" w:w="60"/>
+              <w:left w:type="dxa" w:w="100"/>
+              <w:bottom w:type="dxa" w:w="60"/>
+              <w:right w:type="dxa" w:w="100"/>
+            </w:tcMar>
+          </w:tcPr>
+          <w:p>
+            <w:r>
+              <w:rPr>
+                <w:b w:val="false"/>
+                <w:bCs w:val="false"/>
+                <w:color w:val="000000"/>
+                <w:sz w:val="19"/>
+                <w:szCs w:val="19"/>
+              </w:rPr>
+              <w:t xml:space="preserve">Read-only recap with Edit links; declaration checkbox</w:t>
+            </w:r>
+          </w:p>
+        </w:tc>
+        <w:tc>
+          <w:tcPr>
+            <w:tcW w:type="dxa" w:w="1600"/>
+            <w:tcMar>
+              <w:top w:type="dxa" w:w="60"/>
+              <w:left w:type="dxa" w:w="100"/>
+              <w:bottom w:type="dxa" w:w="60"/>
+              <w:right w:type="dxa" w:w="100"/>
+            </w:tcMar>
+          </w:tcPr>
+          <w:p>
+            <w:r>
+              <w:rPr>
+                <w:b w:val="false"/>
+                <w:bCs w:val="false"/>
+                <w:color w:val="000000"/>
+                <w:sz w:val="19"/>
+                <w:szCs w:val="19"/>
+              </w:rPr>
+              <w:t xml:space="preserve">Submit</w:t>
+            </w:r>
+          </w:p>
+        </w:tc>
+        <w:tc>
+          <w:tcPr>
+            <w:tcW w:type="dxa" w:w="1500"/>
+            <w:tcMar>
+              <w:top w:type="dxa" w:w="60"/>
+              <w:left w:type="dxa" w:w="100"/>
+              <w:bottom w:type="dxa" w:w="60"/>
+              <w:right w:type="dxa" w:w="100"/>
+            </w:tcMar>
+          </w:tcPr>
+          <w:p>
+            <w:r>
+              <w:rPr>
+                <w:b w:val="false"/>
+                <w:bCs w:val="false"/>
+                <w:color w:val="000000"/>
+                <w:sz w:val="19"/>
+                <w:szCs w:val="19"/>
+              </w:rPr>
+              <w:t xml:space="preserve">POST /requests/{id}/submit</w:t>
+            </w:r>
+          </w:p>
+        </w:tc>
+        <w:tc>
+          <w:tcPr>
+            <w:tcW w:type="dxa" w:w="1400"/>
+            <w:tcMar>
+              <w:top w:type="dxa" w:w="60"/>
+              <w:left w:type="dxa" w:w="100"/>
+              <w:bottom w:type="dxa" w:w="60"/>
+              <w:right w:type="dxa" w:w="100"/>
+            </w:tcMar>
+          </w:tcPr>
+          <w:p>
+            <w:r>
+              <w:rPr>
+                <w:b w:val="false"/>
+                <w:bCs w:val="false"/>
+                <w:color w:val="000000"/>
+                <w:sz w:val="19"/>
+                <w:szCs w:val="19"/>
+              </w:rPr>
+              <w:t xml:space="preserve">State → SUBMITTED; event published; redirect to Tracker</w:t>
+            </w:r>
+          </w:p>
+        </w:tc>
+      </w:tr>
+      <w:tr>
+        <w:tc>
+          <w:tcPr>
+            <w:tcW w:type="dxa" w:w="400"/>
+            <w:tcMar>
+              <w:top w:type="dxa" w:w="60"/>
+              <w:left w:type="dxa" w:w="100"/>
+              <w:bottom w:type="dxa" w:w="60"/>
+              <w:right w:type="dxa" w:w="100"/>
+            </w:tcMar>
+          </w:tcPr>
+          <w:p>
+            <w:r>
+              <w:rPr>
+                <w:b w:val="false"/>
+                <w:bCs w:val="false"/>
+                <w:color w:val="000000"/>
+                <w:sz w:val="19"/>
+                <w:szCs w:val="19"/>
+              </w:rPr>
+              <w:t xml:space="preserve">9</w:t>
+            </w:r>
+          </w:p>
+        </w:tc>
+        <w:tc>
+          <w:tcPr>
+            <w:tcW w:type="dxa" w:w="2000"/>
+            <w:tcMar>
+              <w:top w:type="dxa" w:w="60"/>
+              <w:left w:type="dxa" w:w="100"/>
+              <w:bottom w:type="dxa" w:w="60"/>
+              <w:right w:type="dxa" w:w="100"/>
+            </w:tcMar>
+          </w:tcPr>
+          <w:p>
+            <w:r>
+              <w:rPr>
+                <w:b w:val="false"/>
+                <w:bCs w:val="false"/>
+                <w:color w:val="000000"/>
+                <w:sz w:val="19"/>
+                <w:szCs w:val="19"/>
+              </w:rPr>
+              <w:t xml:space="preserve">Tracker</w:t>
+            </w:r>
+          </w:p>
+        </w:tc>
+        <w:tc>
+          <w:tcPr>
+            <w:tcW w:type="dxa" w:w="2560"/>
+            <w:tcMar>
+              <w:top w:type="dxa" w:w="60"/>
+              <w:left w:type="dxa" w:w="100"/>
+              <w:bottom w:type="dxa" w:w="60"/>
+              <w:right w:type="dxa" w:w="100"/>
+            </w:tcMar>
+          </w:tcPr>
+          <w:p>
+            <w:r>
+              <w:rPr>
+                <w:b w:val="false"/>
+                <w:bCs w:val="false"/>
+                <w:color w:val="000000"/>
+                <w:sz w:val="19"/>
+                <w:szCs w:val="19"/>
+              </w:rPr>
+              <w:t xml:space="preserve">Vertical stepper across the state machine</w:t>
+            </w:r>
+          </w:p>
+        </w:tc>
+        <w:tc>
+          <w:tcPr>
+            <w:tcW w:type="dxa" w:w="1600"/>
+            <w:tcMar>
+              <w:top w:type="dxa" w:w="60"/>
+              <w:left w:type="dxa" w:w="100"/>
+              <w:bottom w:type="dxa" w:w="60"/>
+              <w:right w:type="dxa" w:w="100"/>
+            </w:tcMar>
+          </w:tcPr>
+          <w:p>
+            <w:r>
+              <w:rPr>
+                <w:b w:val="false"/>
+                <w:bCs w:val="false"/>
+                <w:color w:val="000000"/>
+                <w:sz w:val="19"/>
+                <w:szCs w:val="19"/>
+              </w:rPr>
+              <w:t xml:space="preserve">Passive / refresh</w:t>
+            </w:r>
+          </w:p>
+        </w:tc>
+        <w:tc>
+          <w:tcPr>
+            <w:tcW w:type="dxa" w:w="1500"/>
+            <w:tcMar>
+              <w:top w:type="dxa" w:w="60"/>
+              <w:left w:type="dxa" w:w="100"/>
+              <w:bottom w:type="dxa" w:w="60"/>
+              <w:right w:type="dxa" w:w="100"/>
+            </w:tcMar>
+          </w:tcPr>
+          <w:p>
+            <w:r>
+              <w:rPr>
+                <w:b w:val="false"/>
+                <w:bCs w:val="false"/>
+                <w:color w:val="000000"/>
+                <w:sz w:val="19"/>
+                <w:szCs w:val="19"/>
+              </w:rPr>
+              <w:t xml:space="preserve">GET /requests/{id}</w:t>
+            </w:r>
+          </w:p>
+        </w:tc>
+        <w:tc>
+          <w:tcPr>
+            <w:tcW w:type="dxa" w:w="1400"/>
+            <w:tcMar>
+              <w:top w:type="dxa" w:w="60"/>
+              <w:left w:type="dxa" w:w="100"/>
+              <w:bottom w:type="dxa" w:w="60"/>
+              <w:right w:type="dxa" w:w="100"/>
+            </w:tcMar>
+          </w:tcPr>
+          <w:p>
+            <w:r>
+              <w:rPr>
+                <w:b w:val="false"/>
+                <w:bCs w:val="false"/>
+                <w:color w:val="000000"/>
+                <w:sz w:val="19"/>
+                <w:szCs w:val="19"/>
+              </w:rPr>
+              <w:t xml:space="preserve">Updates live as admin/engine progress</w:t>
+            </w:r>
+          </w:p>
+        </w:tc>
+      </w:tr>
+      <w:tr>
+        <w:tc>
+          <w:tcPr>
+            <w:tcW w:type="dxa" w:w="400"/>
+            <w:tcMar>
+              <w:top w:type="dxa" w:w="60"/>
+              <w:left w:type="dxa" w:w="100"/>
+              <w:bottom w:type="dxa" w:w="60"/>
+              <w:right w:type="dxa" w:w="100"/>
+            </w:tcMar>
+          </w:tcPr>
+          <w:p>
+            <w:r>
+              <w:rPr>
+                <w:b w:val="false"/>
+                <w:bCs w:val="false"/>
+                <w:color w:val="000000"/>
+                <w:sz w:val="19"/>
+                <w:szCs w:val="19"/>
+              </w:rPr>
+              <w:t xml:space="preserve">10</w:t>
+            </w:r>
+          </w:p>
+        </w:tc>
+        <w:tc>
+          <w:tcPr>
+            <w:tcW w:type="dxa" w:w="2000"/>
+            <w:tcMar>
+              <w:top w:type="dxa" w:w="60"/>
+              <w:left w:type="dxa" w:w="100"/>
+              <w:bottom w:type="dxa" w:w="60"/>
+              <w:right w:type="dxa" w:w="100"/>
+            </w:tcMar>
+          </w:tcPr>
+          <w:p>
+            <w:r>
+              <w:rPr>
+                <w:b w:val="false"/>
+                <w:bCs w:val="false"/>
+                <w:color w:val="000000"/>
+                <w:sz w:val="19"/>
+                <w:szCs w:val="19"/>
+              </w:rPr>
+              <w:t xml:space="preserve">Run dashboard</w:t>
+            </w:r>
+          </w:p>
+        </w:tc>
+        <w:tc>
+          <w:tcPr>
+            <w:tcW w:type="dxa" w:w="2560"/>
+            <w:tcMar>
+              <w:top w:type="dxa" w:w="60"/>
+              <w:left w:type="dxa" w:w="100"/>
+              <w:bottom w:type="dxa" w:w="60"/>
+              <w:right w:type="dxa" w:w="100"/>
+            </w:tcMar>
+          </w:tcPr>
+          <w:p>
+            <w:r>
+              <w:rPr>
+                <w:b w:val="false"/>
+                <w:bCs w:val="false"/>
+                <w:color w:val="000000"/>
+                <w:sz w:val="19"/>
+                <w:szCs w:val="19"/>
+              </w:rPr>
+              <w:t xml:space="preserve">Per-interface run table</w:t>
+            </w:r>
+          </w:p>
+        </w:tc>
+        <w:tc>
+          <w:tcPr>
+            <w:tcW w:type="dxa" w:w="1600"/>
+            <w:tcMar>
+              <w:top w:type="dxa" w:w="60"/>
+              <w:left w:type="dxa" w:w="100"/>
+              <w:bottom w:type="dxa" w:w="60"/>
+              <w:right w:type="dxa" w:w="100"/>
+            </w:tcMar>
+          </w:tcPr>
+          <w:p>
+            <w:r>
+              <w:rPr>
+                <w:b w:val="false"/>
+                <w:bCs w:val="false"/>
+                <w:color w:val="000000"/>
+                <w:sz w:val="19"/>
+                <w:szCs w:val="19"/>
+              </w:rPr>
+              <w:t xml:space="preserve">Drill into a run</w:t>
+            </w:r>
+          </w:p>
+        </w:tc>
+        <w:tc>
+          <w:tcPr>
+            <w:tcW w:type="dxa" w:w="1500"/>
+            <w:tcMar>
+              <w:top w:type="dxa" w:w="60"/>
+              <w:left w:type="dxa" w:w="100"/>
+              <w:bottom w:type="dxa" w:w="60"/>
+              <w:right w:type="dxa" w:w="100"/>
+            </w:tcMar>
+          </w:tcPr>
+          <w:p>
+            <w:r>
+              <w:rPr>
+                <w:b w:val="false"/>
+                <w:bCs w:val="false"/>
+                <w:color w:val="000000"/>
+                <w:sz w:val="19"/>
+                <w:szCs w:val="19"/>
+              </w:rPr>
+              <w:t xml:space="preserve">GET /interfaces/{name}/runs</w:t>
+            </w:r>
+          </w:p>
+        </w:tc>
+        <w:tc>
+          <w:tcPr>
+            <w:tcW w:type="dxa" w:w="1400"/>
+            <w:tcMar>
+              <w:top w:type="dxa" w:w="60"/>
+              <w:left w:type="dxa" w:w="100"/>
+              <w:bottom w:type="dxa" w:w="60"/>
+              <w:right w:type="dxa" w:w="100"/>
+            </w:tcMar>
+          </w:tcPr>
+          <w:p>
+            <w:r>
+              <w:rPr>
+                <w:b w:val="false"/>
+                <w:bCs w:val="false"/>
+                <w:color w:val="000000"/>
+                <w:sz w:val="19"/>
+                <w:szCs w:val="19"/>
+              </w:rPr>
+              <w:t xml:space="preserve">Per-file name/size/outcome/error detail</w:t>
+            </w:r>
+          </w:p>
+        </w:tc>
+      </w:tr>
+    </w:tbl>
+    <w:p>
+      <w:pPr>
+        <w:pStyle w:val="Heading2"/>
+        <w:spacing w:after="100" w:before="220"/>
+      </w:pPr>
+      <w:r>
+        <w:rPr>
+          <w:color w:val="0F6674"/>
+        </w:rPr>
+        <w:t xml:space="preserve">Persona 2 — MFT Admin / Approver</w:t>
+      </w:r>
+    </w:p>
+    <w:p>
+      <w:pPr>
+        <w:spacing w:after="100"/>
+      </w:pPr>
+      <w:r>
+        <w:rPr>
+          <w:i/>
+          <w:iCs/>
+        </w:rPr>
+        <w:t xml:space="preserve">Flow: SSO Login → Approval queue → Review detail → Decision modal → Provisioning status.</w:t>
+      </w:r>
+    </w:p>
+    <w:tbl>
+      <w:tblPr>
+        <w:tblW w:type="dxa" w:w="9460"/>
+        <w:tblBorders>
+          <w:top w:val="single" w:color="auto" w:sz="4"/>
+          <w:left w:val="single" w:color="auto" w:sz="4"/>
+          <w:bottom w:val="single" w:color="auto" w:sz="4"/>
+          <w:right w:val="single" w:color="auto" w:sz="4"/>
+          <w:insideH w:val="single" w:color="auto" w:sz="4"/>
+          <w:insideV w:val="single" w:color="auto" w:sz="4"/>
+        </w:tblBorders>
+      </w:tblPr>
+      <w:tblGrid>
+        <w:gridCol w:w="400"/>
+        <w:gridCol w:w="2200"/>
+        <w:gridCol w:w="2560"/>
+        <w:gridCol w:w="1500"/>
+        <w:gridCol w:w="1500"/>
+        <w:gridCol w:w="1300"/>
+      </w:tblGrid>
+      <w:tr>
+        <w:trPr>
+          <w:tblHeader/>
+        </w:trPr>
+        <w:tc>
+          <w:tcPr>
+            <w:tcW w:type="dxa" w:w="400"/>
+            <w:shd w:fill="DCE6F1" w:val="clear"/>
+            <w:tcMar>
+              <w:top w:type="dxa" w:w="60"/>
+              <w:left w:type="dxa" w:w="100"/>
+              <w:bottom w:type="dxa" w:w="60"/>
+              <w:right w:type="dxa" w:w="100"/>
+            </w:tcMar>
+          </w:tcPr>
+          <w:p>
+            <w:r>
+              <w:rPr>
+                <w:b/>
+                <w:bCs/>
+                <w:color w:val="1F4E79"/>
+                <w:sz w:val="19"/>
+                <w:szCs w:val="19"/>
+              </w:rPr>
+              <w:t xml:space="preserve">#</w:t>
+            </w:r>
+          </w:p>
+        </w:tc>
+        <w:tc>
+          <w:tcPr>
+            <w:tcW w:type="dxa" w:w="2200"/>
+            <w:shd w:fill="DCE6F1" w:val="clear"/>
+            <w:tcMar>
+              <w:top w:type="dxa" w:w="60"/>
+              <w:left w:type="dxa" w:w="100"/>
+              <w:bottom w:type="dxa" w:w="60"/>
+              <w:right w:type="dxa" w:w="100"/>
+            </w:tcMar>
+          </w:tcPr>
+          <w:p>
+            <w:r>
+              <w:rPr>
+                <w:b/>
+                <w:bCs/>
+                <w:color w:val="1F4E79"/>
+                <w:sz w:val="19"/>
+                <w:szCs w:val="19"/>
+              </w:rPr>
+              <w:t xml:space="preserve">Screen</w:t>
+            </w:r>
+          </w:p>
+        </w:tc>
+        <w:tc>
+          <w:tcPr>
+            <w:tcW w:type="dxa" w:w="2560"/>
+            <w:shd w:fill="DCE6F1" w:val="clear"/>
+            <w:tcMar>
+              <w:top w:type="dxa" w:w="60"/>
+              <w:left w:type="dxa" w:w="100"/>
+              <w:bottom w:type="dxa" w:w="60"/>
+              <w:right w:type="dxa" w:w="100"/>
+            </w:tcMar>
+          </w:tcPr>
+          <w:p>
+            <w:r>
+              <w:rPr>
+                <w:b/>
+                <w:bCs/>
+                <w:color w:val="1F4E79"/>
+                <w:sz w:val="19"/>
+                <w:szCs w:val="19"/>
+              </w:rPr>
+              <w:t xml:space="preserve">Key UI elements</w:t>
+            </w:r>
+          </w:p>
+        </w:tc>
+        <w:tc>
+          <w:tcPr>
+            <w:tcW w:type="dxa" w:w="1500"/>
+            <w:shd w:fill="DCE6F1" w:val="clear"/>
+            <w:tcMar>
+              <w:top w:type="dxa" w:w="60"/>
+              <w:left w:type="dxa" w:w="100"/>
+              <w:bottom w:type="dxa" w:w="60"/>
+              <w:right w:type="dxa" w:w="100"/>
+            </w:tcMar>
+          </w:tcPr>
+          <w:p>
+            <w:r>
+              <w:rPr>
+                <w:b/>
+                <w:bCs/>
+                <w:color w:val="1F4E79"/>
+                <w:sz w:val="19"/>
+                <w:szCs w:val="19"/>
+              </w:rPr>
+              <w:t xml:space="preserve">User action</w:t>
+            </w:r>
+          </w:p>
+        </w:tc>
+        <w:tc>
+          <w:tcPr>
+            <w:tcW w:type="dxa" w:w="1500"/>
+            <w:shd w:fill="DCE6F1" w:val="clear"/>
+            <w:tcMar>
+              <w:top w:type="dxa" w:w="60"/>
+              <w:left w:type="dxa" w:w="100"/>
+              <w:bottom w:type="dxa" w:w="60"/>
+              <w:right w:type="dxa" w:w="100"/>
+            </w:tcMar>
+          </w:tcPr>
+          <w:p>
+            <w:r>
+              <w:rPr>
+                <w:b/>
+                <w:bCs/>
+                <w:color w:val="1F4E79"/>
+                <w:sz w:val="19"/>
+                <w:szCs w:val="19"/>
+              </w:rPr>
+              <w:t xml:space="preserve">Integration call</w:t>
+            </w:r>
+          </w:p>
+        </w:tc>
+        <w:tc>
+          <w:tcPr>
+            <w:tcW w:type="dxa" w:w="1300"/>
+            <w:shd w:fill="DCE6F1" w:val="clear"/>
+            <w:tcMar>
+              <w:top w:type="dxa" w:w="60"/>
+              <w:left w:type="dxa" w:w="100"/>
+              <w:bottom w:type="dxa" w:w="60"/>
+              <w:right w:type="dxa" w:w="100"/>
+            </w:tcMar>
+          </w:tcPr>
+          <w:p>
+            <w:r>
+              <w:rPr>
+                <w:b/>
+                <w:bCs/>
+                <w:color w:val="1F4E79"/>
+                <w:sz w:val="19"/>
+                <w:szCs w:val="19"/>
+              </w:rPr>
+              <w:t xml:space="preserve">Result / next state</w:t>
+            </w:r>
+          </w:p>
+        </w:tc>
+      </w:tr>
+      <w:tr>
+        <w:tc>
+          <w:tcPr>
+            <w:tcW w:type="dxa" w:w="400"/>
+            <w:tcMar>
+              <w:top w:type="dxa" w:w="60"/>
+              <w:left w:type="dxa" w:w="100"/>
+              <w:bottom w:type="dxa" w:w="60"/>
+              <w:right w:type="dxa" w:w="100"/>
+            </w:tcMar>
+          </w:tcPr>
+          <w:p>
+            <w:r>
+              <w:rPr>
+                <w:b w:val="false"/>
+                <w:bCs w:val="false"/>
+                <w:color w:val="000000"/>
+                <w:sz w:val="19"/>
+                <w:szCs w:val="19"/>
+              </w:rPr>
+              <w:t xml:space="preserve">1</w:t>
+            </w:r>
+          </w:p>
+        </w:tc>
+        <w:tc>
+          <w:tcPr>
+            <w:tcW w:type="dxa" w:w="2200"/>
+            <w:tcMar>
+              <w:top w:type="dxa" w:w="60"/>
+              <w:left w:type="dxa" w:w="100"/>
+              <w:bottom w:type="dxa" w:w="60"/>
+              <w:right w:type="dxa" w:w="100"/>
+            </w:tcMar>
+          </w:tcPr>
+          <w:p>
+            <w:r>
+              <w:rPr>
+                <w:b w:val="false"/>
+                <w:bCs w:val="false"/>
+                <w:color w:val="000000"/>
+                <w:sz w:val="19"/>
+                <w:szCs w:val="19"/>
+              </w:rPr>
+              <w:t xml:space="preserve">SSO Login (Approver role)</w:t>
+            </w:r>
+          </w:p>
+        </w:tc>
+        <w:tc>
+          <w:tcPr>
+            <w:tcW w:type="dxa" w:w="2560"/>
+            <w:tcMar>
+              <w:top w:type="dxa" w:w="60"/>
+              <w:left w:type="dxa" w:w="100"/>
+              <w:bottom w:type="dxa" w:w="60"/>
+              <w:right w:type="dxa" w:w="100"/>
+            </w:tcMar>
+          </w:tcPr>
+          <w:p>
+            <w:r>
+              <w:rPr>
+                <w:b w:val="false"/>
+                <w:bCs w:val="false"/>
+                <w:color w:val="000000"/>
+                <w:sz w:val="19"/>
+                <w:szCs w:val="19"/>
+              </w:rPr>
+              <w:t xml:space="preserve">Corporate SSO button</w:t>
+            </w:r>
+          </w:p>
+        </w:tc>
+        <w:tc>
+          <w:tcPr>
+            <w:tcW w:type="dxa" w:w="1500"/>
+            <w:tcMar>
+              <w:top w:type="dxa" w:w="60"/>
+              <w:left w:type="dxa" w:w="100"/>
+              <w:bottom w:type="dxa" w:w="60"/>
+              <w:right w:type="dxa" w:w="100"/>
+            </w:tcMar>
+          </w:tcPr>
+          <w:p>
+            <w:r>
+              <w:rPr>
+                <w:b w:val="false"/>
+                <w:bCs w:val="false"/>
+                <w:color w:val="000000"/>
+                <w:sz w:val="19"/>
+                <w:szCs w:val="19"/>
+              </w:rPr>
+              <w:t xml:space="preserve">Authenticate</w:t>
+            </w:r>
+          </w:p>
+        </w:tc>
+        <w:tc>
+          <w:tcPr>
+            <w:tcW w:type="dxa" w:w="1500"/>
+            <w:tcMar>
+              <w:top w:type="dxa" w:w="60"/>
+              <w:left w:type="dxa" w:w="100"/>
+              <w:bottom w:type="dxa" w:w="60"/>
+              <w:right w:type="dxa" w:w="100"/>
+            </w:tcMar>
+          </w:tcPr>
+          <w:p>
+            <w:r>
+              <w:rPr>
+                <w:b w:val="false"/>
+                <w:bCs w:val="false"/>
+                <w:color w:val="000000"/>
+                <w:sz w:val="19"/>
+                <w:szCs w:val="19"/>
+              </w:rPr>
+              <w:t xml:space="preserve">OIDC/SAML + role check</w:t>
+            </w:r>
+          </w:p>
+        </w:tc>
+        <w:tc>
+          <w:tcPr>
+            <w:tcW w:type="dxa" w:w="1300"/>
+            <w:tcMar>
+              <w:top w:type="dxa" w:w="60"/>
+              <w:left w:type="dxa" w:w="100"/>
+              <w:bottom w:type="dxa" w:w="60"/>
+              <w:right w:type="dxa" w:w="100"/>
+            </w:tcMar>
+          </w:tcPr>
+          <w:p>
+            <w:r>
+              <w:rPr>
+                <w:b w:val="false"/>
+                <w:bCs w:val="false"/>
+                <w:color w:val="000000"/>
+                <w:sz w:val="19"/>
+                <w:szCs w:val="19"/>
+              </w:rPr>
+              <w:t xml:space="preserve">Non-approvers denied and audited</w:t>
+            </w:r>
+          </w:p>
+        </w:tc>
+      </w:tr>
+      <w:tr>
+        <w:tc>
+          <w:tcPr>
+            <w:tcW w:type="dxa" w:w="400"/>
+            <w:tcMar>
+              <w:top w:type="dxa" w:w="60"/>
+              <w:left w:type="dxa" w:w="100"/>
+              <w:bottom w:type="dxa" w:w="60"/>
+              <w:right w:type="dxa" w:w="100"/>
+            </w:tcMar>
+          </w:tcPr>
+          <w:p>
+            <w:r>
+              <w:rPr>
+                <w:b w:val="false"/>
+                <w:bCs w:val="false"/>
+                <w:color w:val="000000"/>
+                <w:sz w:val="19"/>
+                <w:szCs w:val="19"/>
+              </w:rPr>
+              <w:t xml:space="preserve">2</w:t>
+            </w:r>
+          </w:p>
+        </w:tc>
+        <w:tc>
+          <w:tcPr>
+            <w:tcW w:type="dxa" w:w="2200"/>
+            <w:tcMar>
+              <w:top w:type="dxa" w:w="60"/>
+              <w:left w:type="dxa" w:w="100"/>
+              <w:bottom w:type="dxa" w:w="60"/>
+              <w:right w:type="dxa" w:w="100"/>
+            </w:tcMar>
+          </w:tcPr>
+          <w:p>
+            <w:r>
+              <w:rPr>
+                <w:b w:val="false"/>
+                <w:bCs w:val="false"/>
+                <w:color w:val="000000"/>
+                <w:sz w:val="19"/>
+                <w:szCs w:val="19"/>
+              </w:rPr>
+              <w:t xml:space="preserve">Approval queue</w:t>
+            </w:r>
+          </w:p>
+        </w:tc>
+        <w:tc>
+          <w:tcPr>
+            <w:tcW w:type="dxa" w:w="2560"/>
+            <w:tcMar>
+              <w:top w:type="dxa" w:w="60"/>
+              <w:left w:type="dxa" w:w="100"/>
+              <w:bottom w:type="dxa" w:w="60"/>
+              <w:right w:type="dxa" w:w="100"/>
+            </w:tcMar>
+          </w:tcPr>
+          <w:p>
+            <w:r>
+              <w:rPr>
+                <w:b w:val="false"/>
+                <w:bCs w:val="false"/>
+                <w:color w:val="000000"/>
+                <w:sz w:val="19"/>
+                <w:szCs w:val="19"/>
+              </w:rPr>
+              <w:t xml:space="preserve">Oldest-first table: ID, name, domain, requester, age, SLA flag; filters</w:t>
+            </w:r>
+          </w:p>
+        </w:tc>
+        <w:tc>
+          <w:tcPr>
+            <w:tcW w:type="dxa" w:w="1500"/>
+            <w:tcMar>
+              <w:top w:type="dxa" w:w="60"/>
+              <w:left w:type="dxa" w:w="100"/>
+              <w:bottom w:type="dxa" w:w="60"/>
+              <w:right w:type="dxa" w:w="100"/>
+            </w:tcMar>
+          </w:tcPr>
+          <w:p>
+            <w:r>
+              <w:rPr>
+                <w:b w:val="false"/>
+                <w:bCs w:val="false"/>
+                <w:color w:val="000000"/>
+                <w:sz w:val="19"/>
+                <w:szCs w:val="19"/>
+              </w:rPr>
+              <w:t xml:space="preserve">Open a row</w:t>
+            </w:r>
+          </w:p>
+        </w:tc>
+        <w:tc>
+          <w:tcPr>
+            <w:tcW w:type="dxa" w:w="1500"/>
+            <w:tcMar>
+              <w:top w:type="dxa" w:w="60"/>
+              <w:left w:type="dxa" w:w="100"/>
+              <w:bottom w:type="dxa" w:w="60"/>
+              <w:right w:type="dxa" w:w="100"/>
+            </w:tcMar>
+          </w:tcPr>
+          <w:p>
+            <w:r>
+              <w:rPr>
+                <w:b w:val="false"/>
+                <w:bCs w:val="false"/>
+                <w:color w:val="000000"/>
+                <w:sz w:val="19"/>
+                <w:szCs w:val="19"/>
+              </w:rPr>
+              <w:t xml:space="preserve">GET /approvals?state=SUBMITTED</w:t>
+            </w:r>
+          </w:p>
+        </w:tc>
+        <w:tc>
+          <w:tcPr>
+            <w:tcW w:type="dxa" w:w="1300"/>
+            <w:tcMar>
+              <w:top w:type="dxa" w:w="60"/>
+              <w:left w:type="dxa" w:w="100"/>
+              <w:bottom w:type="dxa" w:w="60"/>
+              <w:right w:type="dxa" w:w="100"/>
+            </w:tcMar>
+          </w:tcPr>
+          <w:p>
+            <w:r>
+              <w:rPr>
+                <w:b w:val="false"/>
+                <w:bCs w:val="false"/>
+                <w:color w:val="000000"/>
+                <w:sz w:val="19"/>
+                <w:szCs w:val="19"/>
+              </w:rPr>
+              <w:t xml:space="preserve">Opens Review detail</w:t>
+            </w:r>
+          </w:p>
+        </w:tc>
+      </w:tr>
+      <w:tr>
+        <w:tc>
+          <w:tcPr>
+            <w:tcW w:type="dxa" w:w="400"/>
+            <w:tcMar>
+              <w:top w:type="dxa" w:w="60"/>
+              <w:left w:type="dxa" w:w="100"/>
+              <w:bottom w:type="dxa" w:w="60"/>
+              <w:right w:type="dxa" w:w="100"/>
+            </w:tcMar>
+          </w:tcPr>
+          <w:p>
+            <w:r>
+              <w:rPr>
+                <w:b w:val="false"/>
+                <w:bCs w:val="false"/>
+                <w:color w:val="000000"/>
+                <w:sz w:val="19"/>
+                <w:szCs w:val="19"/>
+              </w:rPr>
+              <w:t xml:space="preserve">3</w:t>
+            </w:r>
+          </w:p>
+        </w:tc>
+        <w:tc>
+          <w:tcPr>
+            <w:tcW w:type="dxa" w:w="2200"/>
+            <w:tcMar>
+              <w:top w:type="dxa" w:w="60"/>
+              <w:left w:type="dxa" w:w="100"/>
+              <w:bottom w:type="dxa" w:w="60"/>
+              <w:right w:type="dxa" w:w="100"/>
+            </w:tcMar>
+          </w:tcPr>
+          <w:p>
+            <w:r>
+              <w:rPr>
+                <w:b w:val="false"/>
+                <w:bCs w:val="false"/>
+                <w:color w:val="000000"/>
+                <w:sz w:val="19"/>
+                <w:szCs w:val="19"/>
+              </w:rPr>
+              <w:t xml:space="preserve">Review detail</w:t>
+            </w:r>
+          </w:p>
+        </w:tc>
+        <w:tc>
+          <w:tcPr>
+            <w:tcW w:type="dxa" w:w="2560"/>
+            <w:tcMar>
+              <w:top w:type="dxa" w:w="60"/>
+              <w:left w:type="dxa" w:w="100"/>
+              <w:bottom w:type="dxa" w:w="60"/>
+              <w:right w:type="dxa" w:w="100"/>
+            </w:tcMar>
+          </w:tcPr>
+          <w:p>
+            <w:r>
+              <w:rPr>
+                <w:b w:val="false"/>
+                <w:bCs w:val="false"/>
+                <w:color w:val="000000"/>
+                <w:sz w:val="19"/>
+                <w:szCs w:val="19"/>
+              </w:rPr>
+              <w:t xml:space="preserve">Full wizard recap + connection-test evidence + duplicate outcome</w:t>
+            </w:r>
+          </w:p>
+        </w:tc>
+        <w:tc>
+          <w:tcPr>
+            <w:tcW w:type="dxa" w:w="1500"/>
+            <w:tcMar>
+              <w:top w:type="dxa" w:w="60"/>
+              <w:left w:type="dxa" w:w="100"/>
+              <w:bottom w:type="dxa" w:w="60"/>
+              <w:right w:type="dxa" w:w="100"/>
+            </w:tcMar>
+          </w:tcPr>
+          <w:p>
+            <w:r>
+              <w:rPr>
+                <w:b w:val="false"/>
+                <w:bCs w:val="false"/>
+                <w:color w:val="000000"/>
+                <w:sz w:val="19"/>
+                <w:szCs w:val="19"/>
+              </w:rPr>
+              <w:t xml:space="preserve">Approve / Reject / Return</w:t>
+            </w:r>
+          </w:p>
+        </w:tc>
+        <w:tc>
+          <w:tcPr>
+            <w:tcW w:type="dxa" w:w="1500"/>
+            <w:tcMar>
+              <w:top w:type="dxa" w:w="60"/>
+              <w:left w:type="dxa" w:w="100"/>
+              <w:bottom w:type="dxa" w:w="60"/>
+              <w:right w:type="dxa" w:w="100"/>
+            </w:tcMar>
+          </w:tcPr>
+          <w:p>
+            <w:r>
+              <w:rPr>
+                <w:b w:val="false"/>
+                <w:bCs w:val="false"/>
+                <w:color w:val="000000"/>
+                <w:sz w:val="19"/>
+                <w:szCs w:val="19"/>
+              </w:rPr>
+              <w:t xml:space="preserve">—</w:t>
+            </w:r>
+          </w:p>
+        </w:tc>
+        <w:tc>
+          <w:tcPr>
+            <w:tcW w:type="dxa" w:w="1300"/>
+            <w:tcMar>
+              <w:top w:type="dxa" w:w="60"/>
+              <w:left w:type="dxa" w:w="100"/>
+              <w:bottom w:type="dxa" w:w="60"/>
+              <w:right w:type="dxa" w:w="100"/>
+            </w:tcMar>
+          </w:tcPr>
+          <w:p>
+            <w:r>
+              <w:rPr>
+                <w:b w:val="false"/>
+                <w:bCs w:val="false"/>
+                <w:color w:val="000000"/>
+                <w:sz w:val="19"/>
+                <w:szCs w:val="19"/>
+              </w:rPr>
+              <w:t xml:space="preserve">Opens Decision modal (comment mandatory for Reject/Return)</w:t>
+            </w:r>
+          </w:p>
+        </w:tc>
+      </w:tr>
+      <w:tr>
+        <w:tc>
+          <w:tcPr>
+            <w:tcW w:type="dxa" w:w="400"/>
+            <w:tcMar>
+              <w:top w:type="dxa" w:w="60"/>
+              <w:left w:type="dxa" w:w="100"/>
+              <w:bottom w:type="dxa" w:w="60"/>
+              <w:right w:type="dxa" w:w="100"/>
+            </w:tcMar>
+          </w:tcPr>
+          <w:p>
+            <w:r>
+              <w:rPr>
+                <w:b w:val="false"/>
+                <w:bCs w:val="false"/>
+                <w:color w:val="000000"/>
+                <w:sz w:val="19"/>
+                <w:szCs w:val="19"/>
+              </w:rPr>
+              <w:t xml:space="preserve">4</w:t>
+            </w:r>
+          </w:p>
+        </w:tc>
+        <w:tc>
+          <w:tcPr>
+            <w:tcW w:type="dxa" w:w="2200"/>
+            <w:tcMar>
+              <w:top w:type="dxa" w:w="60"/>
+              <w:left w:type="dxa" w:w="100"/>
+              <w:bottom w:type="dxa" w:w="60"/>
+              <w:right w:type="dxa" w:w="100"/>
+            </w:tcMar>
+          </w:tcPr>
+          <w:p>
+            <w:r>
+              <w:rPr>
+                <w:b w:val="false"/>
+                <w:bCs w:val="false"/>
+                <w:color w:val="000000"/>
+                <w:sz w:val="19"/>
+                <w:szCs w:val="19"/>
+              </w:rPr>
+              <w:t xml:space="preserve">Decision modal</w:t>
+            </w:r>
+          </w:p>
+        </w:tc>
+        <w:tc>
+          <w:tcPr>
+            <w:tcW w:type="dxa" w:w="2560"/>
+            <w:tcMar>
+              <w:top w:type="dxa" w:w="60"/>
+              <w:left w:type="dxa" w:w="100"/>
+              <w:bottom w:type="dxa" w:w="60"/>
+              <w:right w:type="dxa" w:w="100"/>
+            </w:tcMar>
+          </w:tcPr>
+          <w:p>
+            <w:r>
+              <w:rPr>
+                <w:b w:val="false"/>
+                <w:bCs w:val="false"/>
+                <w:color w:val="000000"/>
+                <w:sz w:val="19"/>
+                <w:szCs w:val="19"/>
+              </w:rPr>
+              <w:t xml:space="preserve">Comment box, confirm button</w:t>
+            </w:r>
+          </w:p>
+        </w:tc>
+        <w:tc>
+          <w:tcPr>
+            <w:tcW w:type="dxa" w:w="1500"/>
+            <w:tcMar>
+              <w:top w:type="dxa" w:w="60"/>
+              <w:left w:type="dxa" w:w="100"/>
+              <w:bottom w:type="dxa" w:w="60"/>
+              <w:right w:type="dxa" w:w="100"/>
+            </w:tcMar>
+          </w:tcPr>
+          <w:p>
+            <w:r>
+              <w:rPr>
+                <w:b w:val="false"/>
+                <w:bCs w:val="false"/>
+                <w:color w:val="000000"/>
+                <w:sz w:val="19"/>
+                <w:szCs w:val="19"/>
+              </w:rPr>
+              <w:t xml:space="preserve">Confirm decision</w:t>
+            </w:r>
+          </w:p>
+        </w:tc>
+        <w:tc>
+          <w:tcPr>
+            <w:tcW w:type="dxa" w:w="1500"/>
+            <w:tcMar>
+              <w:top w:type="dxa" w:w="60"/>
+              <w:left w:type="dxa" w:w="100"/>
+              <w:bottom w:type="dxa" w:w="60"/>
+              <w:right w:type="dxa" w:w="100"/>
+            </w:tcMar>
+          </w:tcPr>
+          <w:p>
+            <w:r>
+              <w:rPr>
+                <w:b w:val="false"/>
+                <w:bCs w:val="false"/>
+                <w:color w:val="000000"/>
+                <w:sz w:val="19"/>
+                <w:szCs w:val="19"/>
+              </w:rPr>
+              <w:t xml:space="preserve">POST /approvals/{id}/decision</w:t>
+            </w:r>
+          </w:p>
+        </w:tc>
+        <w:tc>
+          <w:tcPr>
+            <w:tcW w:type="dxa" w:w="1300"/>
+            <w:tcMar>
+              <w:top w:type="dxa" w:w="60"/>
+              <w:left w:type="dxa" w:w="100"/>
+              <w:bottom w:type="dxa" w:w="60"/>
+              <w:right w:type="dxa" w:w="100"/>
+            </w:tcMar>
+          </w:tcPr>
+          <w:p>
+            <w:r>
+              <w:rPr>
+                <w:b w:val="false"/>
+                <w:bCs w:val="false"/>
+                <w:color w:val="000000"/>
+                <w:sz w:val="19"/>
+                <w:szCs w:val="19"/>
+              </w:rPr>
+              <w:t xml:space="preserve">State → APPROVED / REJECTED / RETURNED; requester notified</w:t>
+            </w:r>
+          </w:p>
+        </w:tc>
+      </w:tr>
+      <w:tr>
+        <w:tc>
+          <w:tcPr>
+            <w:tcW w:type="dxa" w:w="400"/>
+            <w:tcMar>
+              <w:top w:type="dxa" w:w="60"/>
+              <w:left w:type="dxa" w:w="100"/>
+              <w:bottom w:type="dxa" w:w="60"/>
+              <w:right w:type="dxa" w:w="100"/>
+            </w:tcMar>
+          </w:tcPr>
+          <w:p>
+            <w:r>
+              <w:rPr>
+                <w:b w:val="false"/>
+                <w:bCs w:val="false"/>
+                <w:color w:val="000000"/>
+                <w:sz w:val="19"/>
+                <w:szCs w:val="19"/>
+              </w:rPr>
+              <w:t xml:space="preserve">5</w:t>
+            </w:r>
+          </w:p>
+        </w:tc>
+        <w:tc>
+          <w:tcPr>
+            <w:tcW w:type="dxa" w:w="2200"/>
+            <w:tcMar>
+              <w:top w:type="dxa" w:w="60"/>
+              <w:left w:type="dxa" w:w="100"/>
+              <w:bottom w:type="dxa" w:w="60"/>
+              <w:right w:type="dxa" w:w="100"/>
+            </w:tcMar>
+          </w:tcPr>
+          <w:p>
+            <w:r>
+              <w:rPr>
+                <w:b w:val="false"/>
+                <w:bCs w:val="false"/>
+                <w:color w:val="000000"/>
+                <w:sz w:val="19"/>
+                <w:szCs w:val="19"/>
+              </w:rPr>
+              <w:t xml:space="preserve">Provisioning status</w:t>
+            </w:r>
+          </w:p>
+        </w:tc>
+        <w:tc>
+          <w:tcPr>
+            <w:tcW w:type="dxa" w:w="2560"/>
+            <w:tcMar>
+              <w:top w:type="dxa" w:w="60"/>
+              <w:left w:type="dxa" w:w="100"/>
+              <w:bottom w:type="dxa" w:w="60"/>
+              <w:right w:type="dxa" w:w="100"/>
+            </w:tcMar>
+          </w:tcPr>
+          <w:p>
+            <w:r>
+              <w:rPr>
+                <w:b w:val="false"/>
+                <w:bCs w:val="false"/>
+                <w:color w:val="000000"/>
+                <w:sz w:val="19"/>
+                <w:szCs w:val="19"/>
+              </w:rPr>
+              <w:t xml:space="preserve">Progress: Config → Secrets → Schedule → Smoke test</w:t>
+            </w:r>
+          </w:p>
+        </w:tc>
+        <w:tc>
+          <w:tcPr>
+            <w:tcW w:type="dxa" w:w="1500"/>
+            <w:tcMar>
+              <w:top w:type="dxa" w:w="60"/>
+              <w:left w:type="dxa" w:w="100"/>
+              <w:bottom w:type="dxa" w:w="60"/>
+              <w:right w:type="dxa" w:w="100"/>
+            </w:tcMar>
+          </w:tcPr>
+          <w:p>
+            <w:r>
+              <w:rPr>
+                <w:b w:val="false"/>
+                <w:bCs w:val="false"/>
+                <w:color w:val="000000"/>
+                <w:sz w:val="19"/>
+                <w:szCs w:val="19"/>
+              </w:rPr>
+              <w:t xml:space="preserve">Passive / refresh</w:t>
+            </w:r>
+          </w:p>
+        </w:tc>
+        <w:tc>
+          <w:tcPr>
+            <w:tcW w:type="dxa" w:w="1500"/>
+            <w:tcMar>
+              <w:top w:type="dxa" w:w="60"/>
+              <w:left w:type="dxa" w:w="100"/>
+              <w:bottom w:type="dxa" w:w="60"/>
+              <w:right w:type="dxa" w:w="100"/>
+            </w:tcMar>
+          </w:tcPr>
+          <w:p>
+            <w:r>
+              <w:rPr>
+                <w:b w:val="false"/>
+                <w:bCs w:val="false"/>
+                <w:color w:val="000000"/>
+                <w:sz w:val="19"/>
+                <w:szCs w:val="19"/>
+              </w:rPr>
+              <w:t xml:space="preserve">Subscribes to ProvisioningStepCompleted</w:t>
+            </w:r>
+          </w:p>
+        </w:tc>
+        <w:tc>
+          <w:tcPr>
+            <w:tcW w:type="dxa" w:w="1300"/>
+            <w:tcMar>
+              <w:top w:type="dxa" w:w="60"/>
+              <w:left w:type="dxa" w:w="100"/>
+              <w:bottom w:type="dxa" w:w="60"/>
+              <w:right w:type="dxa" w:w="100"/>
+            </w:tcMar>
+          </w:tcPr>
+          <w:p>
+            <w:r>
+              <w:rPr>
+                <w:b w:val="false"/>
+                <w:bCs w:val="false"/>
+                <w:color w:val="000000"/>
+                <w:sz w:val="19"/>
+                <w:szCs w:val="19"/>
+              </w:rPr>
+              <w:t xml:space="preserve">DEPLOYED_DEV or PROVISION_FAILED</w:t>
+            </w:r>
+          </w:p>
+        </w:tc>
+      </w:tr>
+    </w:tbl>
+    <w:p>
+      <w:pPr>
+        <w:pStyle w:val="Heading2"/>
+        <w:spacing w:after="100" w:before="220"/>
+      </w:pPr>
+      <w:r>
+        <w:rPr>
+          <w:color w:val="0F6674"/>
+        </w:rPr>
+        <w:t xml:space="preserve">Persona 3 — Platform Engineer</w:t>
+      </w:r>
+    </w:p>
+    <w:p>
+      <w:pPr>
+        <w:spacing w:after="100"/>
+      </w:pPr>
+      <w:r>
+        <w:rPr>
+          <w:i/>
+          <w:iCs/>
+        </w:rPr>
+        <w:t xml:space="preserve">Flow: SSO Login → Provisioning failures dashboard → Failure detail → Retry / engine management.</w:t>
+      </w:r>
+    </w:p>
+    <w:tbl>
+      <w:tblPr>
+        <w:tblW w:type="dxa" w:w="9460"/>
+        <w:tblBorders>
+          <w:top w:val="single" w:color="auto" w:sz="4"/>
+          <w:left w:val="single" w:color="auto" w:sz="4"/>
+          <w:bottom w:val="single" w:color="auto" w:sz="4"/>
+          <w:right w:val="single" w:color="auto" w:sz="4"/>
+          <w:insideH w:val="single" w:color="auto" w:sz="4"/>
+          <w:insideV w:val="single" w:color="auto" w:sz="4"/>
+        </w:tblBorders>
+      </w:tblPr>
+      <w:tblGrid>
+        <w:gridCol w:w="400"/>
+        <w:gridCol w:w="2400"/>
+        <w:gridCol w:w="2560"/>
+        <w:gridCol w:w="1400"/>
+        <w:gridCol w:w="1600"/>
+        <w:gridCol w:w="1100"/>
+      </w:tblGrid>
+      <w:tr>
+        <w:trPr>
+          <w:tblHeader/>
+        </w:trPr>
+        <w:tc>
+          <w:tcPr>
+            <w:tcW w:type="dxa" w:w="400"/>
+            <w:shd w:fill="DCE6F1" w:val="clear"/>
+            <w:tcMar>
+              <w:top w:type="dxa" w:w="60"/>
+              <w:left w:type="dxa" w:w="100"/>
+              <w:bottom w:type="dxa" w:w="60"/>
+              <w:right w:type="dxa" w:w="100"/>
+            </w:tcMar>
+          </w:tcPr>
+          <w:p>
+            <w:r>
+              <w:rPr>
+                <w:b/>
+                <w:bCs/>
+                <w:color w:val="1F4E79"/>
+                <w:sz w:val="19"/>
+                <w:szCs w:val="19"/>
+              </w:rPr>
+              <w:t xml:space="preserve">#</w:t>
+            </w:r>
+          </w:p>
+        </w:tc>
+        <w:tc>
+          <w:tcPr>
+            <w:tcW w:type="dxa" w:w="2400"/>
+            <w:shd w:fill="DCE6F1" w:val="clear"/>
+            <w:tcMar>
+              <w:top w:type="dxa" w:w="60"/>
+              <w:left w:type="dxa" w:w="100"/>
+              <w:bottom w:type="dxa" w:w="60"/>
+              <w:right w:type="dxa" w:w="100"/>
+            </w:tcMar>
+          </w:tcPr>
+          <w:p>
+            <w:r>
+              <w:rPr>
+                <w:b/>
+                <w:bCs/>
+                <w:color w:val="1F4E79"/>
+                <w:sz w:val="19"/>
+                <w:szCs w:val="19"/>
+              </w:rPr>
+              <w:t xml:space="preserve">Screen</w:t>
+            </w:r>
+          </w:p>
+        </w:tc>
+        <w:tc>
+          <w:tcPr>
+            <w:tcW w:type="dxa" w:w="2560"/>
+            <w:shd w:fill="DCE6F1" w:val="clear"/>
+            <w:tcMar>
+              <w:top w:type="dxa" w:w="60"/>
+              <w:left w:type="dxa" w:w="100"/>
+              <w:bottom w:type="dxa" w:w="60"/>
+              <w:right w:type="dxa" w:w="100"/>
+            </w:tcMar>
+          </w:tcPr>
+          <w:p>
+            <w:r>
+              <w:rPr>
+                <w:b/>
+                <w:bCs/>
+                <w:color w:val="1F4E79"/>
+                <w:sz w:val="19"/>
+                <w:szCs w:val="19"/>
+              </w:rPr>
+              <w:t xml:space="preserve">Key UI elements</w:t>
+            </w:r>
+          </w:p>
+        </w:tc>
+        <w:tc>
+          <w:tcPr>
+            <w:tcW w:type="dxa" w:w="1400"/>
+            <w:shd w:fill="DCE6F1" w:val="clear"/>
+            <w:tcMar>
+              <w:top w:type="dxa" w:w="60"/>
+              <w:left w:type="dxa" w:w="100"/>
+              <w:bottom w:type="dxa" w:w="60"/>
+              <w:right w:type="dxa" w:w="100"/>
+            </w:tcMar>
+          </w:tcPr>
+          <w:p>
+            <w:r>
+              <w:rPr>
+                <w:b/>
+                <w:bCs/>
+                <w:color w:val="1F4E79"/>
+                <w:sz w:val="19"/>
+                <w:szCs w:val="19"/>
+              </w:rPr>
+              <w:t xml:space="preserve">User action</w:t>
+            </w:r>
+          </w:p>
+        </w:tc>
+        <w:tc>
+          <w:tcPr>
+            <w:tcW w:type="dxa" w:w="1600"/>
+            <w:shd w:fill="DCE6F1" w:val="clear"/>
+            <w:tcMar>
+              <w:top w:type="dxa" w:w="60"/>
+              <w:left w:type="dxa" w:w="100"/>
+              <w:bottom w:type="dxa" w:w="60"/>
+              <w:right w:type="dxa" w:w="100"/>
+            </w:tcMar>
+          </w:tcPr>
+          <w:p>
+            <w:r>
+              <w:rPr>
+                <w:b/>
+                <w:bCs/>
+                <w:color w:val="1F4E79"/>
+                <w:sz w:val="19"/>
+                <w:szCs w:val="19"/>
+              </w:rPr>
+              <w:t xml:space="preserve">Integration call</w:t>
+            </w:r>
+          </w:p>
+        </w:tc>
+        <w:tc>
+          <w:tcPr>
+            <w:tcW w:type="dxa" w:w="1100"/>
+            <w:shd w:fill="DCE6F1" w:val="clear"/>
+            <w:tcMar>
+              <w:top w:type="dxa" w:w="60"/>
+              <w:left w:type="dxa" w:w="100"/>
+              <w:bottom w:type="dxa" w:w="60"/>
+              <w:right w:type="dxa" w:w="100"/>
+            </w:tcMar>
+          </w:tcPr>
+          <w:p>
+            <w:r>
+              <w:rPr>
+                <w:b/>
+                <w:bCs/>
+                <w:color w:val="1F4E79"/>
+                <w:sz w:val="19"/>
+                <w:szCs w:val="19"/>
+              </w:rPr>
+              <w:t xml:space="preserve">Result / next state</w:t>
+            </w:r>
+          </w:p>
+        </w:tc>
+      </w:tr>
+      <w:tr>
+        <w:tc>
+          <w:tcPr>
+            <w:tcW w:type="dxa" w:w="400"/>
+            <w:tcMar>
+              <w:top w:type="dxa" w:w="60"/>
+              <w:left w:type="dxa" w:w="100"/>
+              <w:bottom w:type="dxa" w:w="60"/>
+              <w:right w:type="dxa" w:w="100"/>
+            </w:tcMar>
+          </w:tcPr>
+          <w:p>
+            <w:r>
+              <w:rPr>
+                <w:b w:val="false"/>
+                <w:bCs w:val="false"/>
+                <w:color w:val="000000"/>
+                <w:sz w:val="19"/>
+                <w:szCs w:val="19"/>
+              </w:rPr>
+              <w:t xml:space="preserve">1</w:t>
+            </w:r>
+          </w:p>
+        </w:tc>
+        <w:tc>
+          <w:tcPr>
+            <w:tcW w:type="dxa" w:w="2400"/>
+            <w:tcMar>
+              <w:top w:type="dxa" w:w="60"/>
+              <w:left w:type="dxa" w:w="100"/>
+              <w:bottom w:type="dxa" w:w="60"/>
+              <w:right w:type="dxa" w:w="100"/>
+            </w:tcMar>
+          </w:tcPr>
+          <w:p>
+            <w:r>
+              <w:rPr>
+                <w:b w:val="false"/>
+                <w:bCs w:val="false"/>
+                <w:color w:val="000000"/>
+                <w:sz w:val="19"/>
+                <w:szCs w:val="19"/>
+              </w:rPr>
+              <w:t xml:space="preserve">SSO Login (Platform Admin)</w:t>
+            </w:r>
+          </w:p>
+        </w:tc>
+        <w:tc>
+          <w:tcPr>
+            <w:tcW w:type="dxa" w:w="2560"/>
+            <w:tcMar>
+              <w:top w:type="dxa" w:w="60"/>
+              <w:left w:type="dxa" w:w="100"/>
+              <w:bottom w:type="dxa" w:w="60"/>
+              <w:right w:type="dxa" w:w="100"/>
+            </w:tcMar>
+          </w:tcPr>
+          <w:p>
+            <w:r>
+              <w:rPr>
+                <w:b w:val="false"/>
+                <w:bCs w:val="false"/>
+                <w:color w:val="000000"/>
+                <w:sz w:val="19"/>
+                <w:szCs w:val="19"/>
+              </w:rPr>
+              <w:t xml:space="preserve">Corporate SSO button</w:t>
+            </w:r>
+          </w:p>
+        </w:tc>
+        <w:tc>
+          <w:tcPr>
+            <w:tcW w:type="dxa" w:w="1400"/>
+            <w:tcMar>
+              <w:top w:type="dxa" w:w="60"/>
+              <w:left w:type="dxa" w:w="100"/>
+              <w:bottom w:type="dxa" w:w="60"/>
+              <w:right w:type="dxa" w:w="100"/>
+            </w:tcMar>
+          </w:tcPr>
+          <w:p>
+            <w:r>
+              <w:rPr>
+                <w:b w:val="false"/>
+                <w:bCs w:val="false"/>
+                <w:color w:val="000000"/>
+                <w:sz w:val="19"/>
+                <w:szCs w:val="19"/>
+              </w:rPr>
+              <w:t xml:space="preserve">Authenticate</w:t>
+            </w:r>
+          </w:p>
+        </w:tc>
+        <w:tc>
+          <w:tcPr>
+            <w:tcW w:type="dxa" w:w="1600"/>
+            <w:tcMar>
+              <w:top w:type="dxa" w:w="60"/>
+              <w:left w:type="dxa" w:w="100"/>
+              <w:bottom w:type="dxa" w:w="60"/>
+              <w:right w:type="dxa" w:w="100"/>
+            </w:tcMar>
+          </w:tcPr>
+          <w:p>
+            <w:r>
+              <w:rPr>
+                <w:b w:val="false"/>
+                <w:bCs w:val="false"/>
+                <w:color w:val="000000"/>
+                <w:sz w:val="19"/>
+                <w:szCs w:val="19"/>
+              </w:rPr>
+              <w:t xml:space="preserve">OIDC/SAML + role check</w:t>
+            </w:r>
+          </w:p>
+        </w:tc>
+        <w:tc>
+          <w:tcPr>
+            <w:tcW w:type="dxa" w:w="1100"/>
+            <w:tcMar>
+              <w:top w:type="dxa" w:w="60"/>
+              <w:left w:type="dxa" w:w="100"/>
+              <w:bottom w:type="dxa" w:w="60"/>
+              <w:right w:type="dxa" w:w="100"/>
+            </w:tcMar>
+          </w:tcPr>
+          <w:p>
+            <w:r>
+              <w:rPr>
+                <w:b w:val="false"/>
+                <w:bCs w:val="false"/>
+                <w:color w:val="000000"/>
+                <w:sz w:val="19"/>
+                <w:szCs w:val="19"/>
+              </w:rPr>
+              <w:t xml:space="preserve">Access to platform screens</w:t>
+            </w:r>
+          </w:p>
+        </w:tc>
+      </w:tr>
+      <w:tr>
+        <w:tc>
+          <w:tcPr>
+            <w:tcW w:type="dxa" w:w="400"/>
+            <w:tcMar>
+              <w:top w:type="dxa" w:w="60"/>
+              <w:left w:type="dxa" w:w="100"/>
+              <w:bottom w:type="dxa" w:w="60"/>
+              <w:right w:type="dxa" w:w="100"/>
+            </w:tcMar>
+          </w:tcPr>
+          <w:p>
+            <w:r>
+              <w:rPr>
+                <w:b w:val="false"/>
+                <w:bCs w:val="false"/>
+                <w:color w:val="000000"/>
+                <w:sz w:val="19"/>
+                <w:szCs w:val="19"/>
+              </w:rPr>
+              <w:t xml:space="preserve">2</w:t>
+            </w:r>
+          </w:p>
+        </w:tc>
+        <w:tc>
+          <w:tcPr>
+            <w:tcW w:type="dxa" w:w="2400"/>
+            <w:tcMar>
+              <w:top w:type="dxa" w:w="60"/>
+              <w:left w:type="dxa" w:w="100"/>
+              <w:bottom w:type="dxa" w:w="60"/>
+              <w:right w:type="dxa" w:w="100"/>
+            </w:tcMar>
+          </w:tcPr>
+          <w:p>
+            <w:r>
+              <w:rPr>
+                <w:b w:val="false"/>
+                <w:bCs w:val="false"/>
+                <w:color w:val="000000"/>
+                <w:sz w:val="19"/>
+                <w:szCs w:val="19"/>
+              </w:rPr>
+              <w:t xml:space="preserve">Provisioning failures dashboard</w:t>
+            </w:r>
+          </w:p>
+        </w:tc>
+        <w:tc>
+          <w:tcPr>
+            <w:tcW w:type="dxa" w:w="2560"/>
+            <w:tcMar>
+              <w:top w:type="dxa" w:w="60"/>
+              <w:left w:type="dxa" w:w="100"/>
+              <w:bottom w:type="dxa" w:w="60"/>
+              <w:right w:type="dxa" w:w="100"/>
+            </w:tcMar>
+          </w:tcPr>
+          <w:p>
+            <w:r>
+              <w:rPr>
+                <w:b w:val="false"/>
+                <w:bCs w:val="false"/>
+                <w:color w:val="000000"/>
+                <w:sz w:val="19"/>
+                <w:szCs w:val="19"/>
+              </w:rPr>
+              <w:t xml:space="preserve">List: failing step, error summary, correlation ID, age</w:t>
+            </w:r>
+          </w:p>
+        </w:tc>
+        <w:tc>
+          <w:tcPr>
+            <w:tcW w:type="dxa" w:w="1400"/>
+            <w:tcMar>
+              <w:top w:type="dxa" w:w="60"/>
+              <w:left w:type="dxa" w:w="100"/>
+              <w:bottom w:type="dxa" w:w="60"/>
+              <w:right w:type="dxa" w:w="100"/>
+            </w:tcMar>
+          </w:tcPr>
+          <w:p>
+            <w:r>
+              <w:rPr>
+                <w:b w:val="false"/>
+                <w:bCs w:val="false"/>
+                <w:color w:val="000000"/>
+                <w:sz w:val="19"/>
+                <w:szCs w:val="19"/>
+              </w:rPr>
+              <w:t xml:space="preserve">Open a failure</w:t>
+            </w:r>
+          </w:p>
+        </w:tc>
+        <w:tc>
+          <w:tcPr>
+            <w:tcW w:type="dxa" w:w="1600"/>
+            <w:tcMar>
+              <w:top w:type="dxa" w:w="60"/>
+              <w:left w:type="dxa" w:w="100"/>
+              <w:bottom w:type="dxa" w:w="60"/>
+              <w:right w:type="dxa" w:w="100"/>
+            </w:tcMar>
+          </w:tcPr>
+          <w:p>
+            <w:r>
+              <w:rPr>
+                <w:b w:val="false"/>
+                <w:bCs w:val="false"/>
+                <w:color w:val="000000"/>
+                <w:sz w:val="19"/>
+                <w:szCs w:val="19"/>
+              </w:rPr>
+              <w:t xml:space="preserve">GET /requests?state=PROVISION_FAILED</w:t>
+            </w:r>
+          </w:p>
+        </w:tc>
+        <w:tc>
+          <w:tcPr>
+            <w:tcW w:type="dxa" w:w="1100"/>
+            <w:tcMar>
+              <w:top w:type="dxa" w:w="60"/>
+              <w:left w:type="dxa" w:w="100"/>
+              <w:bottom w:type="dxa" w:w="60"/>
+              <w:right w:type="dxa" w:w="100"/>
+            </w:tcMar>
+          </w:tcPr>
+          <w:p>
+            <w:r>
+              <w:rPr>
+                <w:b w:val="false"/>
+                <w:bCs w:val="false"/>
+                <w:color w:val="000000"/>
+                <w:sz w:val="19"/>
+                <w:szCs w:val="19"/>
+              </w:rPr>
+              <w:t xml:space="preserve">Opens Failure detail</w:t>
+            </w:r>
+          </w:p>
+        </w:tc>
+      </w:tr>
+      <w:tr>
+        <w:tc>
+          <w:tcPr>
+            <w:tcW w:type="dxa" w:w="400"/>
+            <w:tcMar>
+              <w:top w:type="dxa" w:w="60"/>
+              <w:left w:type="dxa" w:w="100"/>
+              <w:bottom w:type="dxa" w:w="60"/>
+              <w:right w:type="dxa" w:w="100"/>
+            </w:tcMar>
+          </w:tcPr>
+          <w:p>
+            <w:r>
+              <w:rPr>
+                <w:b w:val="false"/>
+                <w:bCs w:val="false"/>
+                <w:color w:val="000000"/>
+                <w:sz w:val="19"/>
+                <w:szCs w:val="19"/>
+              </w:rPr>
+              <w:t xml:space="preserve">3</w:t>
+            </w:r>
+          </w:p>
+        </w:tc>
+        <w:tc>
+          <w:tcPr>
+            <w:tcW w:type="dxa" w:w="2400"/>
+            <w:tcMar>
+              <w:top w:type="dxa" w:w="60"/>
+              <w:left w:type="dxa" w:w="100"/>
+              <w:bottom w:type="dxa" w:w="60"/>
+              <w:right w:type="dxa" w:w="100"/>
+            </w:tcMar>
+          </w:tcPr>
+          <w:p>
+            <w:r>
+              <w:rPr>
+                <w:b w:val="false"/>
+                <w:bCs w:val="false"/>
+                <w:color w:val="000000"/>
+                <w:sz w:val="19"/>
+                <w:szCs w:val="19"/>
+              </w:rPr>
+              <w:t xml:space="preserve">Failure detail</w:t>
+            </w:r>
+          </w:p>
+        </w:tc>
+        <w:tc>
+          <w:tcPr>
+            <w:tcW w:type="dxa" w:w="2560"/>
+            <w:tcMar>
+              <w:top w:type="dxa" w:w="60"/>
+              <w:left w:type="dxa" w:w="100"/>
+              <w:bottom w:type="dxa" w:w="60"/>
+              <w:right w:type="dxa" w:w="100"/>
+            </w:tcMar>
+          </w:tcPr>
+          <w:p>
+            <w:r>
+              <w:rPr>
+                <w:b w:val="false"/>
+                <w:bCs w:val="false"/>
+                <w:color w:val="000000"/>
+                <w:sz w:val="19"/>
+                <w:szCs w:val="19"/>
+              </w:rPr>
+              <w:t xml:space="preserve">Error payload, step log, compensation actions taken</w:t>
+            </w:r>
+          </w:p>
+        </w:tc>
+        <w:tc>
+          <w:tcPr>
+            <w:tcW w:type="dxa" w:w="1400"/>
+            <w:tcMar>
+              <w:top w:type="dxa" w:w="60"/>
+              <w:left w:type="dxa" w:w="100"/>
+              <w:bottom w:type="dxa" w:w="60"/>
+              <w:right w:type="dxa" w:w="100"/>
+            </w:tcMar>
+          </w:tcPr>
+          <w:p>
+            <w:r>
+              <w:rPr>
+                <w:b w:val="false"/>
+                <w:bCs w:val="false"/>
+                <w:color w:val="000000"/>
+                <w:sz w:val="19"/>
+                <w:szCs w:val="19"/>
+              </w:rPr>
+              <w:t xml:space="preserve">Retry from failed step</w:t>
+            </w:r>
+          </w:p>
+        </w:tc>
+        <w:tc>
+          <w:tcPr>
+            <w:tcW w:type="dxa" w:w="1600"/>
+            <w:tcMar>
+              <w:top w:type="dxa" w:w="60"/>
+              <w:left w:type="dxa" w:w="100"/>
+              <w:bottom w:type="dxa" w:w="60"/>
+              <w:right w:type="dxa" w:w="100"/>
+            </w:tcMar>
+          </w:tcPr>
+          <w:p>
+            <w:r>
+              <w:rPr>
+                <w:b w:val="false"/>
+                <w:bCs w:val="false"/>
+                <w:color w:val="000000"/>
+                <w:sz w:val="19"/>
+                <w:szCs w:val="19"/>
+              </w:rPr>
+              <w:t xml:space="preserve">POST /requests/{id}/retry-provisioning</w:t>
+            </w:r>
+          </w:p>
+        </w:tc>
+        <w:tc>
+          <w:tcPr>
+            <w:tcW w:type="dxa" w:w="1100"/>
+            <w:tcMar>
+              <w:top w:type="dxa" w:w="60"/>
+              <w:left w:type="dxa" w:w="100"/>
+              <w:bottom w:type="dxa" w:w="60"/>
+              <w:right w:type="dxa" w:w="100"/>
+            </w:tcMar>
+          </w:tcPr>
+          <w:p>
+            <w:r>
+              <w:rPr>
+                <w:b w:val="false"/>
+                <w:bCs w:val="false"/>
+                <w:color w:val="000000"/>
+                <w:sz w:val="19"/>
+                <w:szCs w:val="19"/>
+              </w:rPr>
+              <w:t xml:space="preserve">Re-enters PROVISIONING at failed step, no re-approval</w:t>
+            </w:r>
+          </w:p>
+        </w:tc>
+      </w:tr>
+      <w:tr>
+        <w:tc>
+          <w:tcPr>
+            <w:tcW w:type="dxa" w:w="400"/>
+            <w:tcMar>
+              <w:top w:type="dxa" w:w="60"/>
+              <w:left w:type="dxa" w:w="100"/>
+              <w:bottom w:type="dxa" w:w="60"/>
+              <w:right w:type="dxa" w:w="100"/>
+            </w:tcMar>
+          </w:tcPr>
+          <w:p>
+            <w:r>
+              <w:rPr>
+                <w:b w:val="false"/>
+                <w:bCs w:val="false"/>
+                <w:color w:val="000000"/>
+                <w:sz w:val="19"/>
+                <w:szCs w:val="19"/>
+              </w:rPr>
+              <w:t xml:space="preserve">4</w:t>
+            </w:r>
+          </w:p>
+        </w:tc>
+        <w:tc>
+          <w:tcPr>
+            <w:tcW w:type="dxa" w:w="2400"/>
+            <w:tcMar>
+              <w:top w:type="dxa" w:w="60"/>
+              <w:left w:type="dxa" w:w="100"/>
+              <w:bottom w:type="dxa" w:w="60"/>
+              <w:right w:type="dxa" w:w="100"/>
+            </w:tcMar>
+          </w:tcPr>
+          <w:p>
+            <w:r>
+              <w:rPr>
+                <w:b w:val="false"/>
+                <w:bCs w:val="false"/>
+                <w:color w:val="000000"/>
+                <w:sz w:val="19"/>
+                <w:szCs w:val="19"/>
+              </w:rPr>
+              <w:t xml:space="preserve">Engine version / config management</w:t>
+            </w:r>
+          </w:p>
+        </w:tc>
+        <w:tc>
+          <w:tcPr>
+            <w:tcW w:type="dxa" w:w="2560"/>
+            <w:tcMar>
+              <w:top w:type="dxa" w:w="60"/>
+              <w:left w:type="dxa" w:w="100"/>
+              <w:bottom w:type="dxa" w:w="60"/>
+              <w:right w:type="dxa" w:w="100"/>
+            </w:tcMar>
+          </w:tcPr>
+          <w:p>
+            <w:r>
+              <w:rPr>
+                <w:b w:val="false"/>
+                <w:bCs w:val="false"/>
+                <w:color w:val="000000"/>
+                <w:sz w:val="19"/>
+                <w:szCs w:val="19"/>
+              </w:rPr>
+              <w:t xml:space="preserve">Deployed engine versions; canary config toggle</w:t>
+            </w:r>
+          </w:p>
+        </w:tc>
+        <w:tc>
+          <w:tcPr>
+            <w:tcW w:type="dxa" w:w="1400"/>
+            <w:tcMar>
+              <w:top w:type="dxa" w:w="60"/>
+              <w:left w:type="dxa" w:w="100"/>
+              <w:bottom w:type="dxa" w:w="60"/>
+              <w:right w:type="dxa" w:w="100"/>
+            </w:tcMar>
+          </w:tcPr>
+          <w:p>
+            <w:r>
+              <w:rPr>
+                <w:b w:val="false"/>
+                <w:bCs w:val="false"/>
+                <w:color w:val="000000"/>
+                <w:sz w:val="19"/>
+                <w:szCs w:val="19"/>
+              </w:rPr>
+              <w:t xml:space="preserve">Promote / roll back</w:t>
+            </w:r>
+          </w:p>
+        </w:tc>
+        <w:tc>
+          <w:tcPr>
+            <w:tcW w:type="dxa" w:w="1600"/>
+            <w:tcMar>
+              <w:top w:type="dxa" w:w="60"/>
+              <w:left w:type="dxa" w:w="100"/>
+              <w:bottom w:type="dxa" w:w="60"/>
+              <w:right w:type="dxa" w:w="100"/>
+            </w:tcMar>
+          </w:tcPr>
+          <w:p>
+            <w:r>
+              <w:rPr>
+                <w:b w:val="false"/>
+                <w:bCs w:val="false"/>
+                <w:color w:val="000000"/>
+                <w:sz w:val="19"/>
+                <w:szCs w:val="19"/>
+              </w:rPr>
+              <w:t xml:space="preserve">Boomi Platform API: Component/PackagedComponent/DeployedPackage</w:t>
+            </w:r>
+          </w:p>
+        </w:tc>
+        <w:tc>
+          <w:tcPr>
+            <w:tcW w:type="dxa" w:w="1100"/>
+            <w:tcMar>
+              <w:top w:type="dxa" w:w="60"/>
+              <w:left w:type="dxa" w:w="100"/>
+              <w:bottom w:type="dxa" w:w="60"/>
+              <w:right w:type="dxa" w:w="100"/>
+            </w:tcMar>
+          </w:tcPr>
+          <w:p>
+            <w:r>
+              <w:rPr>
+                <w:b w:val="false"/>
+                <w:bCs w:val="false"/>
+                <w:color w:val="000000"/>
+                <w:sz w:val="19"/>
+                <w:szCs w:val="19"/>
+              </w:rPr>
+              <w:t xml:space="preserve">Controlled engine upgrades</w:t>
+            </w:r>
+          </w:p>
+        </w:tc>
+      </w:tr>
+    </w:tbl>
+    <w:p>
+      <w:pPr>
+        <w:pStyle w:val="Heading2"/>
+        <w:spacing w:after="100" w:before="220"/>
+      </w:pPr>
+      <w:r>
+        <w:rPr>
+          <w:color w:val="0F6674"/>
+        </w:rPr>
+        <w:t xml:space="preserve">Persona 4 — Auditor</w:t>
+      </w:r>
+    </w:p>
+    <w:p>
+      <w:pPr>
+        <w:spacing w:after="100"/>
+      </w:pPr>
+      <w:r>
+        <w:rPr>
+          <w:i/>
+          <w:iCs/>
+        </w:rPr>
+        <w:t xml:space="preserve">Flow: SSO Login → Audit trail search → Results + export.</w:t>
+      </w:r>
+    </w:p>
+    <w:tbl>
+      <w:tblPr>
+        <w:tblW w:type="dxa" w:w="10320"/>
+        <w:tblBorders>
+          <w:top w:val="single" w:color="auto" w:sz="4"/>
+          <w:left w:val="single" w:color="auto" w:sz="4"/>
+          <w:bottom w:val="single" w:color="auto" w:sz="4"/>
+          <w:right w:val="single" w:color="auto" w:sz="4"/>
+          <w:insideH w:val="single" w:color="auto" w:sz="4"/>
+          <w:insideV w:val="single" w:color="auto" w:sz="4"/>
+        </w:tblBorders>
+      </w:tblPr>
+      <w:tblGrid>
+        <w:gridCol w:w="400"/>
+        <w:gridCol w:w="2600"/>
+        <w:gridCol w:w="2960"/>
+        <w:gridCol w:w="1500"/>
+        <w:gridCol w:w="1560"/>
+        <w:gridCol w:w="1300"/>
+      </w:tblGrid>
+      <w:tr>
+        <w:trPr>
+          <w:tblHeader/>
+        </w:trPr>
+        <w:tc>
+          <w:tcPr>
+            <w:tcW w:type="dxa" w:w="400"/>
+            <w:shd w:fill="DCE6F1" w:val="clear"/>
+            <w:tcMar>
+              <w:top w:type="dxa" w:w="60"/>
+              <w:left w:type="dxa" w:w="100"/>
+              <w:bottom w:type="dxa" w:w="60"/>
+              <w:right w:type="dxa" w:w="100"/>
+            </w:tcMar>
+          </w:tcPr>
+          <w:p>
+            <w:r>
+              <w:rPr>
+                <w:b/>
+                <w:bCs/>
+                <w:color w:val="1F4E79"/>
+                <w:sz w:val="19"/>
+                <w:szCs w:val="19"/>
+              </w:rPr>
+              <w:t xml:space="preserve">#</w:t>
+            </w:r>
+          </w:p>
+        </w:tc>
+        <w:tc>
+          <w:tcPr>
+            <w:tcW w:type="dxa" w:w="2600"/>
+            <w:shd w:fill="DCE6F1" w:val="clear"/>
+            <w:tcMar>
+              <w:top w:type="dxa" w:w="60"/>
+              <w:left w:type="dxa" w:w="100"/>
+              <w:bottom w:type="dxa" w:w="60"/>
+              <w:right w:type="dxa" w:w="100"/>
+            </w:tcMar>
+          </w:tcPr>
+          <w:p>
+            <w:r>
+              <w:rPr>
+                <w:b/>
+                <w:bCs/>
+                <w:color w:val="1F4E79"/>
+                <w:sz w:val="19"/>
+                <w:szCs w:val="19"/>
+              </w:rPr>
+              <w:t xml:space="preserve">Screen</w:t>
+            </w:r>
+          </w:p>
+        </w:tc>
+        <w:tc>
+          <w:tcPr>
+            <w:tcW w:type="dxa" w:w="2960"/>
+            <w:shd w:fill="DCE6F1" w:val="clear"/>
+            <w:tcMar>
+              <w:top w:type="dxa" w:w="60"/>
+              <w:left w:type="dxa" w:w="100"/>
+              <w:bottom w:type="dxa" w:w="60"/>
+              <w:right w:type="dxa" w:w="100"/>
+            </w:tcMar>
+          </w:tcPr>
+          <w:p>
+            <w:r>
+              <w:rPr>
+                <w:b/>
+                <w:bCs/>
+                <w:color w:val="1F4E79"/>
+                <w:sz w:val="19"/>
+                <w:szCs w:val="19"/>
+              </w:rPr>
+              <w:t xml:space="preserve">Key UI elements</w:t>
+            </w:r>
+          </w:p>
+        </w:tc>
+        <w:tc>
+          <w:tcPr>
+            <w:tcW w:type="dxa" w:w="1500"/>
+            <w:shd w:fill="DCE6F1" w:val="clear"/>
+            <w:tcMar>
+              <w:top w:type="dxa" w:w="60"/>
+              <w:left w:type="dxa" w:w="100"/>
+              <w:bottom w:type="dxa" w:w="60"/>
+              <w:right w:type="dxa" w:w="100"/>
+            </w:tcMar>
+          </w:tcPr>
+          <w:p>
+            <w:r>
+              <w:rPr>
+                <w:b/>
+                <w:bCs/>
+                <w:color w:val="1F4E79"/>
+                <w:sz w:val="19"/>
+                <w:szCs w:val="19"/>
+              </w:rPr>
+              <w:t xml:space="preserve">User action</w:t>
+            </w:r>
+          </w:p>
+        </w:tc>
+        <w:tc>
+          <w:tcPr>
+            <w:tcW w:type="dxa" w:w="1560"/>
+            <w:shd w:fill="DCE6F1" w:val="clear"/>
+            <w:tcMar>
+              <w:top w:type="dxa" w:w="60"/>
+              <w:left w:type="dxa" w:w="100"/>
+              <w:bottom w:type="dxa" w:w="60"/>
+              <w:right w:type="dxa" w:w="100"/>
+            </w:tcMar>
+          </w:tcPr>
+          <w:p>
+            <w:r>
+              <w:rPr>
+                <w:b/>
+                <w:bCs/>
+                <w:color w:val="1F4E79"/>
+                <w:sz w:val="19"/>
+                <w:szCs w:val="19"/>
+              </w:rPr>
+              <w:t xml:space="preserve">Integration call</w:t>
+            </w:r>
+          </w:p>
+        </w:tc>
+        <w:tc>
+          <w:tcPr>
+            <w:tcW w:type="dxa" w:w="1300"/>
+            <w:shd w:fill="DCE6F1" w:val="clear"/>
+            <w:tcMar>
+              <w:top w:type="dxa" w:w="60"/>
+              <w:left w:type="dxa" w:w="100"/>
+              <w:bottom w:type="dxa" w:w="60"/>
+              <w:right w:type="dxa" w:w="100"/>
+            </w:tcMar>
+          </w:tcPr>
+          <w:p>
+            <w:r>
+              <w:rPr>
+                <w:b/>
+                <w:bCs/>
+                <w:color w:val="1F4E79"/>
+                <w:sz w:val="19"/>
+                <w:szCs w:val="19"/>
+              </w:rPr>
+              <w:t xml:space="preserve">Result</w:t>
+            </w:r>
+          </w:p>
+        </w:tc>
+      </w:tr>
+      <w:tr>
+        <w:tc>
+          <w:tcPr>
+            <w:tcW w:type="dxa" w:w="400"/>
+            <w:tcMar>
+              <w:top w:type="dxa" w:w="60"/>
+              <w:left w:type="dxa" w:w="100"/>
+              <w:bottom w:type="dxa" w:w="60"/>
+              <w:right w:type="dxa" w:w="100"/>
+            </w:tcMar>
+          </w:tcPr>
+          <w:p>
+            <w:r>
+              <w:rPr>
+                <w:b w:val="false"/>
+                <w:bCs w:val="false"/>
+                <w:color w:val="000000"/>
+                <w:sz w:val="19"/>
+                <w:szCs w:val="19"/>
+              </w:rPr>
+              <w:t xml:space="preserve">1</w:t>
+            </w:r>
+          </w:p>
+        </w:tc>
+        <w:tc>
+          <w:tcPr>
+            <w:tcW w:type="dxa" w:w="2600"/>
+            <w:tcMar>
+              <w:top w:type="dxa" w:w="60"/>
+              <w:left w:type="dxa" w:w="100"/>
+              <w:bottom w:type="dxa" w:w="60"/>
+              <w:right w:type="dxa" w:w="100"/>
+            </w:tcMar>
+          </w:tcPr>
+          <w:p>
+            <w:r>
+              <w:rPr>
+                <w:b w:val="false"/>
+                <w:bCs w:val="false"/>
+                <w:color w:val="000000"/>
+                <w:sz w:val="19"/>
+                <w:szCs w:val="19"/>
+              </w:rPr>
+              <w:t xml:space="preserve">SSO Login (Auditor role)</w:t>
+            </w:r>
+          </w:p>
+        </w:tc>
+        <w:tc>
+          <w:tcPr>
+            <w:tcW w:type="dxa" w:w="2960"/>
+            <w:tcMar>
+              <w:top w:type="dxa" w:w="60"/>
+              <w:left w:type="dxa" w:w="100"/>
+              <w:bottom w:type="dxa" w:w="60"/>
+              <w:right w:type="dxa" w:w="100"/>
+            </w:tcMar>
+          </w:tcPr>
+          <w:p>
+            <w:r>
+              <w:rPr>
+                <w:b w:val="false"/>
+                <w:bCs w:val="false"/>
+                <w:color w:val="000000"/>
+                <w:sz w:val="19"/>
+                <w:szCs w:val="19"/>
+              </w:rPr>
+              <w:t xml:space="preserve">Corporate SSO button</w:t>
+            </w:r>
+          </w:p>
+        </w:tc>
+        <w:tc>
+          <w:tcPr>
+            <w:tcW w:type="dxa" w:w="1500"/>
+            <w:tcMar>
+              <w:top w:type="dxa" w:w="60"/>
+              <w:left w:type="dxa" w:w="100"/>
+              <w:bottom w:type="dxa" w:w="60"/>
+              <w:right w:type="dxa" w:w="100"/>
+            </w:tcMar>
+          </w:tcPr>
+          <w:p>
+            <w:r>
+              <w:rPr>
+                <w:b w:val="false"/>
+                <w:bCs w:val="false"/>
+                <w:color w:val="000000"/>
+                <w:sz w:val="19"/>
+                <w:szCs w:val="19"/>
+              </w:rPr>
+              <w:t xml:space="preserve">Authenticate</w:t>
+            </w:r>
+          </w:p>
+        </w:tc>
+        <w:tc>
+          <w:tcPr>
+            <w:tcW w:type="dxa" w:w="1560"/>
+            <w:tcMar>
+              <w:top w:type="dxa" w:w="60"/>
+              <w:left w:type="dxa" w:w="100"/>
+              <w:bottom w:type="dxa" w:w="60"/>
+              <w:right w:type="dxa" w:w="100"/>
+            </w:tcMar>
+          </w:tcPr>
+          <w:p>
+            <w:r>
+              <w:rPr>
+                <w:b w:val="false"/>
+                <w:bCs w:val="false"/>
+                <w:color w:val="000000"/>
+                <w:sz w:val="19"/>
+                <w:szCs w:val="19"/>
+              </w:rPr>
+              <w:t xml:space="preserve">OIDC/SAML + role check</w:t>
+            </w:r>
+          </w:p>
+        </w:tc>
+        <w:tc>
+          <w:tcPr>
+            <w:tcW w:type="dxa" w:w="1300"/>
+            <w:tcMar>
+              <w:top w:type="dxa" w:w="60"/>
+              <w:left w:type="dxa" w:w="100"/>
+              <w:bottom w:type="dxa" w:w="60"/>
+              <w:right w:type="dxa" w:w="100"/>
+            </w:tcMar>
+          </w:tcPr>
+          <w:p>
+            <w:r>
+              <w:rPr>
+                <w:b w:val="false"/>
+                <w:bCs w:val="false"/>
+                <w:color w:val="000000"/>
+                <w:sz w:val="19"/>
+                <w:szCs w:val="19"/>
+              </w:rPr>
+              <w:t xml:space="preserve">Access to audit screens</w:t>
+            </w:r>
+          </w:p>
+        </w:tc>
+      </w:tr>
+      <w:tr>
+        <w:tc>
+          <w:tcPr>
+            <w:tcW w:type="dxa" w:w="400"/>
+            <w:tcMar>
+              <w:top w:type="dxa" w:w="60"/>
+              <w:left w:type="dxa" w:w="100"/>
+              <w:bottom w:type="dxa" w:w="60"/>
+              <w:right w:type="dxa" w:w="100"/>
+            </w:tcMar>
+          </w:tcPr>
+          <w:p>
+            <w:r>
+              <w:rPr>
+                <w:b w:val="false"/>
+                <w:bCs w:val="false"/>
+                <w:color w:val="000000"/>
+                <w:sz w:val="19"/>
+                <w:szCs w:val="19"/>
+              </w:rPr>
+              <w:t xml:space="preserve">2</w:t>
+            </w:r>
+          </w:p>
+        </w:tc>
+        <w:tc>
+          <w:tcPr>
+            <w:tcW w:type="dxa" w:w="2600"/>
+            <w:tcMar>
+              <w:top w:type="dxa" w:w="60"/>
+              <w:left w:type="dxa" w:w="100"/>
+              <w:bottom w:type="dxa" w:w="60"/>
+              <w:right w:type="dxa" w:w="100"/>
+            </w:tcMar>
+          </w:tcPr>
+          <w:p>
+            <w:r>
+              <w:rPr>
+                <w:b w:val="false"/>
+                <w:bCs w:val="false"/>
+                <w:color w:val="000000"/>
+                <w:sz w:val="19"/>
+                <w:szCs w:val="19"/>
+              </w:rPr>
+              <w:t xml:space="preserve">Audit trail search</w:t>
+            </w:r>
+          </w:p>
+        </w:tc>
+        <w:tc>
+          <w:tcPr>
+            <w:tcW w:type="dxa" w:w="2960"/>
+            <w:tcMar>
+              <w:top w:type="dxa" w:w="60"/>
+              <w:left w:type="dxa" w:w="100"/>
+              <w:bottom w:type="dxa" w:w="60"/>
+              <w:right w:type="dxa" w:w="100"/>
+            </w:tcMar>
+          </w:tcPr>
+          <w:p>
+            <w:r>
+              <w:rPr>
+                <w:b w:val="false"/>
+                <w:bCs w:val="false"/>
+                <w:color w:val="000000"/>
+                <w:sz w:val="19"/>
+                <w:szCs w:val="19"/>
+              </w:rPr>
+              <w:t xml:space="preserve">Filters: entity/request ID, date range, actor, event type</w:t>
+            </w:r>
+          </w:p>
+        </w:tc>
+        <w:tc>
+          <w:tcPr>
+            <w:tcW w:type="dxa" w:w="1500"/>
+            <w:tcMar>
+              <w:top w:type="dxa" w:w="60"/>
+              <w:left w:type="dxa" w:w="100"/>
+              <w:bottom w:type="dxa" w:w="60"/>
+              <w:right w:type="dxa" w:w="100"/>
+            </w:tcMar>
+          </w:tcPr>
+          <w:p>
+            <w:r>
+              <w:rPr>
+                <w:b w:val="false"/>
+                <w:bCs w:val="false"/>
+                <w:color w:val="000000"/>
+                <w:sz w:val="19"/>
+                <w:szCs w:val="19"/>
+              </w:rPr>
+              <w:t xml:space="preserve">Search</w:t>
+            </w:r>
+          </w:p>
+        </w:tc>
+        <w:tc>
+          <w:tcPr>
+            <w:tcW w:type="dxa" w:w="1560"/>
+            <w:tcMar>
+              <w:top w:type="dxa" w:w="60"/>
+              <w:left w:type="dxa" w:w="100"/>
+              <w:bottom w:type="dxa" w:w="60"/>
+              <w:right w:type="dxa" w:w="100"/>
+            </w:tcMar>
+          </w:tcPr>
+          <w:p>
+            <w:r>
+              <w:rPr>
+                <w:b w:val="false"/>
+                <w:bCs w:val="false"/>
+                <w:color w:val="000000"/>
+                <w:sz w:val="19"/>
+                <w:szCs w:val="19"/>
+              </w:rPr>
+              <w:t xml:space="preserve">GET /audit?entity=...</w:t>
+            </w:r>
+          </w:p>
+        </w:tc>
+        <w:tc>
+          <w:tcPr>
+            <w:tcW w:type="dxa" w:w="1300"/>
+            <w:tcMar>
+              <w:top w:type="dxa" w:w="60"/>
+              <w:left w:type="dxa" w:w="100"/>
+              <w:bottom w:type="dxa" w:w="60"/>
+              <w:right w:type="dxa" w:w="100"/>
+            </w:tcMar>
+          </w:tcPr>
+          <w:p>
+            <w:r>
+              <w:rPr>
+                <w:b w:val="false"/>
+                <w:bCs w:val="false"/>
+                <w:color w:val="000000"/>
+                <w:sz w:val="19"/>
+                <w:szCs w:val="19"/>
+              </w:rPr>
+              <w:t xml:space="preserve">Results table</w:t>
+            </w:r>
+          </w:p>
+        </w:tc>
+      </w:tr>
+      <w:tr>
+        <w:tc>
+          <w:tcPr>
+            <w:tcW w:type="dxa" w:w="400"/>
+            <w:tcMar>
+              <w:top w:type="dxa" w:w="60"/>
+              <w:left w:type="dxa" w:w="100"/>
+              <w:bottom w:type="dxa" w:w="60"/>
+              <w:right w:type="dxa" w:w="100"/>
+            </w:tcMar>
+          </w:tcPr>
+          <w:p>
+            <w:r>
+              <w:rPr>
+                <w:b w:val="false"/>
+                <w:bCs w:val="false"/>
+                <w:color w:val="000000"/>
+                <w:sz w:val="19"/>
+                <w:szCs w:val="19"/>
+              </w:rPr>
+              <w:t xml:space="preserve">3</w:t>
+            </w:r>
+          </w:p>
+        </w:tc>
+        <w:tc>
+          <w:tcPr>
+            <w:tcW w:type="dxa" w:w="2600"/>
+            <w:tcMar>
+              <w:top w:type="dxa" w:w="60"/>
+              <w:left w:type="dxa" w:w="100"/>
+              <w:bottom w:type="dxa" w:w="60"/>
+              <w:right w:type="dxa" w:w="100"/>
+            </w:tcMar>
+          </w:tcPr>
+          <w:p>
+            <w:r>
+              <w:rPr>
+                <w:b w:val="false"/>
+                <w:bCs w:val="false"/>
+                <w:color w:val="000000"/>
+                <w:sz w:val="19"/>
+                <w:szCs w:val="19"/>
+              </w:rPr>
+              <w:t xml:space="preserve">Results + export</w:t>
+            </w:r>
+          </w:p>
+        </w:tc>
+        <w:tc>
+          <w:tcPr>
+            <w:tcW w:type="dxa" w:w="2960"/>
+            <w:tcMar>
+              <w:top w:type="dxa" w:w="60"/>
+              <w:left w:type="dxa" w:w="100"/>
+              <w:bottom w:type="dxa" w:w="60"/>
+              <w:right w:type="dxa" w:w="100"/>
+            </w:tcMar>
+          </w:tcPr>
+          <w:p>
+            <w:r>
+              <w:rPr>
+                <w:b w:val="false"/>
+                <w:bCs w:val="false"/>
+                <w:color w:val="000000"/>
+                <w:sz w:val="19"/>
+                <w:szCs w:val="19"/>
+              </w:rPr>
+              <w:t xml:space="preserve">Paginated event list; Export CSV button</w:t>
+            </w:r>
+          </w:p>
+        </w:tc>
+        <w:tc>
+          <w:tcPr>
+            <w:tcW w:type="dxa" w:w="1500"/>
+            <w:tcMar>
+              <w:top w:type="dxa" w:w="60"/>
+              <w:left w:type="dxa" w:w="100"/>
+              <w:bottom w:type="dxa" w:w="60"/>
+              <w:right w:type="dxa" w:w="100"/>
+            </w:tcMar>
+          </w:tcPr>
+          <w:p>
+            <w:r>
+              <w:rPr>
+                <w:b w:val="false"/>
+                <w:bCs w:val="false"/>
+                <w:color w:val="000000"/>
+                <w:sz w:val="19"/>
+                <w:szCs w:val="19"/>
+              </w:rPr>
+              <w:t xml:space="preserve">Export</w:t>
+            </w:r>
+          </w:p>
+        </w:tc>
+        <w:tc>
+          <w:tcPr>
+            <w:tcW w:type="dxa" w:w="1560"/>
+            <w:tcMar>
+              <w:top w:type="dxa" w:w="60"/>
+              <w:left w:type="dxa" w:w="100"/>
+              <w:bottom w:type="dxa" w:w="60"/>
+              <w:right w:type="dxa" w:w="100"/>
+            </w:tcMar>
+          </w:tcPr>
+          <w:p>
+            <w:r>
+              <w:rPr>
+                <w:b w:val="false"/>
+                <w:bCs w:val="false"/>
+                <w:color w:val="000000"/>
+                <w:sz w:val="19"/>
+                <w:szCs w:val="19"/>
+              </w:rPr>
+              <w:t xml:space="preserve">Same endpoint, CSV format</w:t>
+            </w:r>
+          </w:p>
+        </w:tc>
+        <w:tc>
+          <w:tcPr>
+            <w:tcW w:type="dxa" w:w="1300"/>
+            <w:tcMar>
+              <w:top w:type="dxa" w:w="60"/>
+              <w:left w:type="dxa" w:w="100"/>
+              <w:bottom w:type="dxa" w:w="60"/>
+              <w:right w:type="dxa" w:w="100"/>
+            </w:tcMar>
+          </w:tcPr>
+          <w:p>
+            <w:r>
+              <w:rPr>
+                <w:b w:val="false"/>
+                <w:bCs w:val="false"/>
+                <w:color w:val="000000"/>
+                <w:sz w:val="19"/>
+                <w:szCs w:val="19"/>
+              </w:rPr>
+              <w:t xml:space="preserve">Browser-native file download</w:t>
+            </w:r>
+          </w:p>
+        </w:tc>
+      </w:tr>
+    </w:tbl>
+    <w:p>
+      <w:pPr>
+        <w:spacing w:after="100"/>
+      </w:pPr>
+      <w:r>
+        <w:rPr>
+          <w:i/>
+          <w:iCs/>
+        </w:rPr>
+        <w:t xml:space="preserve">Every integration-call column above is the contract the frontend and backend teams build to — the frontend needs nothing beyond these calls, and the backend needs nothing beyond implementing exactly these calls plus the provisioning saga described in Section 7.</w:t>
+      </w:r>
+    </w:p>
+    <w:p>
+      <w:pPr>
+        <w:pStyle w:val="Heading1"/>
+        <w:spacing w:after="140" w:before="300"/>
+      </w:pPr>
+      <w:r>
+        <w:rPr>
+          <w:color w:val="1F4E79"/>
+        </w:rPr>
+        <w:t xml:space="preserve">5. Feature Catalogue (MoSCoW)</w:t>
       </w:r>
     </w:p>
     <w:tbl>
@@ -1619,7 +5507,7 @@
         <w:rPr>
           <w:color w:val="1F4E79"/>
         </w:rPr>
-        <w:t xml:space="preserve">5. User Stories</w:t>
+        <w:t xml:space="preserve">6. User Stories</w:t>
       </w:r>
     </w:p>
     <w:p>
@@ -2651,7 +6539,7 @@
         <w:rPr>
           <w:color w:val="1F4E79"/>
         </w:rPr>
-        <w:t xml:space="preserve">6. Solution Architecture</w:t>
+        <w:t xml:space="preserve">7. Solution Architecture</w:t>
       </w:r>
     </w:p>
     <w:p>
@@ -2981,7 +6869,7 @@
         <w:rPr>
           <w:color w:val="1F4E79"/>
         </w:rPr>
-        <w:t xml:space="preserve">7. Automated Boomi Build — Central Design Decision</w:t>
+        <w:t xml:space="preserve">8. Automated Boomi Build — Central Design Decision</w:t>
       </w:r>
     </w:p>
     <w:p>
@@ -3848,7 +7736,7 @@
         <w:rPr>
           <w:color w:val="1F4E79"/>
         </w:rPr>
-        <w:t xml:space="preserve">8. Design Patterns &amp; Recommendations</w:t>
+        <w:t xml:space="preserve">9. Design Patterns &amp; Recommendations</w:t>
       </w:r>
     </w:p>
     <w:p>
@@ -4080,7 +7968,7 @@
         <w:rPr>
           <w:color w:val="1F4E79"/>
         </w:rPr>
-        <w:t xml:space="preserve">9. State Machine</w:t>
+        <w:t xml:space="preserve">10. State Machine</w:t>
       </w:r>
     </w:p>
     <w:p>
@@ -4100,7 +7988,7 @@
         <w:rPr>
           <w:color w:val="1F4E79"/>
         </w:rPr>
-        <w:t xml:space="preserve">10. Non-Functional Requirements</w:t>
+        <w:t xml:space="preserve">11. Non-Functional Requirements</w:t>
       </w:r>
     </w:p>
     <w:tbl>
@@ -4470,7 +8358,7 @@
         <w:rPr>
           <w:color w:val="1F4E79"/>
         </w:rPr>
-        <w:t xml:space="preserve">11. MVP &amp; Roadmap</w:t>
+        <w:t xml:space="preserve">12. MVP &amp; Roadmap</w:t>
       </w:r>
     </w:p>
     <w:tbl>

</xml_diff>

<commit_message>
Add 'How Boomi Achieves MFT' section: technical mechanism + error notification, with SVG/PNG diagram and editable draw.io
</commit_message>
<xml_diff>
--- a/assets/intelligrator-mft-product-specification.docx
+++ b/assets/intelligrator-mft-product-specification.docx
@@ -189,6 +189,542 @@
       </w:pPr>
       <w:r>
         <w:t xml:space="preserve">Out of scope for v1: event-triggered (file-arrival) transfers, in-flight transformation, and auto-promotion beyond Dev.</w:t>
+      </w:r>
+    </w:p>
+    <w:p>
+      <w:pPr>
+        <w:pStyle w:val="Heading1"/>
+        <w:spacing w:after="140" w:before="300"/>
+      </w:pPr>
+      <w:r>
+        <w:rPr>
+          <w:color w:val="1F4E79"/>
+        </w:rPr>
+        <w:t xml:space="preserve">1b. How Boomi Achieves MFT — Technical Mechanism &amp; Error Notification</w:t>
+      </w:r>
+    </w:p>
+    <w:p>
+      <w:pPr>
+        <w:spacing w:after="100"/>
+      </w:pPr>
+      <w:r>
+        <w:t xml:space="preserve">Boomi supports two distinct ways to move files under management. This catalogue and the Intelligrator Generic MFT Engine (Sections 8-9) use Option A. Option B, Boomi's own native Managed File Transfer product, is documented here for completeness and as a deliberate future evaluation, not something in scope today.</w:t>
+      </w:r>
+    </w:p>
+    <w:p>
+      <w:pPr>
+        <w:spacing w:after="160" w:before="120"/>
+        <w:jc w:val="center"/>
+      </w:pPr>
+      <w:r>
+        <w:drawing>
+          <wp:inline distT="0" distB="0" distL="0" distR="0">
+            <wp:extent cx="5905500" cy="3810000"/>
+            <wp:effectExtent t="0" r="0" b="0" l="0"/>
+            <wp:docPr id="1" name="" descr="" title=""/>
+            <wp:cNvGraphicFramePr>
+              <a:graphicFrameLocks xmlns:a="http://schemas.openxmlformats.org/drawingml/2006/main" noChangeAspect="1"/>
+            </wp:cNvGraphicFramePr>
+            <a:graphic xmlns:a="http://schemas.openxmlformats.org/drawingml/2006/main">
+              <a:graphicData uri="http://schemas.openxmlformats.org/drawingml/2006/picture">
+                <pic:pic xmlns:pic="http://schemas.openxmlformats.org/drawingml/2006/picture">
+                  <pic:nvPicPr>
+                    <pic:cNvPr id="0" name="" descr=""/>
+                    <pic:cNvPicPr>
+                      <a:picLocks noChangeAspect="1" noChangeArrowheads="1"/>
+                    </pic:cNvPicPr>
+                  </pic:nvPicPr>
+                  <pic:blipFill>
+                    <a:blip r:embed="rId9" cstate="none"/>
+                    <a:srcRect/>
+                    <a:stretch>
+                      <a:fillRect/>
+                    </a:stretch>
+                  </pic:blipFill>
+                  <pic:spPr bwMode="auto">
+                    <a:xfrm>
+                      <a:off x="0" y="0"/>
+                      <a:ext cx="5905500" cy="3810000"/>
+                    </a:xfrm>
+                    <a:prstGeom prst="rect">
+                      <a:avLst/>
+                    </a:prstGeom>
+                  </pic:spPr>
+                </pic:pic>
+              </a:graphicData>
+            </a:graphic>
+          </wp:inline>
+        </w:drawing>
+      </w:r>
+    </w:p>
+    <w:p>
+      <w:pPr>
+        <w:pStyle w:val="Heading2"/>
+        <w:spacing w:after="100" w:before="220"/>
+      </w:pPr>
+      <w:r>
+        <w:rPr>
+          <w:color w:val="0F6674"/>
+        </w:rPr>
+        <w:t xml:space="preserve">Option A — Boomi Integration process-based transfer (used by this catalogue)</w:t>
+      </w:r>
+    </w:p>
+    <w:p>
+      <w:pPr>
+        <w:pStyle w:val="ListParagraph"/>
+        <w:numPr>
+          <w:ilvl w:val="0"/>
+          <w:numId w:val="2"/>
+        </w:numPr>
+        <w:spacing w:after="60"/>
+      </w:pPr>
+      <w:r>
+        <w:rPr>
+          <w:b/>
+          <w:bCs/>
+        </w:rPr>
+        <w:t xml:space="preserve">1: </w:t>
+      </w:r>
+      <w:r>
+        <w:t xml:space="preserve">a Scheduled Start shape triggers a deployed process on the Atom at the interface's configured cron.</w:t>
+      </w:r>
+    </w:p>
+    <w:p>
+      <w:pPr>
+        <w:pStyle w:val="ListParagraph"/>
+        <w:numPr>
+          <w:ilvl w:val="0"/>
+          <w:numId w:val="2"/>
+        </w:numPr>
+        <w:spacing w:after="60"/>
+      </w:pPr>
+      <w:r>
+        <w:rPr>
+          <w:b/>
+          <w:bCs/>
+        </w:rPr>
+        <w:t xml:space="preserve">2: </w:t>
+      </w:r>
+      <w:r>
+        <w:t xml:space="preserve">a source connector operation (Disk, SFTP, FTPS, or AS2 — Get/List) retrieves matching files from the source folder.</w:t>
+      </w:r>
+    </w:p>
+    <w:p>
+      <w:pPr>
+        <w:pStyle w:val="ListParagraph"/>
+        <w:numPr>
+          <w:ilvl w:val="0"/>
+          <w:numId w:val="2"/>
+        </w:numPr>
+        <w:spacing w:after="60"/>
+      </w:pPr>
+      <w:r>
+        <w:rPr>
+          <w:b/>
+          <w:bCs/>
+        </w:rPr>
+        <w:t xml:space="preserve">3: </w:t>
+      </w:r>
+      <w:r>
+        <w:t xml:space="preserve">optional validation/transform steps check the file profile, compute a checksum, and set tracked document properties.</w:t>
+      </w:r>
+    </w:p>
+    <w:p>
+      <w:pPr>
+        <w:pStyle w:val="ListParagraph"/>
+        <w:numPr>
+          <w:ilvl w:val="0"/>
+          <w:numId w:val="2"/>
+        </w:numPr>
+        <w:spacing w:after="60"/>
+      </w:pPr>
+      <w:r>
+        <w:rPr>
+          <w:b/>
+          <w:bCs/>
+        </w:rPr>
+        <w:t xml:space="preserve">4: </w:t>
+      </w:r>
+      <w:r>
+        <w:t xml:space="preserve">a destination connector operation (Send/Put) delivers the file to the target folder.</w:t>
+      </w:r>
+    </w:p>
+    <w:p>
+      <w:pPr>
+        <w:pStyle w:val="ListParagraph"/>
+        <w:numPr>
+          <w:ilvl w:val="0"/>
+          <w:numId w:val="2"/>
+        </w:numPr>
+        <w:spacing w:after="60"/>
+      </w:pPr>
+      <w:r>
+        <w:rPr>
+          <w:b/>
+          <w:bCs/>
+        </w:rPr>
+        <w:t xml:space="preserve">5: </w:t>
+      </w:r>
+      <w:r>
+        <w:t xml:space="preserve">a post-action step archives, deletes, or renames the source file per the interface's configuration.</w:t>
+      </w:r>
+    </w:p>
+    <w:p>
+      <w:pPr>
+        <w:pStyle w:val="ListParagraph"/>
+        <w:numPr>
+          <w:ilvl w:val="0"/>
+          <w:numId w:val="2"/>
+        </w:numPr>
+        <w:spacing w:after="60"/>
+      </w:pPr>
+      <w:r>
+        <w:rPr>
+          <w:b/>
+          <w:bCs/>
+        </w:rPr>
+        <w:t xml:space="preserve">6: </w:t>
+      </w:r>
+      <w:r>
+        <w:t xml:space="preserve">every execution — success or failure — is automatically visible in Process Reporting, keyed by execution ID.</w:t>
+      </w:r>
+    </w:p>
+    <w:p>
+      <w:pPr>
+        <w:pStyle w:val="Heading2"/>
+        <w:spacing w:after="100" w:before="220"/>
+      </w:pPr>
+      <w:r>
+        <w:rPr>
+          <w:color w:val="0F6674"/>
+        </w:rPr>
+        <w:t xml:space="preserve">Error handling &amp; notification (mechanism behind the notification opt-in feature)</w:t>
+      </w:r>
+    </w:p>
+    <w:p>
+      <w:pPr>
+        <w:pStyle w:val="ListParagraph"/>
+        <w:numPr>
+          <w:ilvl w:val="0"/>
+          <w:numId w:val="2"/>
+        </w:numPr>
+        <w:spacing w:after="60"/>
+      </w:pPr>
+      <w:r>
+        <w:rPr>
+          <w:b/>
+          <w:bCs/>
+        </w:rPr>
+        <w:t xml:space="preserve">Retry: </w:t>
+      </w:r>
+      <w:r>
+        <w:t xml:space="preserve">connector steps are wrapped in a Try/Catch shape with a configurable retry count (0-5); the failed document and its Try/Catch Message property are carried down the Catch path so the original document isn't lost.</w:t>
+      </w:r>
+    </w:p>
+    <w:p>
+      <w:pPr>
+        <w:pStyle w:val="ListParagraph"/>
+        <w:numPr>
+          <w:ilvl w:val="0"/>
+          <w:numId w:val="2"/>
+        </w:numPr>
+        <w:spacing w:after="60"/>
+      </w:pPr>
+      <w:r>
+        <w:rPr>
+          <w:b/>
+          <w:bCs/>
+        </w:rPr>
+        <w:t xml:space="preserve">Assemble: </w:t>
+      </w:r>
+      <w:r>
+        <w:t xml:space="preserve">the Catch path feeds a Message/Notify step that assembles a structured error: interface name, file name, failing step, error text, execution ID.</w:t>
+      </w:r>
+    </w:p>
+    <w:p>
+      <w:pPr>
+        <w:pStyle w:val="ListParagraph"/>
+        <w:numPr>
+          <w:ilvl w:val="0"/>
+          <w:numId w:val="2"/>
+        </w:numPr>
+        <w:spacing w:after="60"/>
+      </w:pPr>
+      <w:r>
+        <w:rPr>
+          <w:b/>
+          <w:bCs/>
+        </w:rPr>
+        <w:t xml:space="preserve">Alert: </w:t>
+      </w:r>
+      <w:r>
+        <w:t xml:space="preserve">a Mail connector (or webhook, for Slack/Teams-style alerts) sends that error to the recipients captured at request time — this only fires when the interface's notification preference is opted in.</w:t>
+      </w:r>
+    </w:p>
+    <w:p>
+      <w:pPr>
+        <w:pStyle w:val="ListParagraph"/>
+        <w:numPr>
+          <w:ilvl w:val="0"/>
+          <w:numId w:val="2"/>
+        </w:numPr>
+        <w:spacing w:after="60"/>
+      </w:pPr>
+      <w:r>
+        <w:rPr>
+          <w:b/>
+          <w:bCs/>
+        </w:rPr>
+        <w:t xml:space="preserve">Halt: </w:t>
+      </w:r>
+      <w:r>
+        <w:t xml:space="preserve">critical failures can additionally raise an Exception shape to deliberately halt execution with a custom message rather than letting a partial transfer continue silently.</w:t>
+      </w:r>
+    </w:p>
+    <w:p>
+      <w:pPr>
+        <w:pStyle w:val="ListParagraph"/>
+        <w:numPr>
+          <w:ilvl w:val="0"/>
+          <w:numId w:val="2"/>
+        </w:numPr>
+        <w:spacing w:after="60"/>
+      </w:pPr>
+      <w:r>
+        <w:rPr>
+          <w:b/>
+          <w:bCs/>
+        </w:rPr>
+        <w:t xml:space="preserve">Platform-level: </w:t>
+      </w:r>
+      <w:r>
+        <w:t xml:space="preserve">account/environment-level PROCESS.EXECUTION alerts (Log Level = ERROR) and USER.NOTIFICATION alerts (non-terminating business warnings) provide a second, platform-wide safety net independent of any one process's own Mail connector.</w:t>
+      </w:r>
+    </w:p>
+    <w:p>
+      <w:pPr>
+        <w:pStyle w:val="ListParagraph"/>
+        <w:numPr>
+          <w:ilvl w:val="0"/>
+          <w:numId w:val="2"/>
+        </w:numPr>
+        <w:spacing w:after="60"/>
+      </w:pPr>
+      <w:r>
+        <w:rPr>
+          <w:b/>
+          <w:bCs/>
+        </w:rPr>
+        <w:t xml:space="preserve">Traceability: </w:t>
+      </w:r>
+      <w:r>
+        <w:t xml:space="preserve">alert emails commonly embed a direct link to the execution in Process Reporting, so the platform team can jump straight to the failing run.</w:t>
+      </w:r>
+    </w:p>
+    <w:p>
+      <w:pPr>
+        <w:pStyle w:val="Heading2"/>
+        <w:spacing w:after="100" w:before="220"/>
+      </w:pPr>
+      <w:r>
+        <w:rPr>
+          <w:color w:val="0F6674"/>
+        </w:rPr>
+        <w:t xml:space="preserve">Option B — Boomi native Managed File Transfer (Boomi MFT, powered by Thru)</w:t>
+      </w:r>
+    </w:p>
+    <w:p>
+      <w:pPr>
+        <w:spacing w:after="100"/>
+      </w:pPr>
+      <w:r>
+        <w:t xml:space="preserve">A separate, licensed managed service rather than a hand-built process, split into two channels:</w:t>
+      </w:r>
+    </w:p>
+    <w:tbl>
+      <w:tblPr>
+        <w:tblW w:type="dxa" w:w="9360"/>
+        <w:tblBorders>
+          <w:top w:val="single" w:color="auto" w:sz="4"/>
+          <w:left w:val="single" w:color="auto" w:sz="4"/>
+          <w:bottom w:val="single" w:color="auto" w:sz="4"/>
+          <w:right w:val="single" w:color="auto" w:sz="4"/>
+          <w:insideH w:val="single" w:color="auto" w:sz="4"/>
+          <w:insideV w:val="single" w:color="auto" w:sz="4"/>
+        </w:tblBorders>
+      </w:tblPr>
+      <w:tblGrid>
+        <w:gridCol w:w="2400"/>
+        <w:gridCol w:w="6960"/>
+      </w:tblGrid>
+      <w:tr>
+        <w:trPr>
+          <w:tblHeader/>
+        </w:trPr>
+        <w:tc>
+          <w:tcPr>
+            <w:tcW w:type="dxa" w:w="2400"/>
+            <w:shd w:fill="DCE6F1" w:val="clear"/>
+            <w:tcMar>
+              <w:top w:type="dxa" w:w="60"/>
+              <w:left w:type="dxa" w:w="100"/>
+              <w:bottom w:type="dxa" w:w="60"/>
+              <w:right w:type="dxa" w:w="100"/>
+            </w:tcMar>
+          </w:tcPr>
+          <w:p>
+            <w:r>
+              <w:rPr>
+                <w:b/>
+                <w:bCs/>
+                <w:color w:val="1F4E79"/>
+                <w:sz w:val="19"/>
+                <w:szCs w:val="19"/>
+              </w:rPr>
+              <w:t xml:space="preserve">Channel</w:t>
+            </w:r>
+          </w:p>
+        </w:tc>
+        <w:tc>
+          <w:tcPr>
+            <w:tcW w:type="dxa" w:w="6960"/>
+            <w:shd w:fill="DCE6F1" w:val="clear"/>
+            <w:tcMar>
+              <w:top w:type="dxa" w:w="60"/>
+              <w:left w:type="dxa" w:w="100"/>
+              <w:bottom w:type="dxa" w:w="60"/>
+              <w:right w:type="dxa" w:w="100"/>
+            </w:tcMar>
+          </w:tcPr>
+          <w:p>
+            <w:r>
+              <w:rPr>
+                <w:b/>
+                <w:bCs/>
+                <w:color w:val="1F4E79"/>
+                <w:sz w:val="19"/>
+                <w:szCs w:val="19"/>
+              </w:rPr>
+              <w:t xml:space="preserve">Responsibility</w:t>
+            </w:r>
+          </w:p>
+        </w:tc>
+      </w:tr>
+      <w:tr>
+        <w:tc>
+          <w:tcPr>
+            <w:tcW w:type="dxa" w:w="2400"/>
+            <w:tcMar>
+              <w:top w:type="dxa" w:w="60"/>
+              <w:left w:type="dxa" w:w="100"/>
+              <w:bottom w:type="dxa" w:w="60"/>
+              <w:right w:type="dxa" w:w="100"/>
+            </w:tcMar>
+          </w:tcPr>
+          <w:p>
+            <w:r>
+              <w:rPr>
+                <w:b w:val="false"/>
+                <w:bCs w:val="false"/>
+                <w:color w:val="000000"/>
+                <w:sz w:val="19"/>
+                <w:szCs w:val="19"/>
+              </w:rPr>
+              <w:t xml:space="preserve">Management Channel</w:t>
+            </w:r>
+          </w:p>
+        </w:tc>
+        <w:tc>
+          <w:tcPr>
+            <w:tcW w:type="dxa" w:w="6960"/>
+            <w:tcMar>
+              <w:top w:type="dxa" w:w="60"/>
+              <w:left w:type="dxa" w:w="100"/>
+              <w:bottom w:type="dxa" w:w="60"/>
+              <w:right w:type="dxa" w:w="100"/>
+            </w:tcMar>
+          </w:tcPr>
+          <w:p>
+            <w:r>
+              <w:rPr>
+                <w:b w:val="false"/>
+                <w:bCs w:val="false"/>
+                <w:color w:val="000000"/>
+                <w:sz w:val="19"/>
+                <w:szCs w:val="19"/>
+              </w:rPr>
+              <w:t xml:space="preserve">Flow definitions, partner/endpoint credentials, tracking, audit, and proof of delivery — run in Boomi's cloud, with native alerts on failed transfers and a partner self-service portal for endpoint management.</w:t>
+            </w:r>
+          </w:p>
+        </w:tc>
+      </w:tr>
+      <w:tr>
+        <w:tc>
+          <w:tcPr>
+            <w:tcW w:type="dxa" w:w="2400"/>
+            <w:tcMar>
+              <w:top w:type="dxa" w:w="60"/>
+              <w:left w:type="dxa" w:w="100"/>
+              <w:bottom w:type="dxa" w:w="60"/>
+              <w:right w:type="dxa" w:w="100"/>
+            </w:tcMar>
+          </w:tcPr>
+          <w:p>
+            <w:r>
+              <w:rPr>
+                <w:b w:val="false"/>
+                <w:bCs w:val="false"/>
+                <w:color w:val="000000"/>
+                <w:sz w:val="19"/>
+                <w:szCs w:val="19"/>
+              </w:rPr>
+              <w:t xml:space="preserve">Data Channel</w:t>
+            </w:r>
+          </w:p>
+        </w:tc>
+        <w:tc>
+          <w:tcPr>
+            <w:tcW w:type="dxa" w:w="6960"/>
+            <w:tcMar>
+              <w:top w:type="dxa" w:w="60"/>
+              <w:left w:type="dxa" w:w="100"/>
+              <w:bottom w:type="dxa" w:w="60"/>
+              <w:right w:type="dxa" w:w="100"/>
+            </w:tcMar>
+          </w:tcPr>
+          <w:p>
+            <w:r>
+              <w:rPr>
+                <w:b w:val="false"/>
+                <w:bCs w:val="false"/>
+                <w:color w:val="000000"/>
+                <w:sz w:val="19"/>
+                <w:szCs w:val="19"/>
+              </w:rPr>
+              <w:t xml:space="preserve">The actual file payload transfer between Boomi, Thru, and external endpoints — persistent storage until delivered, automatic retry, auto-resume, and guaranteed delivery even across network interruption. Files are encrypted at rest, in transit, and at the file level.</w:t>
+            </w:r>
+          </w:p>
+        </w:tc>
+      </w:tr>
+    </w:tbl>
+    <w:p>
+      <w:pPr>
+        <w:spacing w:after="100"/>
+      </w:pPr>
+      <w:r>
+        <w:t xml:space="preserve">A Boomi Integration process talks to it through the Managed File Transfer connector: a Get operation picks up a file from a Flow, a Create operation drops one off, and a Create with Type=Exception pushes error/exception context back into MFT's own tracking and audit trail — so failures are visible in MFT's dashboards independent of the calling process.</w:t>
+      </w:r>
+    </w:p>
+    <w:p>
+      <w:pPr>
+        <w:spacing w:after="100"/>
+      </w:pPr>
+      <w:r>
+        <w:rPr>
+          <w:b/>
+          <w:bCs/>
+        </w:rPr>
+        <w:t xml:space="preserve">Option B is worth a deliberate evaluation specifically where external trading partners need to self-manage their own endpoints, or where transfer volumes and regulatory requirements exceed what a hand-built Try/Catch chain comfortably manages. It carries its own licensing and isn't a default — this catalogue's P-116 pattern and Intelligrator's Generic MFT Engine deliberately use Option A, keeping full control over the config-driven, approval-gated model.</w:t>
       </w:r>
     </w:p>
     <w:p>

</xml_diff>

<commit_message>
Clarify Boomi/Thru relationship: Boomi acquired Thru Inc. (May 2025), MFT is now native Boomi IP, not a third-party partnership
</commit_message>
<xml_diff>
--- a/assets/intelligrator-mft-product-specification.docx
+++ b/assets/intelligrator-mft-product-specification.docx
@@ -530,7 +530,7 @@
         <w:rPr>
           <w:color w:val="0F6674"/>
         </w:rPr>
-        <w:t xml:space="preserve">Option B — Boomi native Managed File Transfer (Boomi MFT, powered by Thru)</w:t>
+        <w:t xml:space="preserve">Option B — Boomi native Managed File Transfer (Boomi MFT, formerly Thru)</w:t>
       </w:r>
     </w:p>
     <w:p>
@@ -538,7 +538,19 @@
         <w:spacing w:after="100"/>
       </w:pPr>
       <w:r>
-        <w:t xml:space="preserve">A separate, licensed managed service rather than a hand-built process, split into two channels:</w:t>
+        <w:rPr>
+          <w:b/>
+          <w:bCs/>
+        </w:rPr>
+        <w:t xml:space="preserve">Who is Thru, and why 'formerly'? Thru, Inc. was an independent company founded in 2002, building one of the first cloud-native Managed File Transfer platforms — early work included a global edge transfer network and, in 2010, the first public API for cloud MFT. For years Thru held Boomi's highest partner tier (Technology Partner) and shipped the Thru MFT Connector for Boomi as a joint third-party integration. That changed on 15 May 2025, when Boomi announced a definitive agreement to acquire Thru, Inc. outright (deal expected to close by end of June 2025). Thru's technology is now embedded directly into the Boomi Enterprise Platform as Boomi's own native MFT offering — it is Boomi-owned IP today, not a third-party add-on being resold.</w:t>
+      </w:r>
+    </w:p>
+    <w:p>
+      <w:pPr>
+        <w:spacing w:after="100"/>
+      </w:pPr>
+      <w:r>
+        <w:t xml:space="preserve">Boomi MFT still operates the way Thru originally built it, split into two channels:</w:t>
       </w:r>
     </w:p>
     <w:tbl>
@@ -701,7 +713,7 @@
                 <w:sz w:val="19"/>
                 <w:szCs w:val="19"/>
               </w:rPr>
-              <w:t xml:space="preserve">The actual file payload transfer between Boomi, Thru, and external endpoints — persistent storage until delivered, automatic retry, auto-resume, and guaranteed delivery even across network interruption. Files are encrypted at rest, in transit, and at the file level.</w:t>
+              <w:t xml:space="preserve">The actual file payload transfer between Boomi and external endpoints — persistent storage until delivered, automatic retry, auto-resume, and guaranteed delivery even across network interruption. Files are encrypted at rest, in transit, and at the file level, within a zero-trust, SOC 2-aligned architecture.</w:t>
             </w:r>
           </w:p>
         </w:tc>

</xml_diff>

<commit_message>
Add comprehensive Boomi Managed File Transfer (native) deep-dive: model, AFT vs FS, architecture, connector, native alerting, security/scale/licensing
</commit_message>
<xml_diff>
--- a/assets/intelligrator-mft-product-specification.docx
+++ b/assets/intelligrator-mft-product-specification.docx
@@ -737,6 +737,1251 @@
           <w:bCs/>
         </w:rPr>
         <w:t xml:space="preserve">Option B is worth a deliberate evaluation specifically where external trading partners need to self-manage their own endpoints, or where transfer volumes and regulatory requirements exceed what a hand-built Try/Catch chain comfortably manages. It carries its own licensing and isn't a default — this catalogue's P-116 pattern and Intelligrator's Generic MFT Engine deliberately use Option A, keeping full control over the config-driven, approval-gated model.</w:t>
+      </w:r>
+    </w:p>
+    <w:p>
+      <w:pPr>
+        <w:pStyle w:val="Heading1"/>
+        <w:spacing w:after="140" w:before="300"/>
+      </w:pPr>
+      <w:r>
+        <w:rPr>
+          <w:color w:val="1F4E79"/>
+        </w:rPr>
+        <w:t xml:space="preserve">1c. Boomi Managed File Transfer (Native) — Deep Dive</w:t>
+      </w:r>
+    </w:p>
+    <w:p>
+      <w:pPr>
+        <w:spacing w:after="100"/>
+      </w:pPr>
+      <w:r>
+        <w:t xml:space="preserve">A full technical treatment of Option B on its own terms: the model it's built on, its two applications, its architecture, how a Boomi process talks to it, and how it monitors and alerts on failure.</w:t>
+      </w:r>
+    </w:p>
+    <w:p>
+      <w:pPr>
+        <w:spacing w:after="160" w:before="120"/>
+        <w:jc w:val="center"/>
+      </w:pPr>
+      <w:r>
+        <w:drawing>
+          <wp:inline distT="0" distB="0" distL="0" distR="0">
+            <wp:extent cx="5905500" cy="4305300"/>
+            <wp:effectExtent t="0" r="0" b="0" l="0"/>
+            <wp:docPr id="1" name="" descr="" title=""/>
+            <wp:cNvGraphicFramePr>
+              <a:graphicFrameLocks xmlns:a="http://schemas.openxmlformats.org/drawingml/2006/main" noChangeAspect="1"/>
+            </wp:cNvGraphicFramePr>
+            <a:graphic xmlns:a="http://schemas.openxmlformats.org/drawingml/2006/main">
+              <a:graphicData uri="http://schemas.openxmlformats.org/drawingml/2006/picture">
+                <pic:pic xmlns:pic="http://schemas.openxmlformats.org/drawingml/2006/picture">
+                  <pic:nvPicPr>
+                    <pic:cNvPr id="0" name="" descr=""/>
+                    <pic:cNvPicPr>
+                      <a:picLocks noChangeAspect="1" noChangeArrowheads="1"/>
+                    </pic:cNvPicPr>
+                  </pic:nvPicPr>
+                  <pic:blipFill>
+                    <a:blip r:embed="rId10" cstate="none"/>
+                    <a:srcRect/>
+                    <a:stretch>
+                      <a:fillRect/>
+                    </a:stretch>
+                  </pic:blipFill>
+                  <pic:spPr bwMode="auto">
+                    <a:xfrm>
+                      <a:off x="0" y="0"/>
+                      <a:ext cx="5905500" cy="4305300"/>
+                    </a:xfrm>
+                    <a:prstGeom prst="rect">
+                      <a:avLst/>
+                    </a:prstGeom>
+                  </pic:spPr>
+                </pic:pic>
+              </a:graphicData>
+            </a:graphic>
+          </wp:inline>
+        </w:drawing>
+      </w:r>
+    </w:p>
+    <w:p>
+      <w:pPr>
+        <w:pStyle w:val="Heading2"/>
+        <w:spacing w:after="100" w:before="220"/>
+      </w:pPr>
+      <w:r>
+        <w:rPr>
+          <w:color w:val="0F6674"/>
+        </w:rPr>
+        <w:t xml:space="preserve">The core model — a postal service for files</w:t>
+      </w:r>
+    </w:p>
+    <w:tbl>
+      <w:tblPr>
+        <w:tblW w:type="dxa" w:w="9360"/>
+        <w:tblBorders>
+          <w:top w:val="single" w:color="auto" w:sz="4"/>
+          <w:left w:val="single" w:color="auto" w:sz="4"/>
+          <w:bottom w:val="single" w:color="auto" w:sz="4"/>
+          <w:right w:val="single" w:color="auto" w:sz="4"/>
+          <w:insideH w:val="single" w:color="auto" w:sz="4"/>
+          <w:insideV w:val="single" w:color="auto" w:sz="4"/>
+        </w:tblBorders>
+      </w:tblPr>
+      <w:tblGrid>
+        <w:gridCol w:w="2400"/>
+        <w:gridCol w:w="6960"/>
+      </w:tblGrid>
+      <w:tr>
+        <w:trPr>
+          <w:tblHeader/>
+        </w:trPr>
+        <w:tc>
+          <w:tcPr>
+            <w:tcW w:type="dxa" w:w="2400"/>
+            <w:shd w:fill="DCE6F1" w:val="clear"/>
+            <w:tcMar>
+              <w:top w:type="dxa" w:w="60"/>
+              <w:left w:type="dxa" w:w="100"/>
+              <w:bottom w:type="dxa" w:w="60"/>
+              <w:right w:type="dxa" w:w="100"/>
+            </w:tcMar>
+          </w:tcPr>
+          <w:p>
+            <w:r>
+              <w:rPr>
+                <w:b/>
+                <w:bCs/>
+                <w:color w:val="1F4E79"/>
+                <w:sz w:val="19"/>
+                <w:szCs w:val="19"/>
+              </w:rPr>
+              <w:t xml:space="preserve">Concept</w:t>
+            </w:r>
+          </w:p>
+        </w:tc>
+        <w:tc>
+          <w:tcPr>
+            <w:tcW w:type="dxa" w:w="6960"/>
+            <w:shd w:fill="DCE6F1" w:val="clear"/>
+            <w:tcMar>
+              <w:top w:type="dxa" w:w="60"/>
+              <w:left w:type="dxa" w:w="100"/>
+              <w:bottom w:type="dxa" w:w="60"/>
+              <w:right w:type="dxa" w:w="100"/>
+            </w:tcMar>
+          </w:tcPr>
+          <w:p>
+            <w:r>
+              <w:rPr>
+                <w:b/>
+                <w:bCs/>
+                <w:color w:val="1F4E79"/>
+                <w:sz w:val="19"/>
+                <w:szCs w:val="19"/>
+              </w:rPr>
+              <w:t xml:space="preserve">What it is</w:t>
+            </w:r>
+          </w:p>
+        </w:tc>
+      </w:tr>
+      <w:tr>
+        <w:tc>
+          <w:tcPr>
+            <w:tcW w:type="dxa" w:w="2400"/>
+            <w:tcMar>
+              <w:top w:type="dxa" w:w="60"/>
+              <w:left w:type="dxa" w:w="100"/>
+              <w:bottom w:type="dxa" w:w="60"/>
+              <w:right w:type="dxa" w:w="100"/>
+            </w:tcMar>
+          </w:tcPr>
+          <w:p>
+            <w:r>
+              <w:rPr>
+                <w:b w:val="false"/>
+                <w:bCs w:val="false"/>
+                <w:color w:val="000000"/>
+                <w:sz w:val="19"/>
+                <w:szCs w:val="19"/>
+              </w:rPr>
+              <w:t xml:space="preserve">Organizations</w:t>
+            </w:r>
+          </w:p>
+        </w:tc>
+        <w:tc>
+          <w:tcPr>
+            <w:tcW w:type="dxa" w:w="6960"/>
+            <w:tcMar>
+              <w:top w:type="dxa" w:w="60"/>
+              <w:left w:type="dxa" w:w="100"/>
+              <w:bottom w:type="dxa" w:w="60"/>
+              <w:right w:type="dxa" w:w="100"/>
+            </w:tcMar>
+          </w:tcPr>
+          <w:p>
+            <w:r>
+              <w:rPr>
+                <w:b w:val="false"/>
+                <w:bCs w:val="false"/>
+                <w:color w:val="000000"/>
+                <w:sz w:val="19"/>
+                <w:szCs w:val="19"/>
+              </w:rPr>
+              <w:t xml:space="preserve">Every internal team or external trading partner participating in file exchange is represented as an Organization, with its own credentials, identifiers, and contacts — configured once, reused across every Flow it participates in.</w:t>
+            </w:r>
+          </w:p>
+        </w:tc>
+      </w:tr>
+      <w:tr>
+        <w:tc>
+          <w:tcPr>
+            <w:tcW w:type="dxa" w:w="2400"/>
+            <w:tcMar>
+              <w:top w:type="dxa" w:w="60"/>
+              <w:left w:type="dxa" w:w="100"/>
+              <w:bottom w:type="dxa" w:w="60"/>
+              <w:right w:type="dxa" w:w="100"/>
+            </w:tcMar>
+          </w:tcPr>
+          <w:p>
+            <w:r>
+              <w:rPr>
+                <w:b w:val="false"/>
+                <w:bCs w:val="false"/>
+                <w:color w:val="000000"/>
+                <w:sz w:val="19"/>
+                <w:szCs w:val="19"/>
+              </w:rPr>
+              <w:t xml:space="preserve">Flows</w:t>
+            </w:r>
+          </w:p>
+        </w:tc>
+        <w:tc>
+          <w:tcPr>
+            <w:tcW w:type="dxa" w:w="6960"/>
+            <w:tcMar>
+              <w:top w:type="dxa" w:w="60"/>
+              <w:left w:type="dxa" w:w="100"/>
+              <w:bottom w:type="dxa" w:w="60"/>
+              <w:right w:type="dxa" w:w="100"/>
+            </w:tcMar>
+          </w:tcPr>
+          <w:p>
+            <w:r>
+              <w:rPr>
+                <w:b w:val="false"/>
+                <w:bCs w:val="false"/>
+                <w:color w:val="000000"/>
+                <w:sz w:val="19"/>
+                <w:szCs w:val="19"/>
+              </w:rPr>
+              <w:t xml:space="preserve">Reusable workflow definitions that move files between endpoints. A single Flow can handle many-to-many endpoint routing, renaming, encryption, and compression. Organizations subscribe to a Flow to join it — no per-partner scripting.</w:t>
+            </w:r>
+          </w:p>
+        </w:tc>
+      </w:tr>
+      <w:tr>
+        <w:tc>
+          <w:tcPr>
+            <w:tcW w:type="dxa" w:w="2400"/>
+            <w:tcMar>
+              <w:top w:type="dxa" w:w="60"/>
+              <w:left w:type="dxa" w:w="100"/>
+              <w:bottom w:type="dxa" w:w="60"/>
+              <w:right w:type="dxa" w:w="100"/>
+            </w:tcMar>
+          </w:tcPr>
+          <w:p>
+            <w:r>
+              <w:rPr>
+                <w:b w:val="false"/>
+                <w:bCs w:val="false"/>
+                <w:color w:val="000000"/>
+                <w:sz w:val="19"/>
+                <w:szCs w:val="19"/>
+              </w:rPr>
+              <w:t xml:space="preserve">Endpoints</w:t>
+            </w:r>
+          </w:p>
+        </w:tc>
+        <w:tc>
+          <w:tcPr>
+            <w:tcW w:type="dxa" w:w="6960"/>
+            <w:tcMar>
+              <w:top w:type="dxa" w:w="60"/>
+              <w:left w:type="dxa" w:w="100"/>
+              <w:bottom w:type="dxa" w:w="60"/>
+              <w:right w:type="dxa" w:w="100"/>
+            </w:tcMar>
+          </w:tcPr>
+          <w:p>
+            <w:r>
+              <w:rPr>
+                <w:b w:val="false"/>
+                <w:bCs w:val="false"/>
+                <w:color w:val="000000"/>
+                <w:sz w:val="19"/>
+                <w:szCs w:val="19"/>
+              </w:rPr>
+              <w:t xml:space="preserve">The source or target locations for a transfer — an SFTP server, an AS2 endpoint, an HTTPS location, or a Boomi process itself.</w:t>
+            </w:r>
+          </w:p>
+        </w:tc>
+      </w:tr>
+    </w:tbl>
+    <w:p>
+      <w:pPr>
+        <w:spacing w:after="100"/>
+      </w:pPr>
+      <w:r>
+        <w:t xml:space="preserve">Participants pick up or drop off files against a Flow via a self-managed portal — the same pattern as a postal service, rather than either party needing to know the other's infrastructure details.</w:t>
+      </w:r>
+    </w:p>
+    <w:p>
+      <w:pPr>
+        <w:pStyle w:val="Heading2"/>
+        <w:spacing w:after="100" w:before="220"/>
+      </w:pPr>
+      <w:r>
+        <w:rPr>
+          <w:color w:val="0F6674"/>
+        </w:rPr>
+        <w:t xml:space="preserve">Two applications, two different jobs</w:t>
+      </w:r>
+    </w:p>
+    <w:tbl>
+      <w:tblPr>
+        <w:tblW w:type="dxa" w:w="9360"/>
+        <w:tblBorders>
+          <w:top w:val="single" w:color="auto" w:sz="4"/>
+          <w:left w:val="single" w:color="auto" w:sz="4"/>
+          <w:bottom w:val="single" w:color="auto" w:sz="4"/>
+          <w:right w:val="single" w:color="auto" w:sz="4"/>
+          <w:insideH w:val="single" w:color="auto" w:sz="4"/>
+          <w:insideV w:val="single" w:color="auto" w:sz="4"/>
+        </w:tblBorders>
+      </w:tblPr>
+      <w:tblGrid>
+        <w:gridCol w:w="2200"/>
+        <w:gridCol w:w="3600"/>
+        <w:gridCol w:w="3560"/>
+      </w:tblGrid>
+      <w:tr>
+        <w:trPr>
+          <w:tblHeader/>
+        </w:trPr>
+        <w:tc>
+          <w:tcPr>
+            <w:tcW w:type="dxa" w:w="2200"/>
+            <w:shd w:fill="DCE6F1" w:val="clear"/>
+            <w:tcMar>
+              <w:top w:type="dxa" w:w="60"/>
+              <w:left w:type="dxa" w:w="100"/>
+              <w:bottom w:type="dxa" w:w="60"/>
+              <w:right w:type="dxa" w:w="100"/>
+            </w:tcMar>
+          </w:tcPr>
+          <w:p>
+            <w:r>
+              <w:rPr>
+                <w:b/>
+                <w:bCs/>
+                <w:color w:val="1F4E79"/>
+                <w:sz w:val="19"/>
+                <w:szCs w:val="19"/>
+              </w:rPr>
+              <w:t xml:space="preserve">Application</w:t>
+            </w:r>
+          </w:p>
+        </w:tc>
+        <w:tc>
+          <w:tcPr>
+            <w:tcW w:type="dxa" w:w="3600"/>
+            <w:shd w:fill="DCE6F1" w:val="clear"/>
+            <w:tcMar>
+              <w:top w:type="dxa" w:w="60"/>
+              <w:left w:type="dxa" w:w="100"/>
+              <w:bottom w:type="dxa" w:w="60"/>
+              <w:right w:type="dxa" w:w="100"/>
+            </w:tcMar>
+          </w:tcPr>
+          <w:p>
+            <w:r>
+              <w:rPr>
+                <w:b/>
+                <w:bCs/>
+                <w:color w:val="1F4E79"/>
+                <w:sz w:val="19"/>
+                <w:szCs w:val="19"/>
+              </w:rPr>
+              <w:t xml:space="preserve">Purpose</w:t>
+            </w:r>
+          </w:p>
+        </w:tc>
+        <w:tc>
+          <w:tcPr>
+            <w:tcW w:type="dxa" w:w="3560"/>
+            <w:shd w:fill="DCE6F1" w:val="clear"/>
+            <w:tcMar>
+              <w:top w:type="dxa" w:w="60"/>
+              <w:left w:type="dxa" w:w="100"/>
+              <w:bottom w:type="dxa" w:w="60"/>
+              <w:right w:type="dxa" w:w="100"/>
+            </w:tcMar>
+          </w:tcPr>
+          <w:p>
+            <w:r>
+              <w:rPr>
+                <w:b/>
+                <w:bCs/>
+                <w:color w:val="1F4E79"/>
+                <w:sz w:val="19"/>
+                <w:szCs w:val="19"/>
+              </w:rPr>
+              <w:t xml:space="preserve">Relevance to this catalogue</w:t>
+            </w:r>
+          </w:p>
+        </w:tc>
+      </w:tr>
+      <w:tr>
+        <w:tc>
+          <w:tcPr>
+            <w:tcW w:type="dxa" w:w="2200"/>
+            <w:tcMar>
+              <w:top w:type="dxa" w:w="60"/>
+              <w:left w:type="dxa" w:w="100"/>
+              <w:bottom w:type="dxa" w:w="60"/>
+              <w:right w:type="dxa" w:w="100"/>
+            </w:tcMar>
+          </w:tcPr>
+          <w:p>
+            <w:r>
+              <w:rPr>
+                <w:b w:val="false"/>
+                <w:bCs w:val="false"/>
+                <w:color w:val="000000"/>
+                <w:sz w:val="19"/>
+                <w:szCs w:val="19"/>
+              </w:rPr>
+              <w:t xml:space="preserve">Automated File Transfer (AFT)</w:t>
+            </w:r>
+          </w:p>
+        </w:tc>
+        <w:tc>
+          <w:tcPr>
+            <w:tcW w:type="dxa" w:w="3600"/>
+            <w:tcMar>
+              <w:top w:type="dxa" w:w="60"/>
+              <w:left w:type="dxa" w:w="100"/>
+              <w:bottom w:type="dxa" w:w="60"/>
+              <w:right w:type="dxa" w:w="100"/>
+            </w:tcMar>
+          </w:tcPr>
+          <w:p>
+            <w:r>
+              <w:rPr>
+                <w:b w:val="false"/>
+                <w:bCs w:val="false"/>
+                <w:color w:val="000000"/>
+                <w:sz w:val="19"/>
+                <w:szCs w:val="19"/>
+              </w:rPr>
+              <w:t xml:space="preserve">System-to-system, scheduled, high-volume file transfer — from basic pickups to advanced multi-step workflows.</w:t>
+            </w:r>
+          </w:p>
+        </w:tc>
+        <w:tc>
+          <w:tcPr>
+            <w:tcW w:type="dxa" w:w="3560"/>
+            <w:tcMar>
+              <w:top w:type="dxa" w:w="60"/>
+              <w:left w:type="dxa" w:w="100"/>
+              <w:bottom w:type="dxa" w:w="60"/>
+              <w:right w:type="dxa" w:w="100"/>
+            </w:tcMar>
+          </w:tcPr>
+          <w:p>
+            <w:r>
+              <w:rPr>
+                <w:b w:val="false"/>
+                <w:bCs w:val="false"/>
+                <w:color w:val="000000"/>
+                <w:sz w:val="19"/>
+                <w:szCs w:val="19"/>
+              </w:rPr>
+              <w:t xml:space="preserve">This is the one that matters for MFT interfaces. AFT is driven from Boomi Integration via the MFT connector, or directly via the AFT APIs.</w:t>
+            </w:r>
+          </w:p>
+        </w:tc>
+      </w:tr>
+      <w:tr>
+        <w:tc>
+          <w:tcPr>
+            <w:tcW w:type="dxa" w:w="2200"/>
+            <w:tcMar>
+              <w:top w:type="dxa" w:w="60"/>
+              <w:left w:type="dxa" w:w="100"/>
+              <w:bottom w:type="dxa" w:w="60"/>
+              <w:right w:type="dxa" w:w="100"/>
+            </w:tcMar>
+          </w:tcPr>
+          <w:p>
+            <w:r>
+              <w:rPr>
+                <w:b w:val="false"/>
+                <w:bCs w:val="false"/>
+                <w:color w:val="000000"/>
+                <w:sz w:val="19"/>
+                <w:szCs w:val="19"/>
+              </w:rPr>
+              <w:t xml:space="preserve">File Sharing (FS)</w:t>
+            </w:r>
+          </w:p>
+        </w:tc>
+        <w:tc>
+          <w:tcPr>
+            <w:tcW w:type="dxa" w:w="3600"/>
+            <w:tcMar>
+              <w:top w:type="dxa" w:w="60"/>
+              <w:left w:type="dxa" w:w="100"/>
+              <w:bottom w:type="dxa" w:w="60"/>
+              <w:right w:type="dxa" w:w="100"/>
+            </w:tcMar>
+          </w:tcPr>
+          <w:p>
+            <w:r>
+              <w:rPr>
+                <w:b w:val="false"/>
+                <w:bCs w:val="false"/>
+                <w:color w:val="000000"/>
+                <w:sz w:val="19"/>
+                <w:szCs w:val="19"/>
+              </w:rPr>
+              <w:t xml:space="preserve">Organization-wide sharing designed for human collaboration, internal and external, with its own user guide, admin guide, and API set.</w:t>
+            </w:r>
+          </w:p>
+        </w:tc>
+        <w:tc>
+          <w:tcPr>
+            <w:tcW w:type="dxa" w:w="3560"/>
+            <w:tcMar>
+              <w:top w:type="dxa" w:w="60"/>
+              <w:left w:type="dxa" w:w="100"/>
+              <w:bottom w:type="dxa" w:w="60"/>
+              <w:right w:type="dxa" w:w="100"/>
+            </w:tcMar>
+          </w:tcPr>
+          <w:p>
+            <w:r>
+              <w:rPr>
+                <w:b w:val="false"/>
+                <w:bCs w:val="false"/>
+                <w:color w:val="000000"/>
+                <w:sz w:val="19"/>
+                <w:szCs w:val="19"/>
+              </w:rPr>
+              <w:t xml:space="preserve">Not the focus here — FS is for people sharing files with people, not scheduled system interfaces.</w:t>
+            </w:r>
+          </w:p>
+        </w:tc>
+      </w:tr>
+    </w:tbl>
+    <w:p>
+      <w:pPr>
+        <w:pStyle w:val="Heading2"/>
+        <w:spacing w:after="100" w:before="220"/>
+      </w:pPr>
+      <w:r>
+        <w:rPr>
+          <w:color w:val="0F6674"/>
+        </w:rPr>
+        <w:t xml:space="preserve">Architecture — two channels behind every Flow</w:t>
+      </w:r>
+    </w:p>
+    <w:tbl>
+      <w:tblPr>
+        <w:tblW w:type="dxa" w:w="9360"/>
+        <w:tblBorders>
+          <w:top w:val="single" w:color="auto" w:sz="4"/>
+          <w:left w:val="single" w:color="auto" w:sz="4"/>
+          <w:bottom w:val="single" w:color="auto" w:sz="4"/>
+          <w:right w:val="single" w:color="auto" w:sz="4"/>
+          <w:insideH w:val="single" w:color="auto" w:sz="4"/>
+          <w:insideV w:val="single" w:color="auto" w:sz="4"/>
+        </w:tblBorders>
+      </w:tblPr>
+      <w:tblGrid>
+        <w:gridCol w:w="2400"/>
+        <w:gridCol w:w="6960"/>
+      </w:tblGrid>
+      <w:tr>
+        <w:trPr>
+          <w:tblHeader/>
+        </w:trPr>
+        <w:tc>
+          <w:tcPr>
+            <w:tcW w:type="dxa" w:w="2400"/>
+            <w:shd w:fill="DCE6F1" w:val="clear"/>
+            <w:tcMar>
+              <w:top w:type="dxa" w:w="60"/>
+              <w:left w:type="dxa" w:w="100"/>
+              <w:bottom w:type="dxa" w:w="60"/>
+              <w:right w:type="dxa" w:w="100"/>
+            </w:tcMar>
+          </w:tcPr>
+          <w:p>
+            <w:r>
+              <w:rPr>
+                <w:b/>
+                <w:bCs/>
+                <w:color w:val="1F4E79"/>
+                <w:sz w:val="19"/>
+                <w:szCs w:val="19"/>
+              </w:rPr>
+              <w:t xml:space="preserve">Channel</w:t>
+            </w:r>
+          </w:p>
+        </w:tc>
+        <w:tc>
+          <w:tcPr>
+            <w:tcW w:type="dxa" w:w="6960"/>
+            <w:shd w:fill="DCE6F1" w:val="clear"/>
+            <w:tcMar>
+              <w:top w:type="dxa" w:w="60"/>
+              <w:left w:type="dxa" w:w="100"/>
+              <w:bottom w:type="dxa" w:w="60"/>
+              <w:right w:type="dxa" w:w="100"/>
+            </w:tcMar>
+          </w:tcPr>
+          <w:p>
+            <w:r>
+              <w:rPr>
+                <w:b/>
+                <w:bCs/>
+                <w:color w:val="1F4E79"/>
+                <w:sz w:val="19"/>
+                <w:szCs w:val="19"/>
+              </w:rPr>
+              <w:t xml:space="preserve">Detail</w:t>
+            </w:r>
+          </w:p>
+        </w:tc>
+      </w:tr>
+      <w:tr>
+        <w:tc>
+          <w:tcPr>
+            <w:tcW w:type="dxa" w:w="2400"/>
+            <w:tcMar>
+              <w:top w:type="dxa" w:w="60"/>
+              <w:left w:type="dxa" w:w="100"/>
+              <w:bottom w:type="dxa" w:w="60"/>
+              <w:right w:type="dxa" w:w="100"/>
+            </w:tcMar>
+          </w:tcPr>
+          <w:p>
+            <w:r>
+              <w:rPr>
+                <w:b w:val="false"/>
+                <w:bCs w:val="false"/>
+                <w:color w:val="000000"/>
+                <w:sz w:val="19"/>
+                <w:szCs w:val="19"/>
+              </w:rPr>
+              <w:t xml:space="preserve">Management Channel</w:t>
+            </w:r>
+          </w:p>
+        </w:tc>
+        <w:tc>
+          <w:tcPr>
+            <w:tcW w:type="dxa" w:w="6960"/>
+            <w:tcMar>
+              <w:top w:type="dxa" w:w="60"/>
+              <w:left w:type="dxa" w:w="100"/>
+              <w:bottom w:type="dxa" w:w="60"/>
+              <w:right w:type="dxa" w:w="100"/>
+            </w:tcMar>
+          </w:tcPr>
+          <w:p>
+            <w:r>
+              <w:rPr>
+                <w:b w:val="false"/>
+                <w:bCs w:val="false"/>
+                <w:color w:val="000000"/>
+                <w:sz w:val="19"/>
+                <w:szCs w:val="19"/>
+              </w:rPr>
+              <w:t xml:space="preserve">Flow and endpoint definitions, partner credentials, tracking, audit trail, and proof of delivery — runs entirely in Boomi's cloud, with a partner self-service onboarding portal (subscribe to a Flow, add endpoints, manage credentials — no deployments needed).</w:t>
+            </w:r>
+          </w:p>
+        </w:tc>
+      </w:tr>
+      <w:tr>
+        <w:tc>
+          <w:tcPr>
+            <w:tcW w:type="dxa" w:w="2400"/>
+            <w:tcMar>
+              <w:top w:type="dxa" w:w="60"/>
+              <w:left w:type="dxa" w:w="100"/>
+              <w:bottom w:type="dxa" w:w="60"/>
+              <w:right w:type="dxa" w:w="100"/>
+            </w:tcMar>
+          </w:tcPr>
+          <w:p>
+            <w:r>
+              <w:rPr>
+                <w:b w:val="false"/>
+                <w:bCs w:val="false"/>
+                <w:color w:val="000000"/>
+                <w:sz w:val="19"/>
+                <w:szCs w:val="19"/>
+              </w:rPr>
+              <w:t xml:space="preserve">Data Channel</w:t>
+            </w:r>
+          </w:p>
+        </w:tc>
+        <w:tc>
+          <w:tcPr>
+            <w:tcW w:type="dxa" w:w="6960"/>
+            <w:tcMar>
+              <w:top w:type="dxa" w:w="60"/>
+              <w:left w:type="dxa" w:w="100"/>
+              <w:bottom w:type="dxa" w:w="60"/>
+              <w:right w:type="dxa" w:w="100"/>
+            </w:tcMar>
+          </w:tcPr>
+          <w:p>
+            <w:r>
+              <w:rPr>
+                <w:b w:val="false"/>
+                <w:bCs w:val="false"/>
+                <w:color w:val="000000"/>
+                <w:sz w:val="19"/>
+                <w:szCs w:val="19"/>
+              </w:rPr>
+              <w:t xml:space="preserve">The actual file payload transfer. Files are securely stored until delivered — with retry, auto-resume, and guaranteed delivery even across a network interruption. Encryption applies at rest, in transit, and at the file level.</w:t>
+            </w:r>
+          </w:p>
+        </w:tc>
+      </w:tr>
+    </w:tbl>
+    <w:p>
+      <w:pPr>
+        <w:spacing w:after="100"/>
+      </w:pPr>
+      <w:r>
+        <w:t xml:space="preserve">A distributed hybrid architecture option keeps the control plane in Boomi's cloud while letting large internal file transfers stay on the customer's own network — useful where data residency or network policy is a concern even though governance stays centralised.</w:t>
+      </w:r>
+    </w:p>
+    <w:p>
+      <w:pPr>
+        <w:pStyle w:val="Heading2"/>
+        <w:spacing w:after="100" w:before="220"/>
+      </w:pPr>
+      <w:r>
+        <w:rPr>
+          <w:color w:val="0F6674"/>
+        </w:rPr>
+        <w:t xml:space="preserve">How a Boomi Integration process talks to it — the MFT connector</w:t>
+      </w:r>
+    </w:p>
+    <w:p>
+      <w:pPr>
+        <w:pStyle w:val="ListParagraph"/>
+        <w:numPr>
+          <w:ilvl w:val="0"/>
+          <w:numId w:val="2"/>
+        </w:numPr>
+        <w:spacing w:after="60"/>
+      </w:pPr>
+      <w:r>
+        <w:rPr>
+          <w:b/>
+          <w:bCs/>
+        </w:rPr>
+        <w:t xml:space="preserve">Connection: </w:t>
+      </w:r>
+      <w:r>
+        <w:t xml:space="preserve">Connection component: API URL, SiteURL, and SiteKey identify and authenticate to your MFT instance.</w:t>
+      </w:r>
+    </w:p>
+    <w:p>
+      <w:pPr>
+        <w:pStyle w:val="ListParagraph"/>
+        <w:numPr>
+          <w:ilvl w:val="0"/>
+          <w:numId w:val="2"/>
+        </w:numPr>
+        <w:spacing w:after="60"/>
+      </w:pPr>
+      <w:r>
+        <w:rPr>
+          <w:b/>
+          <w:bCs/>
+        </w:rPr>
+        <w:t xml:space="preserve">Operation: </w:t>
+      </w:r>
+      <w:r>
+        <w:t xml:space="preserve">Operation component: defines the Flow Secret to target (or leaves it blank and sets it dynamically via a Set Properties step, so one reusable operation can serve many Flows).</w:t>
+      </w:r>
+    </w:p>
+    <w:p>
+      <w:pPr>
+        <w:pStyle w:val="ListParagraph"/>
+        <w:numPr>
+          <w:ilvl w:val="0"/>
+          <w:numId w:val="2"/>
+        </w:numPr>
+        <w:spacing w:after="60"/>
+      </w:pPr>
+      <w:r>
+        <w:rPr>
+          <w:b/>
+          <w:bCs/>
+        </w:rPr>
+        <w:t xml:space="preserve">GET: </w:t>
+      </w:r>
+      <w:r>
+        <w:t xml:space="preserve">an inbound action that picks up a file from a Flow, returning the file in binary with its Filename and File Code as document properties.</w:t>
+      </w:r>
+    </w:p>
+    <w:p>
+      <w:pPr>
+        <w:pStyle w:val="ListParagraph"/>
+        <w:numPr>
+          <w:ilvl w:val="0"/>
+          <w:numId w:val="2"/>
+        </w:numPr>
+        <w:spacing w:after="60"/>
+      </w:pPr>
+      <w:r>
+        <w:rPr>
+          <w:b/>
+          <w:bCs/>
+        </w:rPr>
+        <w:t xml:space="preserve">CREATE: </w:t>
+      </w:r>
+      <w:r>
+        <w:t xml:space="preserve">an outbound action that drops a file off into a Flow, uploaded in chunks with no size limit.</w:t>
+      </w:r>
+    </w:p>
+    <w:p>
+      <w:pPr>
+        <w:pStyle w:val="ListParagraph"/>
+        <w:numPr>
+          <w:ilvl w:val="0"/>
+          <w:numId w:val="2"/>
+        </w:numPr>
+        <w:spacing w:after="60"/>
+      </w:pPr>
+      <w:r>
+        <w:rPr>
+          <w:b/>
+          <w:bCs/>
+        </w:rPr>
+        <w:t xml:space="preserve">CREATE (Type=Exception): </w:t>
+      </w:r>
+      <w:r>
+        <w:t xml:space="preserve">posts aggregated exception information back into MFT against the original File Code, so a failure detected inside a Boomi process is visible in MFT's own tracking, not just in Boomi's.</w:t>
+      </w:r>
+    </w:p>
+    <w:p>
+      <w:pPr>
+        <w:pStyle w:val="Heading2"/>
+        <w:spacing w:after="100" w:before="220"/>
+      </w:pPr>
+      <w:r>
+        <w:rPr>
+          <w:color w:val="0F6674"/>
+        </w:rPr>
+        <w:t xml:space="preserve">Monitoring, alerts, and error notification (native)</w:t>
+      </w:r>
+    </w:p>
+    <w:p>
+      <w:pPr>
+        <w:pStyle w:val="ListParagraph"/>
+        <w:numPr>
+          <w:ilvl w:val="0"/>
+          <w:numId w:val="2"/>
+        </w:numPr>
+        <w:spacing w:after="60"/>
+      </w:pPr>
+      <w:r>
+        <w:rPr>
+          <w:b/>
+          <w:bCs/>
+        </w:rPr>
+        <w:t xml:space="preserve">Visibility: </w:t>
+      </w:r>
+      <w:r>
+        <w:t xml:space="preserve">a 'single pane of glass' Activity Page gives real-time, end-to-end visibility across every Organization, Endpoint, and Flow — not just the ones a given Boomi process touches.</w:t>
+      </w:r>
+    </w:p>
+    <w:p>
+      <w:pPr>
+        <w:pStyle w:val="ListParagraph"/>
+        <w:numPr>
+          <w:ilvl w:val="0"/>
+          <w:numId w:val="2"/>
+        </w:numPr>
+        <w:spacing w:after="60"/>
+      </w:pPr>
+      <w:r>
+        <w:rPr>
+          <w:b/>
+          <w:bCs/>
+        </w:rPr>
+        <w:t xml:space="preserve">Alerts: </w:t>
+      </w:r>
+      <w:r>
+        <w:t xml:space="preserve">real-time alerts fire on failed or stalled transfers independent of the calling Boomi process — so a failure is visible even if the triggering process never runs its own error branch.</w:t>
+      </w:r>
+    </w:p>
+    <w:p>
+      <w:pPr>
+        <w:pStyle w:val="ListParagraph"/>
+        <w:numPr>
+          <w:ilvl w:val="0"/>
+          <w:numId w:val="2"/>
+        </w:numPr>
+        <w:spacing w:after="60"/>
+      </w:pPr>
+      <w:r>
+        <w:rPr>
+          <w:b/>
+          <w:bCs/>
+        </w:rPr>
+        <w:t xml:space="preserve">Traceability: </w:t>
+      </w:r>
+      <w:r>
+        <w:t xml:space="preserve">each alert links directly to the related Organization, Endpoint, or Flow page for investigation — the native equivalent of the execution-ID deep link described for Option A.</w:t>
+      </w:r>
+    </w:p>
+    <w:p>
+      <w:pPr>
+        <w:pStyle w:val="ListParagraph"/>
+        <w:numPr>
+          <w:ilvl w:val="0"/>
+          <w:numId w:val="2"/>
+        </w:numPr>
+        <w:spacing w:after="60"/>
+      </w:pPr>
+      <w:r>
+        <w:rPr>
+          <w:b/>
+          <w:bCs/>
+        </w:rPr>
+        <w:t xml:space="preserve">Triage: </w:t>
+      </w:r>
+      <w:r>
+        <w:t xml:space="preserve">alerts are triaged explicitly: an admin can Acknowledge or Clear each one from the Activity Page, keeping the feed a true outstanding-issues list.</w:t>
+      </w:r>
+    </w:p>
+    <w:p>
+      <w:pPr>
+        <w:pStyle w:val="ListParagraph"/>
+        <w:numPr>
+          <w:ilvl w:val="0"/>
+          <w:numId w:val="2"/>
+        </w:numPr>
+        <w:spacing w:after="60"/>
+      </w:pPr>
+      <w:r>
+        <w:rPr>
+          <w:b/>
+          <w:bCs/>
+        </w:rPr>
+        <w:t xml:space="preserve">Extensibility: </w:t>
+      </w:r>
+      <w:r>
+        <w:t xml:space="preserve">because every GUI function has a matching API, alerts and their statuses can also be pulled into an external ticketing or monitoring system.</w:t>
+      </w:r>
+    </w:p>
+    <w:p>
+      <w:pPr>
+        <w:pStyle w:val="Heading2"/>
+        <w:spacing w:after="100" w:before="220"/>
+      </w:pPr>
+      <w:r>
+        <w:rPr>
+          <w:color w:val="0F6674"/>
+        </w:rPr>
+        <w:t xml:space="preserve">Security, compliance, and scale</w:t>
+      </w:r>
+    </w:p>
+    <w:tbl>
+      <w:tblPr>
+        <w:tblW w:type="dxa" w:w="9360"/>
+        <w:tblBorders>
+          <w:top w:val="single" w:color="auto" w:sz="4"/>
+          <w:left w:val="single" w:color="auto" w:sz="4"/>
+          <w:bottom w:val="single" w:color="auto" w:sz="4"/>
+          <w:right w:val="single" w:color="auto" w:sz="4"/>
+          <w:insideH w:val="single" w:color="auto" w:sz="4"/>
+          <w:insideV w:val="single" w:color="auto" w:sz="4"/>
+        </w:tblBorders>
+      </w:tblPr>
+      <w:tblGrid>
+        <w:gridCol w:w="2000"/>
+        <w:gridCol w:w="7360"/>
+      </w:tblGrid>
+      <w:tr>
+        <w:trPr>
+          <w:tblHeader/>
+        </w:trPr>
+        <w:tc>
+          <w:tcPr>
+            <w:tcW w:type="dxa" w:w="2000"/>
+            <w:shd w:fill="DCE6F1" w:val="clear"/>
+            <w:tcMar>
+              <w:top w:type="dxa" w:w="60"/>
+              <w:left w:type="dxa" w:w="100"/>
+              <w:bottom w:type="dxa" w:w="60"/>
+              <w:right w:type="dxa" w:w="100"/>
+            </w:tcMar>
+          </w:tcPr>
+          <w:p>
+            <w:r>
+              <w:rPr>
+                <w:b/>
+                <w:bCs/>
+                <w:color w:val="1F4E79"/>
+                <w:sz w:val="19"/>
+                <w:szCs w:val="19"/>
+              </w:rPr>
+              <w:t xml:space="preserve">Area</w:t>
+            </w:r>
+          </w:p>
+        </w:tc>
+        <w:tc>
+          <w:tcPr>
+            <w:tcW w:type="dxa" w:w="7360"/>
+            <w:shd w:fill="DCE6F1" w:val="clear"/>
+            <w:tcMar>
+              <w:top w:type="dxa" w:w="60"/>
+              <w:left w:type="dxa" w:w="100"/>
+              <w:bottom w:type="dxa" w:w="60"/>
+              <w:right w:type="dxa" w:w="100"/>
+            </w:tcMar>
+          </w:tcPr>
+          <w:p>
+            <w:r>
+              <w:rPr>
+                <w:b/>
+                <w:bCs/>
+                <w:color w:val="1F4E79"/>
+                <w:sz w:val="19"/>
+                <w:szCs w:val="19"/>
+              </w:rPr>
+              <w:t xml:space="preserve">Detail</w:t>
+            </w:r>
+          </w:p>
+        </w:tc>
+      </w:tr>
+      <w:tr>
+        <w:tc>
+          <w:tcPr>
+            <w:tcW w:type="dxa" w:w="2000"/>
+            <w:tcMar>
+              <w:top w:type="dxa" w:w="60"/>
+              <w:left w:type="dxa" w:w="100"/>
+              <w:bottom w:type="dxa" w:w="60"/>
+              <w:right w:type="dxa" w:w="100"/>
+            </w:tcMar>
+          </w:tcPr>
+          <w:p>
+            <w:r>
+              <w:rPr>
+                <w:b w:val="false"/>
+                <w:bCs w:val="false"/>
+                <w:color w:val="000000"/>
+                <w:sz w:val="19"/>
+                <w:szCs w:val="19"/>
+              </w:rPr>
+              <w:t xml:space="preserve">Security</w:t>
+            </w:r>
+          </w:p>
+        </w:tc>
+        <w:tc>
+          <w:tcPr>
+            <w:tcW w:type="dxa" w:w="7360"/>
+            <w:tcMar>
+              <w:top w:type="dxa" w:w="60"/>
+              <w:left w:type="dxa" w:w="100"/>
+              <w:bottom w:type="dxa" w:w="60"/>
+              <w:right w:type="dxa" w:w="100"/>
+            </w:tcMar>
+          </w:tcPr>
+          <w:p>
+            <w:r>
+              <w:rPr>
+                <w:b w:val="false"/>
+                <w:bCs w:val="false"/>
+                <w:color w:val="000000"/>
+                <w:sz w:val="19"/>
+                <w:szCs w:val="19"/>
+              </w:rPr>
+              <w:t xml:space="preserve">Encryption at rest, in transit, and at the file level; multi-factor authentication; least-privilege role-based access controls; zero-trust architecture.</w:t>
+            </w:r>
+          </w:p>
+        </w:tc>
+      </w:tr>
+      <w:tr>
+        <w:tc>
+          <w:tcPr>
+            <w:tcW w:type="dxa" w:w="2000"/>
+            <w:tcMar>
+              <w:top w:type="dxa" w:w="60"/>
+              <w:left w:type="dxa" w:w="100"/>
+              <w:bottom w:type="dxa" w:w="60"/>
+              <w:right w:type="dxa" w:w="100"/>
+            </w:tcMar>
+          </w:tcPr>
+          <w:p>
+            <w:r>
+              <w:rPr>
+                <w:b w:val="false"/>
+                <w:bCs w:val="false"/>
+                <w:color w:val="000000"/>
+                <w:sz w:val="19"/>
+                <w:szCs w:val="19"/>
+              </w:rPr>
+              <w:t xml:space="preserve">Compliance</w:t>
+            </w:r>
+          </w:p>
+        </w:tc>
+        <w:tc>
+          <w:tcPr>
+            <w:tcW w:type="dxa" w:w="7360"/>
+            <w:tcMar>
+              <w:top w:type="dxa" w:w="60"/>
+              <w:left w:type="dxa" w:w="100"/>
+              <w:bottom w:type="dxa" w:w="60"/>
+              <w:right w:type="dxa" w:w="100"/>
+            </w:tcMar>
+          </w:tcPr>
+          <w:p>
+            <w:r>
+              <w:rPr>
+                <w:b w:val="false"/>
+                <w:bCs w:val="false"/>
+                <w:color w:val="000000"/>
+                <w:sz w:val="19"/>
+                <w:szCs w:val="19"/>
+              </w:rPr>
+              <w:t xml:space="preserve">Full audit logging with proof of delivery and sender authenticity; alignment with frameworks such as SOC 2; supports regulatory file-exchange requirements in financial services, healthcare, and the public sector.</w:t>
+            </w:r>
+          </w:p>
+        </w:tc>
+      </w:tr>
+      <w:tr>
+        <w:tc>
+          <w:tcPr>
+            <w:tcW w:type="dxa" w:w="2000"/>
+            <w:tcMar>
+              <w:top w:type="dxa" w:w="60"/>
+              <w:left w:type="dxa" w:w="100"/>
+              <w:bottom w:type="dxa" w:w="60"/>
+              <w:right w:type="dxa" w:w="100"/>
+            </w:tcMar>
+          </w:tcPr>
+          <w:p>
+            <w:r>
+              <w:rPr>
+                <w:b w:val="false"/>
+                <w:bCs w:val="false"/>
+                <w:color w:val="000000"/>
+                <w:sz w:val="19"/>
+                <w:szCs w:val="19"/>
+              </w:rPr>
+              <w:t xml:space="preserve">Scale</w:t>
+            </w:r>
+          </w:p>
+        </w:tc>
+        <w:tc>
+          <w:tcPr>
+            <w:tcW w:type="dxa" w:w="7360"/>
+            <w:tcMar>
+              <w:top w:type="dxa" w:w="60"/>
+              <w:left w:type="dxa" w:w="100"/>
+              <w:bottom w:type="dxa" w:w="60"/>
+              <w:right w:type="dxa" w:w="100"/>
+            </w:tcMar>
+          </w:tcPr>
+          <w:p>
+            <w:r>
+              <w:rPr>
+                <w:b w:val="false"/>
+                <w:bCs w:val="false"/>
+                <w:color w:val="000000"/>
+                <w:sz w:val="19"/>
+                <w:szCs w:val="19"/>
+              </w:rPr>
+              <w:t xml:space="preserve">Distributed, cloud-native microservices with automatic capacity scaling; processes millions of files per day; no imposed size limit on an individual transfer.</w:t>
+            </w:r>
+          </w:p>
+        </w:tc>
+      </w:tr>
+      <w:tr>
+        <w:tc>
+          <w:tcPr>
+            <w:tcW w:type="dxa" w:w="2000"/>
+            <w:tcMar>
+              <w:top w:type="dxa" w:w="60"/>
+              <w:left w:type="dxa" w:w="100"/>
+              <w:bottom w:type="dxa" w:w="60"/>
+              <w:right w:type="dxa" w:w="100"/>
+            </w:tcMar>
+          </w:tcPr>
+          <w:p>
+            <w:r>
+              <w:rPr>
+                <w:b w:val="false"/>
+                <w:bCs w:val="false"/>
+                <w:color w:val="000000"/>
+                <w:sz w:val="19"/>
+                <w:szCs w:val="19"/>
+              </w:rPr>
+              <w:t xml:space="preserve">Licensing</w:t>
+            </w:r>
+          </w:p>
+        </w:tc>
+        <w:tc>
+          <w:tcPr>
+            <w:tcW w:type="dxa" w:w="7360"/>
+            <w:tcMar>
+              <w:top w:type="dxa" w:w="60"/>
+              <w:left w:type="dxa" w:w="100"/>
+              <w:bottom w:type="dxa" w:w="60"/>
+              <w:right w:type="dxa" w:w="100"/>
+            </w:tcMar>
+          </w:tcPr>
+          <w:p>
+            <w:r>
+              <w:rPr>
+                <w:b w:val="false"/>
+                <w:bCs w:val="false"/>
+                <w:color w:val="000000"/>
+                <w:sz w:val="19"/>
+                <w:szCs w:val="19"/>
+              </w:rPr>
+              <w:t xml:space="preserve">Usage-based pricing; full feature and API parity regardless of tier; purchased as an add-on to the Boomi platform via your Boomi Account Executive.</w:t>
+            </w:r>
+          </w:p>
+        </w:tc>
+      </w:tr>
+    </w:tbl>
+    <w:p>
+      <w:pPr>
+        <w:spacing w:after="100"/>
+      </w:pPr>
+      <w:r>
+        <w:rPr>
+          <w:b/>
+          <w:bCs/>
+        </w:rPr>
+        <w:t xml:space="preserve">Where this leaves the choice for this programme: AFT is the relevant application (not File Sharing), and its connector maps directly onto the same Pickup/Dropoff/Exception vocabulary this catalogue already uses for Option A. The practical trade remains licensing and control — a hand-built Try/Catch chain costs nothing extra and stays fully config-driven and approval-gated; Boomi MFT costs a separate line item but removes the need to build and maintain retry, auto-resume, partner onboarding, and alerting logic by hand, and gives external trading partners true self-service.</w:t>
       </w:r>
     </w:p>
     <w:p>

</xml_diff>

<commit_message>
Add Product Vision section (§1a): vision statement, guiding principles, success signals, and horizon
</commit_message>
<xml_diff>
--- a/assets/intelligrator-mft-product-specification.docx
+++ b/assets/intelligrator-mft-product-specification.docx
@@ -189,6 +189,767 @@
       </w:pPr>
       <w:r>
         <w:t xml:space="preserve">Out of scope for v1: event-triggered (file-arrival) transfers, in-flight transformation, and auto-promotion beyond Dev.</w:t>
+      </w:r>
+    </w:p>
+    <w:p>
+      <w:pPr>
+        <w:pStyle w:val="Heading1"/>
+        <w:spacing w:after="140" w:before="300"/>
+      </w:pPr>
+      <w:r>
+        <w:rPr>
+          <w:color w:val="1F4E79"/>
+        </w:rPr>
+        <w:t xml:space="preserve">1a. Product Vision</w:t>
+      </w:r>
+    </w:p>
+    <w:p>
+      <w:pPr>
+        <w:spacing w:after="100"/>
+      </w:pPr>
+      <w:r>
+        <w:rPr>
+          <w:b/>
+          <w:bCs/>
+        </w:rPr>
+        <w:t xml:space="preserve">Vision statement: For integration teams and business requesters across the tax authority's technology estate who need managed file transfer interfaces to move data reliably between systems, Intelligrator is a self-service MFT provisioning portal that turns a multi-week engineering engagement into a five-minute request and a five-minute automated build. Unlike the current model — where every interface demands manual requirements-gathering, manual Boomi development, and manual deployment — Intelligrator validates connectivity, prevents duplication, and provisions the interface automatically the moment it's approved, with zero hand-written integration code per interface.</w:t>
+      </w:r>
+    </w:p>
+    <w:p>
+      <w:pPr>
+        <w:pStyle w:val="Heading2"/>
+        <w:spacing w:after="100" w:before="220"/>
+      </w:pPr>
+      <w:r>
+        <w:rPr>
+          <w:color w:val="0F6674"/>
+        </w:rPr>
+        <w:t xml:space="preserve">The problem worth solving</w:t>
+      </w:r>
+    </w:p>
+    <w:p>
+      <w:pPr>
+        <w:spacing w:after="100"/>
+      </w:pPr>
+      <w:r>
+        <w:t xml:space="preserve">Every new file-transfer interface today is a bespoke engineering project: someone gathers requirements informally, an engineer hand-builds a Boomi process, testing happens late, and the requester finds out whether it actually works only after delivery. That's slow, inconsistent across engineers, invisible to the business while it's in flight, and it doesn't scale as the WebMethods/ChRIS estate migrates onto Boomi.</w:t>
+      </w:r>
+    </w:p>
+    <w:p>
+      <w:pPr>
+        <w:pStyle w:val="Heading2"/>
+        <w:spacing w:after="100" w:before="220"/>
+      </w:pPr>
+      <w:r>
+        <w:rPr>
+          <w:color w:val="0F6674"/>
+        </w:rPr>
+        <w:t xml:space="preserve">Why now</w:t>
+      </w:r>
+    </w:p>
+    <w:p>
+      <w:pPr>
+        <w:spacing w:after="100"/>
+      </w:pPr>
+      <w:r>
+        <w:t xml:space="preserve">The platform is already moving toward Boomi iPaaS under a strangler-fig migration. That only pays off if new interfaces stop being built one bespoke process at a time. Intelligrator is the mechanism that makes the config-driven, generic-engine architectural decision (one engine process, each interface a config row — Section 8) real for the people requesting interfaces, not just the architecture diagram.</w:t>
+      </w:r>
+    </w:p>
+    <w:p>
+      <w:pPr>
+        <w:pStyle w:val="Heading2"/>
+        <w:spacing w:after="100" w:before="220"/>
+      </w:pPr>
+      <w:r>
+        <w:rPr>
+          <w:color w:val="0F6674"/>
+        </w:rPr>
+        <w:t xml:space="preserve">Guiding principles</w:t>
+      </w:r>
+    </w:p>
+    <w:tbl>
+      <w:tblPr>
+        <w:tblW w:type="dxa" w:w="9360"/>
+        <w:tblBorders>
+          <w:top w:val="single" w:color="auto" w:sz="4"/>
+          <w:left w:val="single" w:color="auto" w:sz="4"/>
+          <w:bottom w:val="single" w:color="auto" w:sz="4"/>
+          <w:right w:val="single" w:color="auto" w:sz="4"/>
+          <w:insideH w:val="single" w:color="auto" w:sz="4"/>
+          <w:insideV w:val="single" w:color="auto" w:sz="4"/>
+        </w:tblBorders>
+      </w:tblPr>
+      <w:tblGrid>
+        <w:gridCol w:w="500"/>
+        <w:gridCol w:w="2800"/>
+        <w:gridCol w:w="6060"/>
+      </w:tblGrid>
+      <w:tr>
+        <w:trPr>
+          <w:tblHeader/>
+        </w:trPr>
+        <w:tc>
+          <w:tcPr>
+            <w:tcW w:type="dxa" w:w="500"/>
+            <w:shd w:fill="DCE6F1" w:val="clear"/>
+            <w:tcMar>
+              <w:top w:type="dxa" w:w="60"/>
+              <w:left w:type="dxa" w:w="100"/>
+              <w:bottom w:type="dxa" w:w="60"/>
+              <w:right w:type="dxa" w:w="100"/>
+            </w:tcMar>
+          </w:tcPr>
+          <w:p>
+            <w:r>
+              <w:rPr>
+                <w:b/>
+                <w:bCs/>
+                <w:color w:val="1F4E79"/>
+                <w:sz w:val="19"/>
+                <w:szCs w:val="19"/>
+              </w:rPr>
+              <w:t xml:space="preserve">#</w:t>
+            </w:r>
+          </w:p>
+        </w:tc>
+        <w:tc>
+          <w:tcPr>
+            <w:tcW w:type="dxa" w:w="2800"/>
+            <w:shd w:fill="DCE6F1" w:val="clear"/>
+            <w:tcMar>
+              <w:top w:type="dxa" w:w="60"/>
+              <w:left w:type="dxa" w:w="100"/>
+              <w:bottom w:type="dxa" w:w="60"/>
+              <w:right w:type="dxa" w:w="100"/>
+            </w:tcMar>
+          </w:tcPr>
+          <w:p>
+            <w:r>
+              <w:rPr>
+                <w:b/>
+                <w:bCs/>
+                <w:color w:val="1F4E79"/>
+                <w:sz w:val="19"/>
+                <w:szCs w:val="19"/>
+              </w:rPr>
+              <w:t xml:space="preserve">Principle</w:t>
+            </w:r>
+          </w:p>
+        </w:tc>
+        <w:tc>
+          <w:tcPr>
+            <w:tcW w:type="dxa" w:w="6060"/>
+            <w:shd w:fill="DCE6F1" w:val="clear"/>
+            <w:tcMar>
+              <w:top w:type="dxa" w:w="60"/>
+              <w:left w:type="dxa" w:w="100"/>
+              <w:bottom w:type="dxa" w:w="60"/>
+              <w:right w:type="dxa" w:w="100"/>
+            </w:tcMar>
+          </w:tcPr>
+          <w:p>
+            <w:r>
+              <w:rPr>
+                <w:b/>
+                <w:bCs/>
+                <w:color w:val="1F4E79"/>
+                <w:sz w:val="19"/>
+                <w:szCs w:val="19"/>
+              </w:rPr>
+              <w:t xml:space="preserve">What it means in practice</w:t>
+            </w:r>
+          </w:p>
+        </w:tc>
+      </w:tr>
+      <w:tr>
+        <w:tc>
+          <w:tcPr>
+            <w:tcW w:type="dxa" w:w="500"/>
+            <w:tcMar>
+              <w:top w:type="dxa" w:w="60"/>
+              <w:left w:type="dxa" w:w="100"/>
+              <w:bottom w:type="dxa" w:w="60"/>
+              <w:right w:type="dxa" w:w="100"/>
+            </w:tcMar>
+          </w:tcPr>
+          <w:p>
+            <w:r>
+              <w:rPr>
+                <w:b w:val="false"/>
+                <w:bCs w:val="false"/>
+                <w:color w:val="000000"/>
+                <w:sz w:val="19"/>
+                <w:szCs w:val="19"/>
+              </w:rPr>
+              <w:t xml:space="preserve">1</w:t>
+            </w:r>
+          </w:p>
+        </w:tc>
+        <w:tc>
+          <w:tcPr>
+            <w:tcW w:type="dxa" w:w="2800"/>
+            <w:tcMar>
+              <w:top w:type="dxa" w:w="60"/>
+              <w:left w:type="dxa" w:w="100"/>
+              <w:bottom w:type="dxa" w:w="60"/>
+              <w:right w:type="dxa" w:w="100"/>
+            </w:tcMar>
+          </w:tcPr>
+          <w:p>
+            <w:r>
+              <w:rPr>
+                <w:b w:val="false"/>
+                <w:bCs w:val="false"/>
+                <w:color w:val="000000"/>
+                <w:sz w:val="19"/>
+                <w:szCs w:val="19"/>
+              </w:rPr>
+              <w:t xml:space="preserve">Configuration over construction</w:t>
+            </w:r>
+          </w:p>
+        </w:tc>
+        <w:tc>
+          <w:tcPr>
+            <w:tcW w:type="dxa" w:w="6060"/>
+            <w:tcMar>
+              <w:top w:type="dxa" w:w="60"/>
+              <w:left w:type="dxa" w:w="100"/>
+              <w:bottom w:type="dxa" w:w="60"/>
+              <w:right w:type="dxa" w:w="100"/>
+            </w:tcMar>
+          </w:tcPr>
+          <w:p>
+            <w:r>
+              <w:rPr>
+                <w:b w:val="false"/>
+                <w:bCs w:val="false"/>
+                <w:color w:val="000000"/>
+                <w:sz w:val="19"/>
+                <w:szCs w:val="19"/>
+              </w:rPr>
+              <w:t xml:space="preserve">Approval creates a config row, not a new component. This is the one architectural bet the whole product stands on.</w:t>
+            </w:r>
+          </w:p>
+        </w:tc>
+      </w:tr>
+      <w:tr>
+        <w:tc>
+          <w:tcPr>
+            <w:tcW w:type="dxa" w:w="500"/>
+            <w:tcMar>
+              <w:top w:type="dxa" w:w="60"/>
+              <w:left w:type="dxa" w:w="100"/>
+              <w:bottom w:type="dxa" w:w="60"/>
+              <w:right w:type="dxa" w:w="100"/>
+            </w:tcMar>
+          </w:tcPr>
+          <w:p>
+            <w:r>
+              <w:rPr>
+                <w:b w:val="false"/>
+                <w:bCs w:val="false"/>
+                <w:color w:val="000000"/>
+                <w:sz w:val="19"/>
+                <w:szCs w:val="19"/>
+              </w:rPr>
+              <w:t xml:space="preserve">2</w:t>
+            </w:r>
+          </w:p>
+        </w:tc>
+        <w:tc>
+          <w:tcPr>
+            <w:tcW w:type="dxa" w:w="2800"/>
+            <w:tcMar>
+              <w:top w:type="dxa" w:w="60"/>
+              <w:left w:type="dxa" w:w="100"/>
+              <w:bottom w:type="dxa" w:w="60"/>
+              <w:right w:type="dxa" w:w="100"/>
+            </w:tcMar>
+          </w:tcPr>
+          <w:p>
+            <w:r>
+              <w:rPr>
+                <w:b w:val="false"/>
+                <w:bCs w:val="false"/>
+                <w:color w:val="000000"/>
+                <w:sz w:val="19"/>
+                <w:szCs w:val="19"/>
+              </w:rPr>
+              <w:t xml:space="preserve">Prove it before you promise it</w:t>
+            </w:r>
+          </w:p>
+        </w:tc>
+        <w:tc>
+          <w:tcPr>
+            <w:tcW w:type="dxa" w:w="6060"/>
+            <w:tcMar>
+              <w:top w:type="dxa" w:w="60"/>
+              <w:left w:type="dxa" w:w="100"/>
+              <w:bottom w:type="dxa" w:w="60"/>
+              <w:right w:type="dxa" w:w="100"/>
+            </w:tcMar>
+          </w:tcPr>
+          <w:p>
+            <w:r>
+              <w:rPr>
+                <w:b w:val="false"/>
+                <w:bCs w:val="false"/>
+                <w:color w:val="000000"/>
+                <w:sz w:val="19"/>
+                <w:szCs w:val="19"/>
+              </w:rPr>
+              <w:t xml:space="preserve">Every connection claim is tested, not assumed — at request time, not at delivery time.</w:t>
+            </w:r>
+          </w:p>
+        </w:tc>
+      </w:tr>
+      <w:tr>
+        <w:tc>
+          <w:tcPr>
+            <w:tcW w:type="dxa" w:w="500"/>
+            <w:tcMar>
+              <w:top w:type="dxa" w:w="60"/>
+              <w:left w:type="dxa" w:w="100"/>
+              <w:bottom w:type="dxa" w:w="60"/>
+              <w:right w:type="dxa" w:w="100"/>
+            </w:tcMar>
+          </w:tcPr>
+          <w:p>
+            <w:r>
+              <w:rPr>
+                <w:b w:val="false"/>
+                <w:bCs w:val="false"/>
+                <w:color w:val="000000"/>
+                <w:sz w:val="19"/>
+                <w:szCs w:val="19"/>
+              </w:rPr>
+              <w:t xml:space="preserve">3</w:t>
+            </w:r>
+          </w:p>
+        </w:tc>
+        <w:tc>
+          <w:tcPr>
+            <w:tcW w:type="dxa" w:w="2800"/>
+            <w:tcMar>
+              <w:top w:type="dxa" w:w="60"/>
+              <w:left w:type="dxa" w:w="100"/>
+              <w:bottom w:type="dxa" w:w="60"/>
+              <w:right w:type="dxa" w:w="100"/>
+            </w:tcMar>
+          </w:tcPr>
+          <w:p>
+            <w:r>
+              <w:rPr>
+                <w:b w:val="false"/>
+                <w:bCs w:val="false"/>
+                <w:color w:val="000000"/>
+                <w:sz w:val="19"/>
+                <w:szCs w:val="19"/>
+              </w:rPr>
+              <w:t xml:space="preserve">Governance without a bottleneck</w:t>
+            </w:r>
+          </w:p>
+        </w:tc>
+        <w:tc>
+          <w:tcPr>
+            <w:tcW w:type="dxa" w:w="6060"/>
+            <w:tcMar>
+              <w:top w:type="dxa" w:w="60"/>
+              <w:left w:type="dxa" w:w="100"/>
+              <w:bottom w:type="dxa" w:w="60"/>
+              <w:right w:type="dxa" w:w="100"/>
+            </w:tcMar>
+          </w:tcPr>
+          <w:p>
+            <w:r>
+              <w:rPr>
+                <w:b w:val="false"/>
+                <w:bCs w:val="false"/>
+                <w:color w:val="000000"/>
+                <w:sz w:val="19"/>
+                <w:szCs w:val="19"/>
+              </w:rPr>
+              <w:t xml:space="preserve">Four-eyes approval stays human, but everything an approver needs to decide is already on the screen.</w:t>
+            </w:r>
+          </w:p>
+        </w:tc>
+      </w:tr>
+      <w:tr>
+        <w:tc>
+          <w:tcPr>
+            <w:tcW w:type="dxa" w:w="500"/>
+            <w:tcMar>
+              <w:top w:type="dxa" w:w="60"/>
+              <w:left w:type="dxa" w:w="100"/>
+              <w:bottom w:type="dxa" w:w="60"/>
+              <w:right w:type="dxa" w:w="100"/>
+            </w:tcMar>
+          </w:tcPr>
+          <w:p>
+            <w:r>
+              <w:rPr>
+                <w:b w:val="false"/>
+                <w:bCs w:val="false"/>
+                <w:color w:val="000000"/>
+                <w:sz w:val="19"/>
+                <w:szCs w:val="19"/>
+              </w:rPr>
+              <w:t xml:space="preserve">4</w:t>
+            </w:r>
+          </w:p>
+        </w:tc>
+        <w:tc>
+          <w:tcPr>
+            <w:tcW w:type="dxa" w:w="2800"/>
+            <w:tcMar>
+              <w:top w:type="dxa" w:w="60"/>
+              <w:left w:type="dxa" w:w="100"/>
+              <w:bottom w:type="dxa" w:w="60"/>
+              <w:right w:type="dxa" w:w="100"/>
+            </w:tcMar>
+          </w:tcPr>
+          <w:p>
+            <w:r>
+              <w:rPr>
+                <w:b w:val="false"/>
+                <w:bCs w:val="false"/>
+                <w:color w:val="000000"/>
+                <w:sz w:val="19"/>
+                <w:szCs w:val="19"/>
+              </w:rPr>
+              <w:t xml:space="preserve">Visibility is a feature, not an afterthought</w:t>
+            </w:r>
+          </w:p>
+        </w:tc>
+        <w:tc>
+          <w:tcPr>
+            <w:tcW w:type="dxa" w:w="6060"/>
+            <w:tcMar>
+              <w:top w:type="dxa" w:w="60"/>
+              <w:left w:type="dxa" w:w="100"/>
+              <w:bottom w:type="dxa" w:w="60"/>
+              <w:right w:type="dxa" w:w="100"/>
+            </w:tcMar>
+          </w:tcPr>
+          <w:p>
+            <w:r>
+              <w:rPr>
+                <w:b w:val="false"/>
+                <w:bCs w:val="false"/>
+                <w:color w:val="000000"/>
+                <w:sz w:val="19"/>
+                <w:szCs w:val="19"/>
+              </w:rPr>
+              <w:t xml:space="preserve">Status, run history, and audit are first-class screens, not database queries someone runs on request.</w:t>
+            </w:r>
+          </w:p>
+        </w:tc>
+      </w:tr>
+    </w:tbl>
+    <w:p>
+      <w:pPr>
+        <w:pStyle w:val="Heading2"/>
+        <w:spacing w:after="100" w:before="220"/>
+      </w:pPr>
+      <w:r>
+        <w:rPr>
+          <w:color w:val="0F6674"/>
+        </w:rPr>
+        <w:t xml:space="preserve">How you'd know it's working</w:t>
+      </w:r>
+    </w:p>
+    <w:tbl>
+      <w:tblPr>
+        <w:tblW w:type="dxa" w:w="9360"/>
+        <w:tblBorders>
+          <w:top w:val="single" w:color="auto" w:sz="4"/>
+          <w:left w:val="single" w:color="auto" w:sz="4"/>
+          <w:bottom w:val="single" w:color="auto" w:sz="4"/>
+          <w:right w:val="single" w:color="auto" w:sz="4"/>
+          <w:insideH w:val="single" w:color="auto" w:sz="4"/>
+          <w:insideV w:val="single" w:color="auto" w:sz="4"/>
+        </w:tblBorders>
+      </w:tblPr>
+      <w:tblGrid>
+        <w:gridCol w:w="5200"/>
+        <w:gridCol w:w="4160"/>
+      </w:tblGrid>
+      <w:tr>
+        <w:trPr>
+          <w:tblHeader/>
+        </w:trPr>
+        <w:tc>
+          <w:tcPr>
+            <w:tcW w:type="dxa" w:w="5200"/>
+            <w:shd w:fill="DCE6F1" w:val="clear"/>
+            <w:tcMar>
+              <w:top w:type="dxa" w:w="60"/>
+              <w:left w:type="dxa" w:w="100"/>
+              <w:bottom w:type="dxa" w:w="60"/>
+              <w:right w:type="dxa" w:w="100"/>
+            </w:tcMar>
+          </w:tcPr>
+          <w:p>
+            <w:r>
+              <w:rPr>
+                <w:b/>
+                <w:bCs/>
+                <w:color w:val="1F4E79"/>
+                <w:sz w:val="19"/>
+                <w:szCs w:val="19"/>
+              </w:rPr>
+              <w:t xml:space="preserve">Signal</w:t>
+            </w:r>
+          </w:p>
+        </w:tc>
+        <w:tc>
+          <w:tcPr>
+            <w:tcW w:type="dxa" w:w="4160"/>
+            <w:shd w:fill="DCE6F1" w:val="clear"/>
+            <w:tcMar>
+              <w:top w:type="dxa" w:w="60"/>
+              <w:left w:type="dxa" w:w="100"/>
+              <w:bottom w:type="dxa" w:w="60"/>
+              <w:right w:type="dxa" w:w="100"/>
+            </w:tcMar>
+          </w:tcPr>
+          <w:p>
+            <w:r>
+              <w:rPr>
+                <w:b/>
+                <w:bCs/>
+                <w:color w:val="1F4E79"/>
+                <w:sz w:val="19"/>
+                <w:szCs w:val="19"/>
+              </w:rPr>
+              <w:t xml:space="preserve">Target direction</w:t>
+            </w:r>
+          </w:p>
+        </w:tc>
+      </w:tr>
+      <w:tr>
+        <w:tc>
+          <w:tcPr>
+            <w:tcW w:type="dxa" w:w="5200"/>
+            <w:tcMar>
+              <w:top w:type="dxa" w:w="60"/>
+              <w:left w:type="dxa" w:w="100"/>
+              <w:bottom w:type="dxa" w:w="60"/>
+              <w:right w:type="dxa" w:w="100"/>
+            </w:tcMar>
+          </w:tcPr>
+          <w:p>
+            <w:r>
+              <w:rPr>
+                <w:b w:val="false"/>
+                <w:bCs w:val="false"/>
+                <w:color w:val="000000"/>
+                <w:sz w:val="19"/>
+                <w:szCs w:val="19"/>
+              </w:rPr>
+              <w:t xml:space="preserve">Time from approved request to live interface on Dev</w:t>
+            </w:r>
+          </w:p>
+        </w:tc>
+        <w:tc>
+          <w:tcPr>
+            <w:tcW w:type="dxa" w:w="4160"/>
+            <w:tcMar>
+              <w:top w:type="dxa" w:w="60"/>
+              <w:left w:type="dxa" w:w="100"/>
+              <w:bottom w:type="dxa" w:w="60"/>
+              <w:right w:type="dxa" w:w="100"/>
+            </w:tcMar>
+          </w:tcPr>
+          <w:p>
+            <w:r>
+              <w:rPr>
+                <w:b w:val="false"/>
+                <w:bCs w:val="false"/>
+                <w:color w:val="000000"/>
+                <w:sz w:val="19"/>
+                <w:szCs w:val="19"/>
+              </w:rPr>
+              <w:t xml:space="preserve">Minutes, not weeks</w:t>
+            </w:r>
+          </w:p>
+        </w:tc>
+      </w:tr>
+      <w:tr>
+        <w:tc>
+          <w:tcPr>
+            <w:tcW w:type="dxa" w:w="5200"/>
+            <w:tcMar>
+              <w:top w:type="dxa" w:w="60"/>
+              <w:left w:type="dxa" w:w="100"/>
+              <w:bottom w:type="dxa" w:w="60"/>
+              <w:right w:type="dxa" w:w="100"/>
+            </w:tcMar>
+          </w:tcPr>
+          <w:p>
+            <w:r>
+              <w:rPr>
+                <w:b w:val="false"/>
+                <w:bCs w:val="false"/>
+                <w:color w:val="000000"/>
+                <w:sz w:val="19"/>
+                <w:szCs w:val="19"/>
+              </w:rPr>
+              <w:t xml:space="preserve">Share of new interfaces built with zero manual Boomi development</w:t>
+            </w:r>
+          </w:p>
+        </w:tc>
+        <w:tc>
+          <w:tcPr>
+            <w:tcW w:type="dxa" w:w="4160"/>
+            <w:tcMar>
+              <w:top w:type="dxa" w:w="60"/>
+              <w:left w:type="dxa" w:w="100"/>
+              <w:bottom w:type="dxa" w:w="60"/>
+              <w:right w:type="dxa" w:w="100"/>
+            </w:tcMar>
+          </w:tcPr>
+          <w:p>
+            <w:r>
+              <w:rPr>
+                <w:b w:val="false"/>
+                <w:bCs w:val="false"/>
+                <w:color w:val="000000"/>
+                <w:sz w:val="19"/>
+                <w:szCs w:val="19"/>
+              </w:rPr>
+              <w:t xml:space="preserve">Approaching 100%</w:t>
+            </w:r>
+          </w:p>
+        </w:tc>
+      </w:tr>
+      <w:tr>
+        <w:tc>
+          <w:tcPr>
+            <w:tcW w:type="dxa" w:w="5200"/>
+            <w:tcMar>
+              <w:top w:type="dxa" w:w="60"/>
+              <w:left w:type="dxa" w:w="100"/>
+              <w:bottom w:type="dxa" w:w="60"/>
+              <w:right w:type="dxa" w:w="100"/>
+            </w:tcMar>
+          </w:tcPr>
+          <w:p>
+            <w:r>
+              <w:rPr>
+                <w:b w:val="false"/>
+                <w:bCs w:val="false"/>
+                <w:color w:val="000000"/>
+                <w:sz w:val="19"/>
+                <w:szCs w:val="19"/>
+              </w:rPr>
+              <w:t xml:space="preserve">Duplicate/near-duplicate interfaces</w:t>
+            </w:r>
+          </w:p>
+        </w:tc>
+        <w:tc>
+          <w:tcPr>
+            <w:tcW w:type="dxa" w:w="4160"/>
+            <w:tcMar>
+              <w:top w:type="dxa" w:w="60"/>
+              <w:left w:type="dxa" w:w="100"/>
+              <w:bottom w:type="dxa" w:w="60"/>
+              <w:right w:type="dxa" w:w="100"/>
+            </w:tcMar>
+          </w:tcPr>
+          <w:p>
+            <w:r>
+              <w:rPr>
+                <w:b w:val="false"/>
+                <w:bCs w:val="false"/>
+                <w:color w:val="000000"/>
+                <w:sz w:val="19"/>
+                <w:szCs w:val="19"/>
+              </w:rPr>
+              <w:t xml:space="preserve">Caught before build, not discovered in production</w:t>
+            </w:r>
+          </w:p>
+        </w:tc>
+      </w:tr>
+      <w:tr>
+        <w:tc>
+          <w:tcPr>
+            <w:tcW w:type="dxa" w:w="5200"/>
+            <w:tcMar>
+              <w:top w:type="dxa" w:w="60"/>
+              <w:left w:type="dxa" w:w="100"/>
+              <w:bottom w:type="dxa" w:w="60"/>
+              <w:right w:type="dxa" w:w="100"/>
+            </w:tcMar>
+          </w:tcPr>
+          <w:p>
+            <w:r>
+              <w:rPr>
+                <w:b w:val="false"/>
+                <w:bCs w:val="false"/>
+                <w:color w:val="000000"/>
+                <w:sz w:val="19"/>
+                <w:szCs w:val="19"/>
+              </w:rPr>
+              <w:t xml:space="preserve">Requesters emailing someone to ask “what's the status?”</w:t>
+            </w:r>
+          </w:p>
+        </w:tc>
+        <w:tc>
+          <w:tcPr>
+            <w:tcW w:type="dxa" w:w="4160"/>
+            <w:tcMar>
+              <w:top w:type="dxa" w:w="60"/>
+              <w:left w:type="dxa" w:w="100"/>
+              <w:bottom w:type="dxa" w:w="60"/>
+              <w:right w:type="dxa" w:w="100"/>
+            </w:tcMar>
+          </w:tcPr>
+          <w:p>
+            <w:r>
+              <w:rPr>
+                <w:b w:val="false"/>
+                <w:bCs w:val="false"/>
+                <w:color w:val="000000"/>
+                <w:sz w:val="19"/>
+                <w:szCs w:val="19"/>
+              </w:rPr>
+              <w:t xml:space="preserve">Trending to zero — they check the tracker instead (Section 6, US-601)</w:t>
+            </w:r>
+          </w:p>
+        </w:tc>
+      </w:tr>
+    </w:tbl>
+    <w:p>
+      <w:pPr>
+        <w:pStyle w:val="Heading2"/>
+        <w:spacing w:after="100" w:before="220"/>
+      </w:pPr>
+      <w:r>
+        <w:rPr>
+          <w:color w:val="0F6674"/>
+        </w:rPr>
+        <w:t xml:space="preserve">What it deliberately isn't, yet</w:t>
+      </w:r>
+    </w:p>
+    <w:p>
+      <w:pPr>
+        <w:spacing w:after="100"/>
+      </w:pPr>
+      <w:r>
+        <w:t xml:space="preserve">Not an event-triggered/file-arrival platform, not a transformation/mapping tool, not an auto-promoter to Test/Prod — and not a replacement for platform engineering judgement. It removes the manual work, not the oversight.</w:t>
+      </w:r>
+    </w:p>
+    <w:p>
+      <w:pPr>
+        <w:spacing w:after="100"/>
+      </w:pPr>
+      <w:r>
+        <w:rPr>
+          <w:i/>
+          <w:iCs/>
+        </w:rPr>
+        <w:t xml:space="preserve">The horizon: MVP proves the config-driven engine and the core request-approve-deploy loop. From there, the same self-service instinct extends outward: partners onboarding themselves for event-triggered transfers, promotion pipelines that carry the same evidence-based trust into Test and Prod, and eventually a genuine choice at request time between the hand-built engine (Section 1b) and Boomi's native MFT (Section 1c) — governed the same way, from the same portal. See Section 12 for the phased roadmap this vision points toward.</w:t>
       </w:r>
     </w:p>
     <w:p>

</xml_diff>